<commit_message>
Add cps-passwd to set the dashboard, editor and API login
Setting the password with sed broke on characters such as & / | in the
password, and the bcrypt hash did not survive cps-run sourcing the
settings with the shell. cps-passwd asks for the password, writes it and
its bcrypt hash literally into /etc/cps/cps.env and restarts the
services; cps-run no longer reads the login lines. Docs updated.
</commit_message>
<xml_diff>
--- a/documentation/CPS_Testbed_Cluster_Guide.docx
+++ b/documentation/CPS_Testbed_Cluster_Guide.docx
@@ -102,7 +102,7 @@
       <w:pPr>
         <w:jc w:val="center"/>
       </w:pPr>
-      <w:hyperlink w:history="1" r:id="rIdyxcl_tod9uybovxht-uus">
+      <w:hyperlink w:history="1" r:id="rIdtfj1tx7-foz_r-ugqaeff">
         <w:r>
           <w:rPr>
             <w:rStyle w:val="Hyperlink"/>
@@ -11463,13 +11463,13 @@
         <w:spacing w:after="120" w:line="288"/>
       </w:pPr>
       <w:r>
-        <w:t xml:space="preserve">Without passwords anyone who can reach ports 1880 and 8080 can run experiments. Set both before giving others access:</w:t>
+        <w:t xml:space="preserve">Without a password anyone who can reach ports 1880 and 8080 can run experiments. Set one before giving others access:</w:t>
       </w:r>
     </w:p>
     <w:p>
       <w:pPr>
         <w:shd w:fill="F1F4F6" w:color="auto" w:val="clear"/>
-        <w:spacing w:after="0" w:before="60" w:line="252"/>
+        <w:spacing w:after="160" w:before="60" w:line="252"/>
         <w:ind w:left="120" w:right="120"/>
       </w:pPr>
       <w:r>
@@ -11479,55 +11479,51 @@
           <w:sz w:val="18"/>
           <w:szCs w:val="18"/>
         </w:rPr>
-        <w:t xml:space="preserve">sudo sed -i 's/^CPS_WEB_PASSWORD=.*/CPS_WEB_PASSWORD=choose-a-password/' /etc/cps/cps.env</w:t>
+        <w:t xml:space="preserve">sudo cps-passwd          # asks for the password twice; --off removes it</w:t>
       </w:r>
     </w:p>
     <w:p>
       <w:pPr>
-        <w:shd w:fill="F1F4F6" w:color="auto" w:val="clear"/>
-        <w:spacing w:after="0" w:before="0" w:line="252"/>
-        <w:ind w:left="120" w:right="120"/>
+        <w:spacing w:after="120" w:line="288"/>
       </w:pPr>
+      <w:r>
+        <w:t xml:space="preserve">The same password then protects the dashboard, the Node-RED editor and the experiment API (user </w:t>
+      </w:r>
       <w:r>
         <w:rPr>
           <w:rFonts w:ascii="Consolas" w:cs="Consolas" w:eastAsia="Consolas" w:hAnsi="Consolas"/>
-          <w:color w:val="263238"/>
-          <w:sz w:val="18"/>
-          <w:szCs w:val="18"/>
+          <w:color w:val="37474F"/>
+          <w:sz w:val="19"/>
+          <w:szCs w:val="19"/>
         </w:rPr>
-        <w:t xml:space="preserve">HASH=$(node -e 'console.log(require("/usr/local/lib/node_modules/node-red/node_modules/bcryptjs").hashSync(process.argv[1], 8))' 'choose-a-password')</w:t>
-      </w:r>
-    </w:p>
-    <w:p>
-      <w:pPr>
-        <w:shd w:fill="F1F4F6" w:color="auto" w:val="clear"/>
-        <w:spacing w:after="0" w:before="0" w:line="252"/>
-        <w:ind w:left="120" w:right="120"/>
-      </w:pPr>
+        <w:t xml:space="preserve">admin</w:t>
+      </w:r>
+      <w:r>
+        <w:t xml:space="preserve">). </w:t>
+      </w:r>
       <w:r>
         <w:rPr>
           <w:rFonts w:ascii="Consolas" w:cs="Consolas" w:eastAsia="Consolas" w:hAnsi="Consolas"/>
-          <w:color w:val="263238"/>
-          <w:sz w:val="18"/>
-          <w:szCs w:val="18"/>
+          <w:color w:val="37474F"/>
+          <w:sz w:val="19"/>
+          <w:szCs w:val="19"/>
         </w:rPr>
-        <w:t xml:space="preserve">sudo sed -i "s|^NODERED_ADMIN_HASH=.*|NODERED_ADMIN_HASH=$HASH|" /etc/cps/cps.env</w:t>
-      </w:r>
-    </w:p>
-    <w:p>
-      <w:pPr>
-        <w:shd w:fill="F1F4F6" w:color="auto" w:val="clear"/>
-        <w:spacing w:after="160" w:before="0" w:line="252"/>
-        <w:ind w:left="120" w:right="120"/>
-      </w:pPr>
+        <w:t xml:space="preserve">cps-passwd</w:t>
+      </w:r>
+      <w:r>
+        <w:t xml:space="preserve"> stores it in </w:t>
+      </w:r>
       <w:r>
         <w:rPr>
           <w:rFonts w:ascii="Consolas" w:cs="Consolas" w:eastAsia="Consolas" w:hAnsi="Consolas"/>
-          <w:color w:val="263238"/>
-          <w:sz w:val="18"/>
-          <w:szCs w:val="18"/>
+          <w:color w:val="37474F"/>
+          <w:sz w:val="19"/>
+          <w:szCs w:val="19"/>
         </w:rPr>
-        <w:t xml:space="preserve">sudo systemctl restart cps-api cps-nodered</w:t>
+        <w:t xml:space="preserve">/etc/cps/cps.env</w:t>
+      </w:r>
+      <w:r>
+        <w:t xml:space="preserve"> (for Node-RED as a bcrypt hash) and restarts both services. Use at least 8 characters and no quotes, backslashes or spaces.</w:t>
       </w:r>
     </w:p>
     <w:p>
@@ -23656,6 +23652,94 @@
                 <w:szCs w:val="19"/>
               </w:rPr>
               <w:t xml:space="preserve">What to do</w:t>
+            </w:r>
+          </w:p>
+        </w:tc>
+      </w:tr>
+      <w:tr>
+        <w:trPr>
+          <w:cantSplit/>
+        </w:trPr>
+        <w:tc>
+          <w:tcPr>
+            <w:tcW w:type="dxa" w:w="3429"/>
+            <w:tcBorders>
+              <w:top w:val="single" w:color="B0BEC5" w:sz="4"/>
+              <w:left w:val="single" w:color="B0BEC5" w:sz="4"/>
+              <w:bottom w:val="single" w:color="B0BEC5" w:sz="4"/>
+              <w:right w:val="single" w:color="B0BEC5" w:sz="4"/>
+            </w:tcBorders>
+            <w:tcMar>
+              <w:top w:type="dxa" w:w="60"/>
+              <w:left w:type="dxa" w:w="100"/>
+              <w:bottom w:type="dxa" w:w="60"/>
+              <w:right w:type="dxa" w:w="100"/>
+            </w:tcMar>
+          </w:tcPr>
+          <w:p>
+            <w:pPr>
+              <w:spacing w:after="0" w:line="252"/>
+            </w:pPr>
+            <w:r>
+              <w:rPr>
+                <w:sz w:val="19"/>
+                <w:szCs w:val="19"/>
+              </w:rPr>
+              <w:t xml:space="preserve">Login fails on the dashboard or editor</w:t>
+            </w:r>
+          </w:p>
+        </w:tc>
+        <w:tc>
+          <w:tcPr>
+            <w:tcW w:type="dxa" w:w="5597"/>
+            <w:tcBorders>
+              <w:top w:val="single" w:color="B0BEC5" w:sz="4"/>
+              <w:left w:val="single" w:color="B0BEC5" w:sz="4"/>
+              <w:bottom w:val="single" w:color="B0BEC5" w:sz="4"/>
+              <w:right w:val="single" w:color="B0BEC5" w:sz="4"/>
+            </w:tcBorders>
+            <w:tcMar>
+              <w:top w:type="dxa" w:w="60"/>
+              <w:left w:type="dxa" w:w="100"/>
+              <w:bottom w:type="dxa" w:w="60"/>
+              <w:right w:type="dxa" w:w="100"/>
+            </w:tcMar>
+          </w:tcPr>
+          <w:p>
+            <w:pPr>
+              <w:spacing w:after="0" w:line="252"/>
+            </w:pPr>
+            <w:r>
+              <w:rPr>
+                <w:sz w:val="19"/>
+                <w:szCs w:val="19"/>
+              </w:rPr>
+              <w:t xml:space="preserve">The user is </w:t>
+            </w:r>
+            <w:r>
+              <w:rPr>
+                <w:rFonts w:ascii="Consolas" w:cs="Consolas" w:eastAsia="Consolas" w:hAnsi="Consolas"/>
+                <w:color w:val="37474F"/>
+                <w:sz w:val="19"/>
+                <w:szCs w:val="19"/>
+              </w:rPr>
+              <w:t xml:space="preserve">admin</w:t>
+            </w:r>
+            <w:r>
+              <w:rPr>
+                <w:sz w:val="19"/>
+                <w:szCs w:val="19"/>
+              </w:rPr>
+              <w:t xml:space="preserve">; set the password again with </w:t>
+            </w:r>
+            <w:r>
+              <w:rPr>
+                <w:rFonts w:ascii="Consolas" w:cs="Consolas" w:eastAsia="Consolas" w:hAnsi="Consolas"/>
+                <w:color w:val="37474F"/>
+                <w:sz w:val="19"/>
+                <w:szCs w:val="19"/>
+              </w:rPr>
+              <w:t xml:space="preserve">sudo cps-passwd</w:t>
             </w:r>
           </w:p>
         </w:tc>

</xml_diff>

<commit_message>
Dashboard: experiment form and cluster settings
- Experiments page: "New experiment" form with seven ready-made
  scenarios; grid, simulation mode, event, attack, network, control,
  duration and MPI ranks; only the buses, generators and lines of the
  chosen grid are offered; download the form as a scenario file
- Cluster page: node status and settings (default MPI ranks, experiments
  at the same time, compute nodes and MPI slots, placement of the
  federates), saved in /srv/cps/cluster_settings.json and applied
  without a restart (GET/PUT/DELETE /api/cluster/settings)
- each experiment writes its own MPI hostfile with the nodes that answer
  and stops with a clear message when a federate's node is down or the
  slots are too few; failed checks leave no run directory
- scenario mpi_np defaults to the cluster setting; line trips, faults
  and generator trips are checked against the grid
- empty default dashboard page removed; docs and guide updated
</commit_message>
<xml_diff>
--- a/documentation/CPS_Testbed_Cluster_Guide.docx
+++ b/documentation/CPS_Testbed_Cluster_Guide.docx
@@ -102,7 +102,7 @@
       <w:pPr>
         <w:jc w:val="center"/>
       </w:pPr>
-      <w:hyperlink w:history="1" r:id="rIdtfj1tx7-foz_r-ugqaeff">
+      <w:hyperlink w:history="1" r:id="rId5zvzkc_3s4kjeem0uoorm">
         <w:r>
           <w:rPr>
             <w:rStyle w:val="Hyperlink"/>
@@ -2407,7 +2407,7 @@
                 <w:sz w:val="19"/>
                 <w:szCs w:val="19"/>
               </w:rPr>
-              <w:t xml:space="preserve">The user interface: Experiments, Live, Results and the IEEE 14 console.</w:t>
+              <w:t xml:space="preserve">The user interface: Experiments, Live, Results, Cluster and the IEEE 14 console.</w:t>
             </w:r>
           </w:p>
         </w:tc>
@@ -13157,7 +13157,29 @@
         <w:t xml:space="preserve">Cluster</w:t>
       </w:r>
       <w:r>
-        <w:t xml:space="preserve"> panel on the Experiments page (Figure below).</w:t>
+        <w:t xml:space="preserve"> panel on the Experiments page (Figure below). The </w:t>
+      </w:r>
+      <w:r>
+        <w:rPr>
+          <w:i/>
+          <w:iCs/>
+        </w:rPr>
+        <w:t xml:space="preserve">Cluster</w:t>
+      </w:r>
+      <w:r>
+        <w:t xml:space="preserve"> page (Section 6.4) changes the nodes, their MPI slots and the placement from the dashboard instead of </w:t>
+      </w:r>
+      <w:r>
+        <w:rPr>
+          <w:rFonts w:ascii="Consolas" w:cs="Consolas" w:eastAsia="Consolas" w:hAnsi="Consolas"/>
+          <w:color w:val="37474F"/>
+          <w:sz w:val="19"/>
+          <w:szCs w:val="19"/>
+        </w:rPr>
+        <w:t xml:space="preserve">cps.env</w:t>
+      </w:r>
+      <w:r>
+        <w:t xml:space="preserve">.</w:t>
       </w:r>
     </w:p>
     <w:p>
@@ -13427,7 +13449,7 @@
                 <w:sz w:val="19"/>
                 <w:szCs w:val="19"/>
               </w:rPr>
-              <w:t xml:space="preserve">Dashboard (Experiments, Live, Results, IEEE 14 console)</w:t>
+              <w:t xml:space="preserve">Dashboard (Experiments, Live, Results, Cluster, IEEE 14 console)</w:t>
             </w:r>
           </w:p>
         </w:tc>
@@ -13608,7 +13630,7 @@
         <w:spacing w:after="120" w:line="288"/>
       </w:pPr>
       <w:r>
-        <w:t xml:space="preserve">The page has four panels: </w:t>
+        <w:t xml:space="preserve">The page has five panels: </w:t>
       </w:r>
       <w:r>
         <w:rPr>
@@ -13625,7 +13647,17 @@
           <w:i/>
           <w:iCs/>
         </w:rPr>
-        <w:t xml:space="preserve">Upload</w:t>
+        <w:t xml:space="preserve">New experiment</w:t>
+      </w:r>
+      <w:r>
+        <w:t xml:space="preserve"> (Section 6.3), </w:t>
+      </w:r>
+      <w:r>
+        <w:rPr>
+          <w:i/>
+          <w:iCs/>
+        </w:rPr>
+        <w:t xml:space="preserve">Upload files</w:t>
       </w:r>
       <w:r>
         <w:t xml:space="preserve">, </w:t>
@@ -13875,7 +13907,839 @@
         <w:pStyle w:val="Heading2"/>
       </w:pPr>
       <w:r>
-        <w:t xml:space="preserve">6.3 Scenario files</w:t>
+        <w:t xml:space="preserve">6.3 Running an experiment from the form</w:t>
+      </w:r>
+    </w:p>
+    <w:p>
+      <w:pPr>
+        <w:spacing w:after="120" w:line="288"/>
+      </w:pPr>
+      <w:r>
+        <w:rPr>
+          <w:i/>
+          <w:iCs/>
+        </w:rPr>
+        <w:t xml:space="preserve">New experiment</w:t>
+      </w:r>
+      <w:r>
+        <w:t xml:space="preserve"> runs one experiment without writing a file. The buttons at the top fill the form with a ready-made scenario; every field can then be changed before pressing </w:t>
+      </w:r>
+      <w:r>
+        <w:rPr>
+          <w:i/>
+          <w:iCs/>
+        </w:rPr>
+        <w:t xml:space="preserve">Run experiment</w:t>
+      </w:r>
+      <w:r>
+        <w:t xml:space="preserve">. The form offers only what the chosen grid has: its generator buses for an AVR fault or a generator trip, its buses for a fault or a load step, its lines for a line trip.</w:t>
+      </w:r>
+    </w:p>
+    <w:p>
+      <w:pPr>
+        <w:keepNext/>
+        <w:spacing w:after="60" w:before="120"/>
+        <w:jc w:val="center"/>
+      </w:pPr>
+      <w:r>
+        <w:drawing>
+          <wp:inline distT="0" distB="0" distL="0" distR="0">
+            <wp:extent cx="5715000" cy="2495550"/>
+            <wp:effectExtent t="0" r="0" b="0" l="0"/>
+            <wp:docPr id="1" name="form.png" descr="The New experiment panel after choosing the ready-made &quot;Fault (dynamic, IEEE 39)&quot;." title="The New experiment panel after choosing the ready-made &quot;Fault (dynamic, IEEE 39)&quot;."/>
+            <wp:cNvGraphicFramePr>
+              <a:graphicFrameLocks xmlns:a="http://schemas.openxmlformats.org/drawingml/2006/main" noChangeAspect="1"/>
+            </wp:cNvGraphicFramePr>
+            <a:graphic xmlns:a="http://schemas.openxmlformats.org/drawingml/2006/main">
+              <a:graphicData uri="http://schemas.openxmlformats.org/drawingml/2006/picture">
+                <pic:pic xmlns:pic="http://schemas.openxmlformats.org/drawingml/2006/picture">
+                  <pic:nvPicPr>
+                    <pic:cNvPr id="0" name="" descr=""/>
+                    <pic:cNvPicPr>
+                      <a:picLocks noChangeAspect="1" noChangeArrowheads="1"/>
+                    </pic:cNvPicPr>
+                  </pic:nvPicPr>
+                  <pic:blipFill>
+                    <a:blip r:embed="rId15" cstate="none"/>
+                    <a:srcRect/>
+                    <a:stretch>
+                      <a:fillRect/>
+                    </a:stretch>
+                  </pic:blipFill>
+                  <pic:spPr bwMode="auto">
+                    <a:xfrm>
+                      <a:off x="0" y="0"/>
+                      <a:ext cx="5715000" cy="2495550"/>
+                    </a:xfrm>
+                    <a:prstGeom prst="rect">
+                      <a:avLst/>
+                    </a:prstGeom>
+                  </pic:spPr>
+                </pic:pic>
+              </a:graphicData>
+            </a:graphic>
+          </wp:inline>
+        </w:drawing>
+      </w:r>
+    </w:p>
+    <w:p>
+      <w:pPr>
+        <w:spacing w:after="200"/>
+        <w:jc w:val="center"/>
+      </w:pPr>
+      <w:r>
+        <w:rPr>
+          <w:b/>
+          <w:bCs/>
+          <w:color w:val="455A64"/>
+          <w:sz w:val="18"/>
+          <w:szCs w:val="18"/>
+        </w:rPr>
+        <w:t xml:space="preserve">Figure 7. </w:t>
+      </w:r>
+      <w:r>
+        <w:rPr>
+          <w:i/>
+          <w:iCs/>
+          <w:color w:val="455A64"/>
+          <w:sz w:val="18"/>
+          <w:szCs w:val="18"/>
+        </w:rPr>
+        <w:t xml:space="preserve">The New experiment panel after choosing the ready-made "Fault (dynamic, IEEE 39)".</w:t>
+      </w:r>
+    </w:p>
+    <w:tbl>
+      <w:tblPr>
+        <w:tblW w:type="dxa" w:w="9026"/>
+        <w:tblBorders>
+          <w:top w:val="single" w:color="auto" w:sz="4"/>
+          <w:left w:val="single" w:color="auto" w:sz="4"/>
+          <w:bottom w:val="single" w:color="auto" w:sz="4"/>
+          <w:right w:val="single" w:color="auto" w:sz="4"/>
+          <w:insideH w:val="single" w:color="auto" w:sz="4"/>
+          <w:insideV w:val="single" w:color="auto" w:sz="4"/>
+        </w:tblBorders>
+      </w:tblPr>
+      <w:tblGrid>
+        <w:gridCol w:w="3249"/>
+        <w:gridCol w:w="5777"/>
+      </w:tblGrid>
+      <w:tr>
+        <w:trPr>
+          <w:cantSplit/>
+          <w:tblHeader/>
+        </w:trPr>
+        <w:tc>
+          <w:tcPr>
+            <w:tcW w:type="dxa" w:w="3249"/>
+            <w:tcBorders>
+              <w:top w:val="single" w:color="B0BEC5" w:sz="4"/>
+              <w:left w:val="single" w:color="B0BEC5" w:sz="4"/>
+              <w:bottom w:val="single" w:color="B0BEC5" w:sz="4"/>
+              <w:right w:val="single" w:color="B0BEC5" w:sz="4"/>
+            </w:tcBorders>
+            <w:shd w:fill="0D47A1" w:color="auto" w:val="clear"/>
+            <w:tcMar>
+              <w:top w:type="dxa" w:w="60"/>
+              <w:left w:type="dxa" w:w="100"/>
+              <w:bottom w:type="dxa" w:w="60"/>
+              <w:right w:type="dxa" w:w="100"/>
+            </w:tcMar>
+          </w:tcPr>
+          <w:p>
+            <w:pPr>
+              <w:spacing w:after="0" w:line="252"/>
+            </w:pPr>
+            <w:r>
+              <w:rPr>
+                <w:b/>
+                <w:bCs/>
+                <w:color w:val="FFFFFF"/>
+                <w:sz w:val="19"/>
+                <w:szCs w:val="19"/>
+              </w:rPr>
+              <w:t xml:space="preserve">Ready-made scenario</w:t>
+            </w:r>
+          </w:p>
+        </w:tc>
+        <w:tc>
+          <w:tcPr>
+            <w:tcW w:type="dxa" w:w="5777"/>
+            <w:tcBorders>
+              <w:top w:val="single" w:color="B0BEC5" w:sz="4"/>
+              <w:left w:val="single" w:color="B0BEC5" w:sz="4"/>
+              <w:bottom w:val="single" w:color="B0BEC5" w:sz="4"/>
+              <w:right w:val="single" w:color="B0BEC5" w:sz="4"/>
+            </w:tcBorders>
+            <w:shd w:fill="0D47A1" w:color="auto" w:val="clear"/>
+            <w:tcMar>
+              <w:top w:type="dxa" w:w="60"/>
+              <w:left w:type="dxa" w:w="100"/>
+              <w:bottom w:type="dxa" w:w="60"/>
+              <w:right w:type="dxa" w:w="100"/>
+            </w:tcMar>
+          </w:tcPr>
+          <w:p>
+            <w:pPr>
+              <w:spacing w:after="0" w:line="252"/>
+            </w:pPr>
+            <w:r>
+              <w:rPr>
+                <w:b/>
+                <w:bCs/>
+                <w:color w:val="FFFFFF"/>
+                <w:sz w:val="19"/>
+                <w:szCs w:val="19"/>
+              </w:rPr>
+              <w:t xml:space="preserve">What it shows</w:t>
+            </w:r>
+          </w:p>
+        </w:tc>
+      </w:tr>
+      <w:tr>
+        <w:trPr>
+          <w:cantSplit/>
+        </w:trPr>
+        <w:tc>
+          <w:tcPr>
+            <w:tcW w:type="dxa" w:w="3249"/>
+            <w:tcBorders>
+              <w:top w:val="single" w:color="B0BEC5" w:sz="4"/>
+              <w:left w:val="single" w:color="B0BEC5" w:sz="4"/>
+              <w:bottom w:val="single" w:color="B0BEC5" w:sz="4"/>
+              <w:right w:val="single" w:color="B0BEC5" w:sz="4"/>
+            </w:tcBorders>
+            <w:tcMar>
+              <w:top w:type="dxa" w:w="60"/>
+              <w:left w:type="dxa" w:w="100"/>
+              <w:bottom w:type="dxa" w:w="60"/>
+              <w:right w:type="dxa" w:w="100"/>
+            </w:tcMar>
+          </w:tcPr>
+          <w:p>
+            <w:pPr>
+              <w:spacing w:after="0" w:line="252"/>
+            </w:pPr>
+            <w:r>
+              <w:rPr>
+                <w:sz w:val="19"/>
+                <w:szCs w:val="19"/>
+              </w:rPr>
+              <w:t xml:space="preserve">Attack detected (IEEE 118)</w:t>
+            </w:r>
+          </w:p>
+        </w:tc>
+        <w:tc>
+          <w:tcPr>
+            <w:tcW w:type="dxa" w:w="5777"/>
+            <w:tcBorders>
+              <w:top w:val="single" w:color="B0BEC5" w:sz="4"/>
+              <w:left w:val="single" w:color="B0BEC5" w:sz="4"/>
+              <w:bottom w:val="single" w:color="B0BEC5" w:sz="4"/>
+              <w:right w:val="single" w:color="B0BEC5" w:sz="4"/>
+            </w:tcBorders>
+            <w:tcMar>
+              <w:top w:type="dxa" w:w="60"/>
+              <w:left w:type="dxa" w:w="100"/>
+              <w:bottom w:type="dxa" w:w="60"/>
+              <w:right w:type="dxa" w:w="100"/>
+            </w:tcMar>
+          </w:tcPr>
+          <w:p>
+            <w:pPr>
+              <w:spacing w:after="0" w:line="252"/>
+            </w:pPr>
+            <w:r>
+              <w:rPr>
+                <w:sz w:val="19"/>
+                <w:szCs w:val="19"/>
+              </w:rPr>
+              <w:t xml:space="preserve">AVR fault at generator 49 hidden by a simple false data injection; bad data detection finds the PMU and the control acts</w:t>
+            </w:r>
+          </w:p>
+        </w:tc>
+      </w:tr>
+      <w:tr>
+        <w:trPr>
+          <w:cantSplit/>
+        </w:trPr>
+        <w:tc>
+          <w:tcPr>
+            <w:tcW w:type="dxa" w:w="3249"/>
+            <w:tcBorders>
+              <w:top w:val="single" w:color="B0BEC5" w:sz="4"/>
+              <w:left w:val="single" w:color="B0BEC5" w:sz="4"/>
+              <w:bottom w:val="single" w:color="B0BEC5" w:sz="4"/>
+              <w:right w:val="single" w:color="B0BEC5" w:sz="4"/>
+            </w:tcBorders>
+            <w:tcMar>
+              <w:top w:type="dxa" w:w="60"/>
+              <w:left w:type="dxa" w:w="100"/>
+              <w:bottom w:type="dxa" w:w="60"/>
+              <w:right w:type="dxa" w:w="100"/>
+            </w:tcMar>
+          </w:tcPr>
+          <w:p>
+            <w:pPr>
+              <w:spacing w:after="0" w:line="252"/>
+            </w:pPr>
+            <w:r>
+              <w:rPr>
+                <w:sz w:val="19"/>
+                <w:szCs w:val="19"/>
+              </w:rPr>
+              <w:t xml:space="preserve">Stealthy attack (IEEE 118)</w:t>
+            </w:r>
+          </w:p>
+        </w:tc>
+        <w:tc>
+          <w:tcPr>
+            <w:tcW w:type="dxa" w:w="5777"/>
+            <w:tcBorders>
+              <w:top w:val="single" w:color="B0BEC5" w:sz="4"/>
+              <w:left w:val="single" w:color="B0BEC5" w:sz="4"/>
+              <w:bottom w:val="single" w:color="B0BEC5" w:sz="4"/>
+              <w:right w:val="single" w:color="B0BEC5" w:sz="4"/>
+            </w:tcBorders>
+            <w:tcMar>
+              <w:top w:type="dxa" w:w="60"/>
+              <w:left w:type="dxa" w:w="100"/>
+              <w:bottom w:type="dxa" w:w="60"/>
+              <w:right w:type="dxa" w:w="100"/>
+            </w:tcMar>
+          </w:tcPr>
+          <w:p>
+            <w:pPr>
+              <w:spacing w:after="0" w:line="252"/>
+            </w:pPr>
+            <w:r>
+              <w:rPr>
+                <w:sz w:val="19"/>
+                <w:szCs w:val="19"/>
+              </w:rPr>
+              <w:t xml:space="preserve">All channels of the target changed consistently; not detected</w:t>
+            </w:r>
+          </w:p>
+        </w:tc>
+      </w:tr>
+      <w:tr>
+        <w:trPr>
+          <w:cantSplit/>
+        </w:trPr>
+        <w:tc>
+          <w:tcPr>
+            <w:tcW w:type="dxa" w:w="3249"/>
+            <w:tcBorders>
+              <w:top w:val="single" w:color="B0BEC5" w:sz="4"/>
+              <w:left w:val="single" w:color="B0BEC5" w:sz="4"/>
+              <w:bottom w:val="single" w:color="B0BEC5" w:sz="4"/>
+              <w:right w:val="single" w:color="B0BEC5" w:sz="4"/>
+            </w:tcBorders>
+            <w:tcMar>
+              <w:top w:type="dxa" w:w="60"/>
+              <w:left w:type="dxa" w:w="100"/>
+              <w:bottom w:type="dxa" w:w="60"/>
+              <w:right w:type="dxa" w:w="100"/>
+            </w:tcMar>
+          </w:tcPr>
+          <w:p>
+            <w:pPr>
+              <w:spacing w:after="0" w:line="252"/>
+            </w:pPr>
+            <w:r>
+              <w:rPr>
+                <w:sz w:val="19"/>
+                <w:szCs w:val="19"/>
+              </w:rPr>
+              <w:t xml:space="preserve">Delay attack (IEEE 118)</w:t>
+            </w:r>
+          </w:p>
+        </w:tc>
+        <w:tc>
+          <w:tcPr>
+            <w:tcW w:type="dxa" w:w="5777"/>
+            <w:tcBorders>
+              <w:top w:val="single" w:color="B0BEC5" w:sz="4"/>
+              <w:left w:val="single" w:color="B0BEC5" w:sz="4"/>
+              <w:bottom w:val="single" w:color="B0BEC5" w:sz="4"/>
+              <w:right w:val="single" w:color="B0BEC5" w:sz="4"/>
+            </w:tcBorders>
+            <w:tcMar>
+              <w:top w:type="dxa" w:w="60"/>
+              <w:left w:type="dxa" w:w="100"/>
+              <w:bottom w:type="dxa" w:w="60"/>
+              <w:right w:type="dxa" w:w="100"/>
+            </w:tcMar>
+          </w:tcPr>
+          <w:p>
+            <w:pPr>
+              <w:spacing w:after="0" w:line="252"/>
+            </w:pPr>
+            <w:r>
+              <w:rPr>
+                <w:sz w:val="19"/>
+                <w:szCs w:val="19"/>
+              </w:rPr>
+              <w:t xml:space="preserve">PMU frames around bus 49 delayed by 100 ms; they miss the PDC window</w:t>
+            </w:r>
+          </w:p>
+        </w:tc>
+      </w:tr>
+      <w:tr>
+        <w:trPr>
+          <w:cantSplit/>
+        </w:trPr>
+        <w:tc>
+          <w:tcPr>
+            <w:tcW w:type="dxa" w:w="3249"/>
+            <w:tcBorders>
+              <w:top w:val="single" w:color="B0BEC5" w:sz="4"/>
+              <w:left w:val="single" w:color="B0BEC5" w:sz="4"/>
+              <w:bottom w:val="single" w:color="B0BEC5" w:sz="4"/>
+              <w:right w:val="single" w:color="B0BEC5" w:sz="4"/>
+            </w:tcBorders>
+            <w:tcMar>
+              <w:top w:type="dxa" w:w="60"/>
+              <w:left w:type="dxa" w:w="100"/>
+              <w:bottom w:type="dxa" w:w="60"/>
+              <w:right w:type="dxa" w:w="100"/>
+            </w:tcMar>
+          </w:tcPr>
+          <w:p>
+            <w:pPr>
+              <w:spacing w:after="0" w:line="252"/>
+            </w:pPr>
+            <w:r>
+              <w:rPr>
+                <w:sz w:val="19"/>
+                <w:szCs w:val="19"/>
+              </w:rPr>
+              <w:t xml:space="preserve">5% packet loss (IEEE 118)</w:t>
+            </w:r>
+          </w:p>
+        </w:tc>
+        <w:tc>
+          <w:tcPr>
+            <w:tcW w:type="dxa" w:w="5777"/>
+            <w:tcBorders>
+              <w:top w:val="single" w:color="B0BEC5" w:sz="4"/>
+              <w:left w:val="single" w:color="B0BEC5" w:sz="4"/>
+              <w:bottom w:val="single" w:color="B0BEC5" w:sz="4"/>
+              <w:right w:val="single" w:color="B0BEC5" w:sz="4"/>
+            </w:tcBorders>
+            <w:tcMar>
+              <w:top w:type="dxa" w:w="60"/>
+              <w:left w:type="dxa" w:w="100"/>
+              <w:bottom w:type="dxa" w:w="60"/>
+              <w:right w:type="dxa" w:w="100"/>
+            </w:tcMar>
+          </w:tcPr>
+          <w:p>
+            <w:pPr>
+              <w:spacing w:after="0" w:line="252"/>
+            </w:pPr>
+            <w:r>
+              <w:rPr>
+                <w:sz w:val="19"/>
+                <w:szCs w:val="19"/>
+              </w:rPr>
+              <w:t xml:space="preserve">Lossy links without an attack</w:t>
+            </w:r>
+          </w:p>
+        </w:tc>
+      </w:tr>
+      <w:tr>
+        <w:trPr>
+          <w:cantSplit/>
+        </w:trPr>
+        <w:tc>
+          <w:tcPr>
+            <w:tcW w:type="dxa" w:w="3249"/>
+            <w:tcBorders>
+              <w:top w:val="single" w:color="B0BEC5" w:sz="4"/>
+              <w:left w:val="single" w:color="B0BEC5" w:sz="4"/>
+              <w:bottom w:val="single" w:color="B0BEC5" w:sz="4"/>
+              <w:right w:val="single" w:color="B0BEC5" w:sz="4"/>
+            </w:tcBorders>
+            <w:tcMar>
+              <w:top w:type="dxa" w:w="60"/>
+              <w:left w:type="dxa" w:w="100"/>
+              <w:bottom w:type="dxa" w:w="60"/>
+              <w:right w:type="dxa" w:w="100"/>
+            </w:tcMar>
+          </w:tcPr>
+          <w:p>
+            <w:pPr>
+              <w:spacing w:after="0" w:line="252"/>
+            </w:pPr>
+            <w:r>
+              <w:rPr>
+                <w:sz w:val="19"/>
+                <w:szCs w:val="19"/>
+              </w:rPr>
+              <w:t xml:space="preserve">Fault (dynamic, IEEE 39)</w:t>
+            </w:r>
+          </w:p>
+        </w:tc>
+        <w:tc>
+          <w:tcPr>
+            <w:tcW w:type="dxa" w:w="5777"/>
+            <w:tcBorders>
+              <w:top w:val="single" w:color="B0BEC5" w:sz="4"/>
+              <w:left w:val="single" w:color="B0BEC5" w:sz="4"/>
+              <w:bottom w:val="single" w:color="B0BEC5" w:sz="4"/>
+              <w:right w:val="single" w:color="B0BEC5" w:sz="4"/>
+            </w:tcBorders>
+            <w:tcMar>
+              <w:top w:type="dxa" w:w="60"/>
+              <w:left w:type="dxa" w:w="100"/>
+              <w:bottom w:type="dxa" w:w="60"/>
+              <w:right w:type="dxa" w:w="100"/>
+            </w:tcMar>
+          </w:tcPr>
+          <w:p>
+            <w:pPr>
+              <w:spacing w:after="0" w:line="252"/>
+            </w:pPr>
+            <w:r>
+              <w:rPr>
+                <w:sz w:val="19"/>
+                <w:szCs w:val="19"/>
+              </w:rPr>
+              <w:t xml:space="preserve">Three-phase fault at bus 16, cleared after 0.1 s</w:t>
+            </w:r>
+          </w:p>
+        </w:tc>
+      </w:tr>
+      <w:tr>
+        <w:trPr>
+          <w:cantSplit/>
+        </w:trPr>
+        <w:tc>
+          <w:tcPr>
+            <w:tcW w:type="dxa" w:w="3249"/>
+            <w:tcBorders>
+              <w:top w:val="single" w:color="B0BEC5" w:sz="4"/>
+              <w:left w:val="single" w:color="B0BEC5" w:sz="4"/>
+              <w:bottom w:val="single" w:color="B0BEC5" w:sz="4"/>
+              <w:right w:val="single" w:color="B0BEC5" w:sz="4"/>
+            </w:tcBorders>
+            <w:tcMar>
+              <w:top w:type="dxa" w:w="60"/>
+              <w:left w:type="dxa" w:w="100"/>
+              <w:bottom w:type="dxa" w:w="60"/>
+              <w:right w:type="dxa" w:w="100"/>
+            </w:tcMar>
+          </w:tcPr>
+          <w:p>
+            <w:pPr>
+              <w:spacing w:after="0" w:line="252"/>
+            </w:pPr>
+            <w:r>
+              <w:rPr>
+                <w:sz w:val="19"/>
+                <w:szCs w:val="19"/>
+              </w:rPr>
+              <w:t xml:space="preserve">Generator trip (dynamic, IEEE 39)</w:t>
+            </w:r>
+          </w:p>
+        </w:tc>
+        <w:tc>
+          <w:tcPr>
+            <w:tcW w:type="dxa" w:w="5777"/>
+            <w:tcBorders>
+              <w:top w:val="single" w:color="B0BEC5" w:sz="4"/>
+              <w:left w:val="single" w:color="B0BEC5" w:sz="4"/>
+              <w:bottom w:val="single" w:color="B0BEC5" w:sz="4"/>
+              <w:right w:val="single" w:color="B0BEC5" w:sz="4"/>
+            </w:tcBorders>
+            <w:tcMar>
+              <w:top w:type="dxa" w:w="60"/>
+              <w:left w:type="dxa" w:w="100"/>
+              <w:bottom w:type="dxa" w:w="60"/>
+              <w:right w:type="dxa" w:w="100"/>
+            </w:tcMar>
+          </w:tcPr>
+          <w:p>
+            <w:pPr>
+              <w:spacing w:after="0" w:line="252"/>
+            </w:pPr>
+            <w:r>
+              <w:rPr>
+                <w:sz w:val="19"/>
+                <w:szCs w:val="19"/>
+              </w:rPr>
+              <w:t xml:space="preserve">Generator 32 (650 MW) trips; frequency falls and recovers</w:t>
+            </w:r>
+          </w:p>
+        </w:tc>
+      </w:tr>
+      <w:tr>
+        <w:trPr>
+          <w:cantSplit/>
+        </w:trPr>
+        <w:tc>
+          <w:tcPr>
+            <w:tcW w:type="dxa" w:w="3249"/>
+            <w:tcBorders>
+              <w:top w:val="single" w:color="B0BEC5" w:sz="4"/>
+              <w:left w:val="single" w:color="B0BEC5" w:sz="4"/>
+              <w:bottom w:val="single" w:color="B0BEC5" w:sz="4"/>
+              <w:right w:val="single" w:color="B0BEC5" w:sz="4"/>
+            </w:tcBorders>
+            <w:tcMar>
+              <w:top w:type="dxa" w:w="60"/>
+              <w:left w:type="dxa" w:w="100"/>
+              <w:bottom w:type="dxa" w:w="60"/>
+              <w:right w:type="dxa" w:w="100"/>
+            </w:tcMar>
+          </w:tcPr>
+          <w:p>
+            <w:pPr>
+              <w:spacing w:after="0" w:line="252"/>
+            </w:pPr>
+            <w:r>
+              <w:rPr>
+                <w:sz w:val="19"/>
+                <w:szCs w:val="19"/>
+              </w:rPr>
+              <w:t xml:space="preserve">AVR fault + control (dynamic, IEEE 39)</w:t>
+            </w:r>
+          </w:p>
+        </w:tc>
+        <w:tc>
+          <w:tcPr>
+            <w:tcW w:type="dxa" w:w="5777"/>
+            <w:tcBorders>
+              <w:top w:val="single" w:color="B0BEC5" w:sz="4"/>
+              <w:left w:val="single" w:color="B0BEC5" w:sz="4"/>
+              <w:bottom w:val="single" w:color="B0BEC5" w:sz="4"/>
+              <w:right w:val="single" w:color="B0BEC5" w:sz="4"/>
+            </w:tcBorders>
+            <w:tcMar>
+              <w:top w:type="dxa" w:w="60"/>
+              <w:left w:type="dxa" w:w="100"/>
+              <w:bottom w:type="dxa" w:w="60"/>
+              <w:right w:type="dxa" w:w="100"/>
+            </w:tcMar>
+          </w:tcPr>
+          <w:p>
+            <w:pPr>
+              <w:spacing w:after="0" w:line="252"/>
+            </w:pPr>
+            <w:r>
+              <w:rPr>
+                <w:sz w:val="19"/>
+                <w:szCs w:val="19"/>
+              </w:rPr>
+              <w:t xml:space="preserve">Generator 30 setpoint jumps to 1.12 pu; the control center corrects it</w:t>
+            </w:r>
+          </w:p>
+        </w:tc>
+      </w:tr>
+    </w:tbl>
+    <w:p>
+      <w:pPr>
+        <w:spacing w:after="120"/>
+      </w:pPr>
+    </w:p>
+    <w:p>
+      <w:pPr>
+        <w:spacing w:after="120" w:line="288"/>
+      </w:pPr>
+      <w:r>
+        <w:rPr>
+          <w:i/>
+          <w:iCs/>
+        </w:rPr>
+        <w:t xml:space="preserve">GridPACK MPI ranks</w:t>
+      </w:r>
+      <w:r>
+        <w:t xml:space="preserve"> lists the choices the cluster allows, with the default of the Cluster page marked. </w:t>
+      </w:r>
+      <w:r>
+        <w:rPr>
+          <w:i/>
+          <w:iCs/>
+        </w:rPr>
+        <w:t xml:space="preserve">Download as scenario file</w:t>
+      </w:r>
+      <w:r>
+        <w:t xml:space="preserve"> saves the form as a YAML file that can be edited and uploaded later, for example to run it again or to build a file with several experiments. After </w:t>
+      </w:r>
+      <w:r>
+        <w:rPr>
+          <w:i/>
+          <w:iCs/>
+        </w:rPr>
+        <w:t xml:space="preserve">Run experiment</w:t>
+      </w:r>
+      <w:r>
+        <w:t xml:space="preserve"> the answer appears under the buttons (or the reason the experiment was refused), with a link to the Live page.</w:t>
+      </w:r>
+    </w:p>
+    <w:p>
+      <w:pPr>
+        <w:pStyle w:val="Heading2"/>
+      </w:pPr>
+      <w:r>
+        <w:t xml:space="preserve">6.4 Cluster page</w:t>
+      </w:r>
+    </w:p>
+    <w:p>
+      <w:pPr>
+        <w:spacing w:after="120" w:line="288"/>
+      </w:pPr>
+      <w:r>
+        <w:t xml:space="preserve">The </w:t>
+      </w:r>
+      <w:r>
+        <w:rPr>
+          <w:i/>
+          <w:iCs/>
+        </w:rPr>
+        <w:t xml:space="preserve">Cluster</w:t>
+      </w:r>
+      <w:r>
+        <w:t xml:space="preserve"> page shows the nodes and changes the cluster without editing files. </w:t>
+      </w:r>
+      <w:r>
+        <w:rPr>
+          <w:i/>
+          <w:iCs/>
+        </w:rPr>
+        <w:t xml:space="preserve">Save</w:t>
+      </w:r>
+      <w:r>
+        <w:t xml:space="preserve"> applies the settings at once to the experiments started afterwards: MPI slots, the queue and the number of experiments at the same time follow immediately, and nodes that do not answer over ssh are named. The settings are kept in </w:t>
+      </w:r>
+      <w:r>
+        <w:rPr>
+          <w:rFonts w:ascii="Consolas" w:cs="Consolas" w:eastAsia="Consolas" w:hAnsi="Consolas"/>
+          <w:color w:val="37474F"/>
+          <w:sz w:val="19"/>
+          <w:szCs w:val="19"/>
+        </w:rPr>
+        <w:t xml:space="preserve">/srv/cps/cluster_settings.json</w:t>
+      </w:r>
+      <w:r>
+        <w:t xml:space="preserve"> and take precedence over </w:t>
+      </w:r>
+      <w:r>
+        <w:rPr>
+          <w:rFonts w:ascii="Consolas" w:cs="Consolas" w:eastAsia="Consolas" w:hAnsi="Consolas"/>
+          <w:color w:val="37474F"/>
+          <w:sz w:val="19"/>
+          <w:szCs w:val="19"/>
+        </w:rPr>
+        <w:t xml:space="preserve">/etc/cps/cps.env</w:t>
+      </w:r>
+      <w:r>
+        <w:t xml:space="preserve">; </w:t>
+      </w:r>
+      <w:r>
+        <w:rPr>
+          <w:i/>
+          <w:iCs/>
+        </w:rPr>
+        <w:t xml:space="preserve">Use the settings file</w:t>
+      </w:r>
+      <w:r>
+        <w:t xml:space="preserve"> goes back to it.</w:t>
+      </w:r>
+    </w:p>
+    <w:p>
+      <w:pPr>
+        <w:keepNext/>
+        <w:spacing w:after="60" w:before="120"/>
+        <w:jc w:val="center"/>
+      </w:pPr>
+      <w:r>
+        <w:drawing>
+          <wp:inline distT="0" distB="0" distL="0" distR="0">
+            <wp:extent cx="5715000" cy="4019550"/>
+            <wp:effectExtent t="0" r="0" b="0" l="0"/>
+            <wp:docPr id="1" name="cluster.png" descr="Cluster page: the nodes with their roles, and the settings (default MPI ranks, experiments at the same time, compute nodes and their MPI slots, node of each federate)." title="Cluster page: the nodes with their roles, and the settings (default MPI ranks, experiments at the same time, compute nodes and their MPI slots, node of each federate)."/>
+            <wp:cNvGraphicFramePr>
+              <a:graphicFrameLocks xmlns:a="http://schemas.openxmlformats.org/drawingml/2006/main" noChangeAspect="1"/>
+            </wp:cNvGraphicFramePr>
+            <a:graphic xmlns:a="http://schemas.openxmlformats.org/drawingml/2006/main">
+              <a:graphicData uri="http://schemas.openxmlformats.org/drawingml/2006/picture">
+                <pic:pic xmlns:pic="http://schemas.openxmlformats.org/drawingml/2006/picture">
+                  <pic:nvPicPr>
+                    <pic:cNvPr id="0" name="" descr=""/>
+                    <pic:cNvPicPr>
+                      <a:picLocks noChangeAspect="1" noChangeArrowheads="1"/>
+                    </pic:cNvPicPr>
+                  </pic:nvPicPr>
+                  <pic:blipFill>
+                    <a:blip r:embed="rId16" cstate="none"/>
+                    <a:srcRect/>
+                    <a:stretch>
+                      <a:fillRect/>
+                    </a:stretch>
+                  </pic:blipFill>
+                  <pic:spPr bwMode="auto">
+                    <a:xfrm>
+                      <a:off x="0" y="0"/>
+                      <a:ext cx="5715000" cy="4019550"/>
+                    </a:xfrm>
+                    <a:prstGeom prst="rect">
+                      <a:avLst/>
+                    </a:prstGeom>
+                  </pic:spPr>
+                </pic:pic>
+              </a:graphicData>
+            </a:graphic>
+          </wp:inline>
+        </w:drawing>
+      </w:r>
+    </w:p>
+    <w:p>
+      <w:pPr>
+        <w:spacing w:after="200"/>
+        <w:jc w:val="center"/>
+      </w:pPr>
+      <w:r>
+        <w:rPr>
+          <w:b/>
+          <w:bCs/>
+          <w:color w:val="455A64"/>
+          <w:sz w:val="18"/>
+          <w:szCs w:val="18"/>
+        </w:rPr>
+        <w:t xml:space="preserve">Figure 8. </w:t>
+      </w:r>
+      <w:r>
+        <w:rPr>
+          <w:i/>
+          <w:iCs/>
+          <w:color w:val="455A64"/>
+          <w:sz w:val="18"/>
+          <w:szCs w:val="18"/>
+        </w:rPr>
+        <w:t xml:space="preserve">Cluster page: the nodes with their roles, and the settings (default MPI ranks, experiments at the same time, compute nodes and their MPI slots, node of each federate).</w:t>
+      </w:r>
+    </w:p>
+    <w:p>
+      <w:pPr>
+        <w:pBdr>
+          <w:left w:val="single" w:color="1565C0" w:sz="18" w:space="8"/>
+        </w:pBdr>
+        <w:shd w:fill="E3F2FD" w:color="auto" w:val="clear"/>
+        <w:spacing w:after="160" w:before="80" w:line="276"/>
+        <w:ind w:left="160" w:right="120"/>
+      </w:pPr>
+      <w:r>
+        <w:t xml:space="preserve">Each experiment checks the nodes when it starts. Nodes that do not answer are left out of its MPI hostfile (its log names them); if a federate is placed on such a node, or the remaining slots are too few for the requested MPI ranks, the experiment stops at once with that message.</w:t>
+      </w:r>
+    </w:p>
+    <w:p>
+      <w:pPr>
+        <w:pStyle w:val="Heading2"/>
+      </w:pPr>
+      <w:r>
+        <w:t xml:space="preserve">6.5 Scenario files</w:t>
       </w:r>
     </w:p>
     <w:p>
@@ -14711,7 +15575,7 @@
                 <w:sz w:val="19"/>
                 <w:szCs w:val="19"/>
               </w:rPr>
-              <w:t xml:space="preserve">gridpack / builtin; 1–256 (1)</w:t>
+              <w:t xml:space="preserve">gridpack / builtin; 1 to the MPI slots (Cluster page default)</w:t>
             </w:r>
           </w:p>
         </w:tc>
@@ -15221,7 +16085,7 @@
         <w:pStyle w:val="Heading2"/>
       </w:pPr>
       <w:r>
-        <w:t xml:space="preserve">6.4 Uploading a grid model</w:t>
+        <w:t xml:space="preserve">6.6 Uploading a grid model</w:t>
       </w:r>
     </w:p>
     <w:p>
@@ -15297,7 +16161,7 @@
         <w:pStyle w:val="Heading2"/>
       </w:pPr>
       <w:r>
-        <w:t xml:space="preserve">6.5 Live page</w:t>
+        <w:t xml:space="preserve">6.7 Live page</w:t>
       </w:r>
     </w:p>
     <w:p>
@@ -15320,152 +16184,6 @@
             <wp:extent cx="5715000" cy="1352550"/>
             <wp:effectExtent t="0" r="0" b="0" l="0"/>
             <wp:docPr id="1" name="live_0.png" descr="Live: progress, highest true and estimated voltage, alarms, chi-square value, PDC completeness, commands and MPI ranks, 12 s into a 30 s run." title="Live: progress, highest true and estimated voltage, alarms, chi-square value, PDC completeness, commands and MPI ranks, 12 s into a 30 s run."/>
-            <wp:cNvGraphicFramePr>
-              <a:graphicFrameLocks xmlns:a="http://schemas.openxmlformats.org/drawingml/2006/main" noChangeAspect="1"/>
-            </wp:cNvGraphicFramePr>
-            <a:graphic xmlns:a="http://schemas.openxmlformats.org/drawingml/2006/main">
-              <a:graphicData uri="http://schemas.openxmlformats.org/drawingml/2006/picture">
-                <pic:pic xmlns:pic="http://schemas.openxmlformats.org/drawingml/2006/picture">
-                  <pic:nvPicPr>
-                    <pic:cNvPr id="0" name="" descr=""/>
-                    <pic:cNvPicPr>
-                      <a:picLocks noChangeAspect="1" noChangeArrowheads="1"/>
-                    </pic:cNvPicPr>
-                  </pic:nvPicPr>
-                  <pic:blipFill>
-                    <a:blip r:embed="rId15" cstate="none"/>
-                    <a:srcRect/>
-                    <a:stretch>
-                      <a:fillRect/>
-                    </a:stretch>
-                  </pic:blipFill>
-                  <pic:spPr bwMode="auto">
-                    <a:xfrm>
-                      <a:off x="0" y="0"/>
-                      <a:ext cx="5715000" cy="1352550"/>
-                    </a:xfrm>
-                    <a:prstGeom prst="rect">
-                      <a:avLst/>
-                    </a:prstGeom>
-                  </pic:spPr>
-                </pic:pic>
-              </a:graphicData>
-            </a:graphic>
-          </wp:inline>
-        </w:drawing>
-      </w:r>
-    </w:p>
-    <w:p>
-      <w:pPr>
-        <w:spacing w:after="200"/>
-        <w:jc w:val="center"/>
-      </w:pPr>
-      <w:r>
-        <w:rPr>
-          <w:b/>
-          <w:bCs/>
-          <w:color w:val="455A64"/>
-          <w:sz w:val="18"/>
-          <w:szCs w:val="18"/>
-        </w:rPr>
-        <w:t xml:space="preserve">Figure 7. </w:t>
-      </w:r>
-      <w:r>
-        <w:rPr>
-          <w:i/>
-          <w:iCs/>
-          <w:color w:val="455A64"/>
-          <w:sz w:val="18"/>
-          <w:szCs w:val="18"/>
-        </w:rPr>
-        <w:t xml:space="preserve">Live: progress, highest true and estimated voltage, alarms, chi-square value, PDC completeness, commands and MPI ranks, 12 s into a 30 s run.</w:t>
-      </w:r>
-    </w:p>
-    <w:p>
-      <w:pPr>
-        <w:keepNext/>
-        <w:spacing w:after="60" w:before="120"/>
-        <w:jc w:val="center"/>
-      </w:pPr>
-      <w:r>
-        <w:drawing>
-          <wp:inline distT="0" distB="0" distL="0" distR="0">
-            <wp:extent cx="5715000" cy="2676525"/>
-            <wp:effectExtent t="0" r="0" b="0" l="0"/>
-            <wp:docPr id="1" name="live_1.png" descr="Live charts during the run: the fault at 8 s, the falsified channel making the chi-square value jump, and the correction. Enter a bus number to follow any bus." title="Live charts during the run: the fault at 8 s, the falsified channel making the chi-square value jump, and the correction. Enter a bus number to follow any bus."/>
-            <wp:cNvGraphicFramePr>
-              <a:graphicFrameLocks xmlns:a="http://schemas.openxmlformats.org/drawingml/2006/main" noChangeAspect="1"/>
-            </wp:cNvGraphicFramePr>
-            <a:graphic xmlns:a="http://schemas.openxmlformats.org/drawingml/2006/main">
-              <a:graphicData uri="http://schemas.openxmlformats.org/drawingml/2006/picture">
-                <pic:pic xmlns:pic="http://schemas.openxmlformats.org/drawingml/2006/picture">
-                  <pic:nvPicPr>
-                    <pic:cNvPr id="0" name="" descr=""/>
-                    <pic:cNvPicPr>
-                      <a:picLocks noChangeAspect="1" noChangeArrowheads="1"/>
-                    </pic:cNvPicPr>
-                  </pic:nvPicPr>
-                  <pic:blipFill>
-                    <a:blip r:embed="rId16" cstate="none"/>
-                    <a:srcRect/>
-                    <a:stretch>
-                      <a:fillRect/>
-                    </a:stretch>
-                  </pic:blipFill>
-                  <pic:spPr bwMode="auto">
-                    <a:xfrm>
-                      <a:off x="0" y="0"/>
-                      <a:ext cx="5715000" cy="2676525"/>
-                    </a:xfrm>
-                    <a:prstGeom prst="rect">
-                      <a:avLst/>
-                    </a:prstGeom>
-                  </pic:spPr>
-                </pic:pic>
-              </a:graphicData>
-            </a:graphic>
-          </wp:inline>
-        </w:drawing>
-      </w:r>
-    </w:p>
-    <w:p>
-      <w:pPr>
-        <w:spacing w:after="200"/>
-        <w:jc w:val="center"/>
-      </w:pPr>
-      <w:r>
-        <w:rPr>
-          <w:b/>
-          <w:bCs/>
-          <w:color w:val="455A64"/>
-          <w:sz w:val="18"/>
-          <w:szCs w:val="18"/>
-        </w:rPr>
-        <w:t xml:space="preserve">Figure 8. </w:t>
-      </w:r>
-      <w:r>
-        <w:rPr>
-          <w:i/>
-          <w:iCs/>
-          <w:color w:val="455A64"/>
-          <w:sz w:val="18"/>
-          <w:szCs w:val="18"/>
-        </w:rPr>
-        <w:t xml:space="preserve">Live charts during the run: the fault at 8 s, the falsified channel making the chi-square value jump, and the correction. Enter a bus number to follow any bus.</w:t>
-      </w:r>
-    </w:p>
-    <w:p>
-      <w:pPr>
-        <w:keepNext/>
-        <w:spacing w:after="60" w:before="120"/>
-        <w:jc w:val="center"/>
-      </w:pPr>
-      <w:r>
-        <w:drawing>
-          <wp:inline distT="0" distB="0" distL="0" distR="0">
-            <wp:extent cx="5715000" cy="752475"/>
-            <wp:effectExtent t="0" r="0" b="0" l="0"/>
-            <wp:docPr id="1" name="live_2.png" descr="Commands so far: the AVR fault event, and the command issued at 8.067 s, delivered over the network at 8.107 s and applied by GridPACK at 8.5 s." title="Commands so far: the AVR fault event, and the command issued at 8.067 s, delivered over the network at 8.107 s and applied by GridPACK at 8.5 s."/>
             <wp:cNvGraphicFramePr>
               <a:graphicFrameLocks xmlns:a="http://schemas.openxmlformats.org/drawingml/2006/main" noChangeAspect="1"/>
             </wp:cNvGraphicFramePr>
@@ -15488,7 +16206,7 @@
                   <pic:spPr bwMode="auto">
                     <a:xfrm>
                       <a:off x="0" y="0"/>
-                      <a:ext cx="5715000" cy="752475"/>
+                      <a:ext cx="5715000" cy="1352550"/>
                     </a:xfrm>
                     <a:prstGeom prst="rect">
                       <a:avLst/>
@@ -15524,15 +16242,7 @@
           <w:sz w:val="18"/>
           <w:szCs w:val="18"/>
         </w:rPr>
-        <w:t xml:space="preserve">Commands so far: the AVR fault event, and the command issued at 8.067 s, delivered over the network at 8.107 s and applied by GridPACK at 8.5 s.</w:t>
-      </w:r>
-    </w:p>
-    <w:p>
-      <w:pPr>
-        <w:pStyle w:val="Heading2"/>
-      </w:pPr>
-      <w:r>
-        <w:t xml:space="preserve">6.6 Results page</w:t>
+        <w:t xml:space="preserve">Live: progress, highest true and estimated voltage, alarms, chi-square value, PDC completeness, commands and MPI ranks, 12 s into a 30 s run.</w:t>
       </w:r>
     </w:p>
     <w:p>
@@ -15544,9 +16254,9 @@
       <w:r>
         <w:drawing>
           <wp:inline distT="0" distB="0" distL="0" distR="0">
-            <wp:extent cx="5715000" cy="1800225"/>
+            <wp:extent cx="5715000" cy="2676525"/>
             <wp:effectExtent t="0" r="0" b="0" l="0"/>
-            <wp:docPr id="1" name="res_0.png" descr="Runs: one row per finished experiment; click a row to open it." title="Runs: one row per finished experiment; click a row to open it."/>
+            <wp:docPr id="1" name="live_1.png" descr="Live charts during the run: the fault at 8 s, the falsified channel making the chi-square value jump, and the correction. Enter a bus number to follow any bus." title="Live charts during the run: the fault at 8 s, the falsified channel making the chi-square value jump, and the correction. Enter a bus number to follow any bus."/>
             <wp:cNvGraphicFramePr>
               <a:graphicFrameLocks xmlns:a="http://schemas.openxmlformats.org/drawingml/2006/main" noChangeAspect="1"/>
             </wp:cNvGraphicFramePr>
@@ -15569,7 +16279,7 @@
                   <pic:spPr bwMode="auto">
                     <a:xfrm>
                       <a:off x="0" y="0"/>
-                      <a:ext cx="5715000" cy="1800225"/>
+                      <a:ext cx="5715000" cy="2676525"/>
                     </a:xfrm>
                     <a:prstGeom prst="rect">
                       <a:avLst/>
@@ -15605,7 +16315,7 @@
           <w:sz w:val="18"/>
           <w:szCs w:val="18"/>
         </w:rPr>
-        <w:t xml:space="preserve">Runs: one row per finished experiment; click a row to open it.</w:t>
+        <w:t xml:space="preserve">Live charts during the run: the fault at 8 s, the falsified channel making the chi-square value jump, and the correction. Enter a bus number to follow any bus.</w:t>
       </w:r>
     </w:p>
     <w:p>
@@ -15617,9 +16327,9 @@
       <w:r>
         <w:drawing>
           <wp:inline distT="0" distB="0" distL="0" distR="0">
-            <wp:extent cx="5715000" cy="1285875"/>
+            <wp:extent cx="5715000" cy="752475"/>
             <wp:effectExtent t="0" r="0" b="0" l="0"/>
-            <wp:docPr id="1" name="res_1.png" descr="Run summary of the IEEE 118 simple FDI run, with colour-coded figures (green good, amber borderline, red problem)." title="Run summary of the IEEE 118 simple FDI run, with colour-coded figures (green good, amber borderline, red problem)."/>
+            <wp:docPr id="1" name="live_2.png" descr="Commands so far: the AVR fault event, and the command issued at 8.067 s, delivered over the network at 8.107 s and applied by GridPACK at 8.5 s." title="Commands so far: the AVR fault event, and the command issued at 8.067 s, delivered over the network at 8.107 s and applied by GridPACK at 8.5 s."/>
             <wp:cNvGraphicFramePr>
               <a:graphicFrameLocks xmlns:a="http://schemas.openxmlformats.org/drawingml/2006/main" noChangeAspect="1"/>
             </wp:cNvGraphicFramePr>
@@ -15642,6 +16352,160 @@
                   <pic:spPr bwMode="auto">
                     <a:xfrm>
                       <a:off x="0" y="0"/>
+                      <a:ext cx="5715000" cy="752475"/>
+                    </a:xfrm>
+                    <a:prstGeom prst="rect">
+                      <a:avLst/>
+                    </a:prstGeom>
+                  </pic:spPr>
+                </pic:pic>
+              </a:graphicData>
+            </a:graphic>
+          </wp:inline>
+        </w:drawing>
+      </w:r>
+    </w:p>
+    <w:p>
+      <w:pPr>
+        <w:spacing w:after="200"/>
+        <w:jc w:val="center"/>
+      </w:pPr>
+      <w:r>
+        <w:rPr>
+          <w:b/>
+          <w:bCs/>
+          <w:color w:val="455A64"/>
+          <w:sz w:val="18"/>
+          <w:szCs w:val="18"/>
+        </w:rPr>
+        <w:t xml:space="preserve">Figure 11. </w:t>
+      </w:r>
+      <w:r>
+        <w:rPr>
+          <w:i/>
+          <w:iCs/>
+          <w:color w:val="455A64"/>
+          <w:sz w:val="18"/>
+          <w:szCs w:val="18"/>
+        </w:rPr>
+        <w:t xml:space="preserve">Commands so far: the AVR fault event, and the command issued at 8.067 s, delivered over the network at 8.107 s and applied by GridPACK at 8.5 s.</w:t>
+      </w:r>
+    </w:p>
+    <w:p>
+      <w:pPr>
+        <w:pStyle w:val="Heading2"/>
+      </w:pPr>
+      <w:r>
+        <w:t xml:space="preserve">6.8 Results page</w:t>
+      </w:r>
+    </w:p>
+    <w:p>
+      <w:pPr>
+        <w:keepNext/>
+        <w:spacing w:after="60" w:before="120"/>
+        <w:jc w:val="center"/>
+      </w:pPr>
+      <w:r>
+        <w:drawing>
+          <wp:inline distT="0" distB="0" distL="0" distR="0">
+            <wp:extent cx="5715000" cy="1800225"/>
+            <wp:effectExtent t="0" r="0" b="0" l="0"/>
+            <wp:docPr id="1" name="res_0.png" descr="Runs: one row per finished experiment; click a row to open it." title="Runs: one row per finished experiment; click a row to open it."/>
+            <wp:cNvGraphicFramePr>
+              <a:graphicFrameLocks xmlns:a="http://schemas.openxmlformats.org/drawingml/2006/main" noChangeAspect="1"/>
+            </wp:cNvGraphicFramePr>
+            <a:graphic xmlns:a="http://schemas.openxmlformats.org/drawingml/2006/main">
+              <a:graphicData uri="http://schemas.openxmlformats.org/drawingml/2006/picture">
+                <pic:pic xmlns:pic="http://schemas.openxmlformats.org/drawingml/2006/picture">
+                  <pic:nvPicPr>
+                    <pic:cNvPr id="0" name="" descr=""/>
+                    <pic:cNvPicPr>
+                      <a:picLocks noChangeAspect="1" noChangeArrowheads="1"/>
+                    </pic:cNvPicPr>
+                  </pic:nvPicPr>
+                  <pic:blipFill>
+                    <a:blip r:embed="rId20" cstate="none"/>
+                    <a:srcRect/>
+                    <a:stretch>
+                      <a:fillRect/>
+                    </a:stretch>
+                  </pic:blipFill>
+                  <pic:spPr bwMode="auto">
+                    <a:xfrm>
+                      <a:off x="0" y="0"/>
+                      <a:ext cx="5715000" cy="1800225"/>
+                    </a:xfrm>
+                    <a:prstGeom prst="rect">
+                      <a:avLst/>
+                    </a:prstGeom>
+                  </pic:spPr>
+                </pic:pic>
+              </a:graphicData>
+            </a:graphic>
+          </wp:inline>
+        </w:drawing>
+      </w:r>
+    </w:p>
+    <w:p>
+      <w:pPr>
+        <w:spacing w:after="200"/>
+        <w:jc w:val="center"/>
+      </w:pPr>
+      <w:r>
+        <w:rPr>
+          <w:b/>
+          <w:bCs/>
+          <w:color w:val="455A64"/>
+          <w:sz w:val="18"/>
+          <w:szCs w:val="18"/>
+        </w:rPr>
+        <w:t xml:space="preserve">Figure 12. </w:t>
+      </w:r>
+      <w:r>
+        <w:rPr>
+          <w:i/>
+          <w:iCs/>
+          <w:color w:val="455A64"/>
+          <w:sz w:val="18"/>
+          <w:szCs w:val="18"/>
+        </w:rPr>
+        <w:t xml:space="preserve">Runs: one row per finished experiment; click a row to open it.</w:t>
+      </w:r>
+    </w:p>
+    <w:p>
+      <w:pPr>
+        <w:keepNext/>
+        <w:spacing w:after="60" w:before="120"/>
+        <w:jc w:val="center"/>
+      </w:pPr>
+      <w:r>
+        <w:drawing>
+          <wp:inline distT="0" distB="0" distL="0" distR="0">
+            <wp:extent cx="5715000" cy="1285875"/>
+            <wp:effectExtent t="0" r="0" b="0" l="0"/>
+            <wp:docPr id="1" name="res_1.png" descr="Run summary of the IEEE 118 simple FDI run, with colour-coded figures (green good, amber borderline, red problem)." title="Run summary of the IEEE 118 simple FDI run, with colour-coded figures (green good, amber borderline, red problem)."/>
+            <wp:cNvGraphicFramePr>
+              <a:graphicFrameLocks xmlns:a="http://schemas.openxmlformats.org/drawingml/2006/main" noChangeAspect="1"/>
+            </wp:cNvGraphicFramePr>
+            <a:graphic xmlns:a="http://schemas.openxmlformats.org/drawingml/2006/main">
+              <a:graphicData uri="http://schemas.openxmlformats.org/drawingml/2006/picture">
+                <pic:pic xmlns:pic="http://schemas.openxmlformats.org/drawingml/2006/picture">
+                  <pic:nvPicPr>
+                    <pic:cNvPr id="0" name="" descr=""/>
+                    <pic:cNvPicPr>
+                      <a:picLocks noChangeAspect="1" noChangeArrowheads="1"/>
+                    </pic:cNvPicPr>
+                  </pic:nvPicPr>
+                  <pic:blipFill>
+                    <a:blip r:embed="rId21" cstate="none"/>
+                    <a:srcRect/>
+                    <a:stretch>
+                      <a:fillRect/>
+                    </a:stretch>
+                  </pic:blipFill>
+                  <pic:spPr bwMode="auto">
+                    <a:xfrm>
+                      <a:off x="0" y="0"/>
                       <a:ext cx="5715000" cy="1285875"/>
                     </a:xfrm>
                     <a:prstGeom prst="rect">
@@ -15668,7 +16532,7 @@
           <w:sz w:val="18"/>
           <w:szCs w:val="18"/>
         </w:rPr>
-        <w:t xml:space="preserve">Figure 11. </w:t>
+        <w:t xml:space="preserve">Figure 13. </w:t>
       </w:r>
       <w:r>
         <w:rPr>
@@ -16386,7 +17250,7 @@
                     </pic:cNvPicPr>
                   </pic:nvPicPr>
                   <pic:blipFill>
-                    <a:blip r:embed="rId20" cstate="none"/>
+                    <a:blip r:embed="rId22" cstate="none"/>
                     <a:srcRect/>
                     <a:stretch>
                       <a:fillRect/>
@@ -16421,7 +17285,7 @@
           <w:sz w:val="18"/>
           <w:szCs w:val="18"/>
         </w:rPr>
-        <w:t xml:space="preserve">Figure 12. </w:t>
+        <w:t xml:space="preserve">Figure 14. </w:t>
       </w:r>
       <w:r>
         <w:rPr>
@@ -16446,324 +17310,6 @@
             <wp:extent cx="5715000" cy="762000"/>
             <wp:effectExtent t="0" r="0" b="0" l="0"/>
             <wp:docPr id="1" name="res_3.png" descr="Commands and events of the run." title="Commands and events of the run."/>
-            <wp:cNvGraphicFramePr>
-              <a:graphicFrameLocks xmlns:a="http://schemas.openxmlformats.org/drawingml/2006/main" noChangeAspect="1"/>
-            </wp:cNvGraphicFramePr>
-            <a:graphic xmlns:a="http://schemas.openxmlformats.org/drawingml/2006/main">
-              <a:graphicData uri="http://schemas.openxmlformats.org/drawingml/2006/picture">
-                <pic:pic xmlns:pic="http://schemas.openxmlformats.org/drawingml/2006/picture">
-                  <pic:nvPicPr>
-                    <pic:cNvPr id="0" name="" descr=""/>
-                    <pic:cNvPicPr>
-                      <a:picLocks noChangeAspect="1" noChangeArrowheads="1"/>
-                    </pic:cNvPicPr>
-                  </pic:nvPicPr>
-                  <pic:blipFill>
-                    <a:blip r:embed="rId21" cstate="none"/>
-                    <a:srcRect/>
-                    <a:stretch>
-                      <a:fillRect/>
-                    </a:stretch>
-                  </pic:blipFill>
-                  <pic:spPr bwMode="auto">
-                    <a:xfrm>
-                      <a:off x="0" y="0"/>
-                      <a:ext cx="5715000" cy="762000"/>
-                    </a:xfrm>
-                    <a:prstGeom prst="rect">
-                      <a:avLst/>
-                    </a:prstGeom>
-                  </pic:spPr>
-                </pic:pic>
-              </a:graphicData>
-            </a:graphic>
-          </wp:inline>
-        </w:drawing>
-      </w:r>
-    </w:p>
-    <w:p>
-      <w:pPr>
-        <w:spacing w:after="200"/>
-        <w:jc w:val="center"/>
-      </w:pPr>
-      <w:r>
-        <w:rPr>
-          <w:b/>
-          <w:bCs/>
-          <w:color w:val="455A64"/>
-          <w:sz w:val="18"/>
-          <w:szCs w:val="18"/>
-        </w:rPr>
-        <w:t xml:space="preserve">Figure 13. </w:t>
-      </w:r>
-      <w:r>
-        <w:rPr>
-          <w:i/>
-          <w:iCs/>
-          <w:color w:val="455A64"/>
-          <w:sz w:val="18"/>
-          <w:szCs w:val="18"/>
-        </w:rPr>
-        <w:t xml:space="preserve">Commands and events of the run.</w:t>
-      </w:r>
-    </w:p>
-    <w:p>
-      <w:pPr>
-        <w:pStyle w:val="Heading2"/>
-      </w:pPr>
-      <w:r>
-        <w:t xml:space="preserve">6.7 Dynamic simulation runs</w:t>
-      </w:r>
-    </w:p>
-    <w:p>
-      <w:pPr>
-        <w:spacing w:after="120" w:line="288"/>
-      </w:pPr>
-      <w:r>
-        <w:t xml:space="preserve">A scenario with </w:t>
-      </w:r>
-      <w:r>
-        <w:rPr>
-          <w:rFonts w:ascii="Consolas" w:cs="Consolas" w:eastAsia="Consolas" w:hAnsi="Consolas"/>
-          <w:color w:val="37474F"/>
-          <w:sz w:val="19"/>
-          <w:szCs w:val="19"/>
-        </w:rPr>
-        <w:t xml:space="preserve">mode: dynamic</w:t>
-      </w:r>
-      <w:r>
-        <w:t xml:space="preserve"> uses the same pages. Below, a file with two IEEE 39 experiments (a 100 ms fault at bus 16 and the trip of generator 32, both at 3 s) was uploaded; both ran at the same time. The Live page adds the system frequency, the lowest frequency so far and the rotor angle spread, and two charts.</w:t>
-      </w:r>
-    </w:p>
-    <w:p>
-      <w:pPr>
-        <w:shd w:fill="F1F4F6" w:color="auto" w:val="clear"/>
-        <w:spacing w:after="0" w:before="60" w:line="252"/>
-        <w:ind w:left="120" w:right="120"/>
-      </w:pPr>
-      <w:r>
-        <w:rPr>
-          <w:rFonts w:ascii="Consolas" w:cs="Consolas" w:eastAsia="Consolas" w:hAnsi="Consolas"/>
-          <w:color w:val="263238"/>
-          <w:sz w:val="18"/>
-          <w:szCs w:val="18"/>
-        </w:rPr>
-        <w:t xml:space="preserve">grid: ieee39</w:t>
-      </w:r>
-    </w:p>
-    <w:p>
-      <w:pPr>
-        <w:shd w:fill="F1F4F6" w:color="auto" w:val="clear"/>
-        <w:spacing w:after="0" w:before="0" w:line="252"/>
-        <w:ind w:left="120" w:right="120"/>
-      </w:pPr>
-      <w:r>
-        <w:rPr>
-          <w:rFonts w:ascii="Consolas" w:cs="Consolas" w:eastAsia="Consolas" w:hAnsi="Consolas"/>
-          <w:color w:val="263238"/>
-          <w:sz w:val="18"/>
-          <w:szCs w:val="18"/>
-        </w:rPr>
-        <w:t xml:space="preserve">mode: dynamic</w:t>
-      </w:r>
-    </w:p>
-    <w:p>
-      <w:pPr>
-        <w:shd w:fill="F1F4F6" w:color="auto" w:val="clear"/>
-        <w:spacing w:after="0" w:before="0" w:line="252"/>
-        <w:ind w:left="120" w:right="120"/>
-      </w:pPr>
-      <w:r>
-        <w:rPr>
-          <w:rFonts w:ascii="Consolas" w:cs="Consolas" w:eastAsia="Consolas" w:hAnsi="Consolas"/>
-          <w:color w:val="263238"/>
-          <w:sz w:val="18"/>
-          <w:szCs w:val="18"/>
-        </w:rPr>
-        <w:t xml:space="preserve">duration: 15</w:t>
-      </w:r>
-    </w:p>
-    <w:p>
-      <w:pPr>
-        <w:shd w:fill="F1F4F6" w:color="auto" w:val="clear"/>
-        <w:spacing w:after="0" w:before="0" w:line="252"/>
-        <w:ind w:left="120" w:right="120"/>
-      </w:pPr>
-      <w:r>
-        <w:rPr>
-          <w:rFonts w:ascii="Consolas" w:cs="Consolas" w:eastAsia="Consolas" w:hAnsi="Consolas"/>
-          <w:color w:val="263238"/>
-          <w:sz w:val="18"/>
-          <w:szCs w:val="18"/>
-        </w:rPr>
-        <w:t xml:space="preserve">mpi_np: 1</w:t>
-      </w:r>
-    </w:p>
-    <w:p>
-      <w:pPr>
-        <w:shd w:fill="F1F4F6" w:color="auto" w:val="clear"/>
-        <w:spacing w:after="0" w:before="0" w:line="252"/>
-        <w:ind w:left="120" w:right="120"/>
-      </w:pPr>
-      <w:r>
-        <w:rPr>
-          <w:rFonts w:ascii="Consolas" w:cs="Consolas" w:eastAsia="Consolas" w:hAnsi="Consolas"/>
-          <w:color w:val="263238"/>
-          <w:sz w:val="18"/>
-          <w:szCs w:val="18"/>
-        </w:rPr>
-        <w:t xml:space="preserve">scenarios:</w:t>
-      </w:r>
-    </w:p>
-    <w:p>
-      <w:pPr>
-        <w:shd w:fill="F1F4F6" w:color="auto" w:val="clear"/>
-        <w:spacing w:after="0" w:before="0" w:line="252"/>
-        <w:ind w:left="120" w:right="120"/>
-      </w:pPr>
-      <w:r>
-        <w:rPr>
-          <w:rFonts w:ascii="Consolas" w:cs="Consolas" w:eastAsia="Consolas" w:hAnsi="Consolas"/>
-          <w:color w:val="263238"/>
-          <w:sz w:val="18"/>
-          <w:szCs w:val="18"/>
-        </w:rPr>
-        <w:t xml:space="preserve">  - name: ieee39-dyn-fault</w:t>
-      </w:r>
-    </w:p>
-    <w:p>
-      <w:pPr>
-        <w:shd w:fill="F1F4F6" w:color="auto" w:val="clear"/>
-        <w:spacing w:after="0" w:before="0" w:line="252"/>
-        <w:ind w:left="120" w:right="120"/>
-      </w:pPr>
-      <w:r>
-        <w:rPr>
-          <w:rFonts w:ascii="Consolas" w:cs="Consolas" w:eastAsia="Consolas" w:hAnsi="Consolas"/>
-          <w:color w:val="263238"/>
-          <w:sz w:val="18"/>
-          <w:szCs w:val="18"/>
-        </w:rPr>
-        <w:t xml:space="preserve">    event: {type: bus_fault, bus: 16, duration: 0.1, t: 3}</w:t>
-      </w:r>
-    </w:p>
-    <w:p>
-      <w:pPr>
-        <w:shd w:fill="F1F4F6" w:color="auto" w:val="clear"/>
-        <w:spacing w:after="0" w:before="0" w:line="252"/>
-        <w:ind w:left="120" w:right="120"/>
-      </w:pPr>
-      <w:r>
-        <w:rPr>
-          <w:rFonts w:ascii="Consolas" w:cs="Consolas" w:eastAsia="Consolas" w:hAnsi="Consolas"/>
-          <w:color w:val="263238"/>
-          <w:sz w:val="18"/>
-          <w:szCs w:val="18"/>
-        </w:rPr>
-        <w:t xml:space="preserve">  - name: ieee39-dyn-gentrip</w:t>
-      </w:r>
-    </w:p>
-    <w:p>
-      <w:pPr>
-        <w:shd w:fill="F1F4F6" w:color="auto" w:val="clear"/>
-        <w:spacing w:after="160" w:before="0" w:line="252"/>
-        <w:ind w:left="120" w:right="120"/>
-      </w:pPr>
-      <w:r>
-        <w:rPr>
-          <w:rFonts w:ascii="Consolas" w:cs="Consolas" w:eastAsia="Consolas" w:hAnsi="Consolas"/>
-          <w:color w:val="263238"/>
-          <w:sz w:val="18"/>
-          <w:szCs w:val="18"/>
-        </w:rPr>
-        <w:t xml:space="preserve">    event: {type: gen_trip, bus: 32, t: 3}</w:t>
-      </w:r>
-    </w:p>
-    <w:p>
-      <w:pPr>
-        <w:keepNext/>
-        <w:spacing w:after="60" w:before="120"/>
-        <w:jc w:val="center"/>
-      </w:pPr>
-      <w:r>
-        <w:drawing>
-          <wp:inline distT="0" distB="0" distL="0" distR="0">
-            <wp:extent cx="5715000" cy="1743075"/>
-            <wp:effectExtent t="0" r="0" b="0" l="0"/>
-            <wp:docPr id="1" name="dyn_live_0.png" descr="Live, dynamic run: frequency of the centre of inertia, lowest frequency so far and rotor angle spread next to the usual figures." title="Live, dynamic run: frequency of the centre of inertia, lowest frequency so far and rotor angle spread next to the usual figures."/>
-            <wp:cNvGraphicFramePr>
-              <a:graphicFrameLocks xmlns:a="http://schemas.openxmlformats.org/drawingml/2006/main" noChangeAspect="1"/>
-            </wp:cNvGraphicFramePr>
-            <a:graphic xmlns:a="http://schemas.openxmlformats.org/drawingml/2006/main">
-              <a:graphicData uri="http://schemas.openxmlformats.org/drawingml/2006/picture">
-                <pic:pic xmlns:pic="http://schemas.openxmlformats.org/drawingml/2006/picture">
-                  <pic:nvPicPr>
-                    <pic:cNvPr id="0" name="" descr=""/>
-                    <pic:cNvPicPr>
-                      <a:picLocks noChangeAspect="1" noChangeArrowheads="1"/>
-                    </pic:cNvPicPr>
-                  </pic:nvPicPr>
-                  <pic:blipFill>
-                    <a:blip r:embed="rId22" cstate="none"/>
-                    <a:srcRect/>
-                    <a:stretch>
-                      <a:fillRect/>
-                    </a:stretch>
-                  </pic:blipFill>
-                  <pic:spPr bwMode="auto">
-                    <a:xfrm>
-                      <a:off x="0" y="0"/>
-                      <a:ext cx="5715000" cy="1743075"/>
-                    </a:xfrm>
-                    <a:prstGeom prst="rect">
-                      <a:avLst/>
-                    </a:prstGeom>
-                  </pic:spPr>
-                </pic:pic>
-              </a:graphicData>
-            </a:graphic>
-          </wp:inline>
-        </w:drawing>
-      </w:r>
-    </w:p>
-    <w:p>
-      <w:pPr>
-        <w:spacing w:after="200"/>
-        <w:jc w:val="center"/>
-      </w:pPr>
-      <w:r>
-        <w:rPr>
-          <w:b/>
-          <w:bCs/>
-          <w:color w:val="455A64"/>
-          <w:sz w:val="18"/>
-          <w:szCs w:val="18"/>
-        </w:rPr>
-        <w:t xml:space="preserve">Figure 14. </w:t>
-      </w:r>
-      <w:r>
-        <w:rPr>
-          <w:i/>
-          <w:iCs/>
-          <w:color w:val="455A64"/>
-          <w:sz w:val="18"/>
-          <w:szCs w:val="18"/>
-        </w:rPr>
-        <w:t xml:space="preserve">Live, dynamic run: frequency of the centre of inertia, lowest frequency so far and rotor angle spread next to the usual figures.</w:t>
-      </w:r>
-    </w:p>
-    <w:p>
-      <w:pPr>
-        <w:keepNext/>
-        <w:spacing w:after="60" w:before="120"/>
-        <w:jc w:val="center"/>
-      </w:pPr>
-      <w:r>
-        <w:drawing>
-          <wp:inline distT="0" distB="0" distL="0" distR="0">
-            <wp:extent cx="5715000" cy="2552700"/>
-            <wp:effectExtent t="0" r="0" b="0" l="0"/>
-            <wp:docPr id="1" name="dyn_live_1.png" descr="Live charts at 9.3 s: the fault at 3 s pulls bus 36 down to 0.56 pu; the exciters overshoot; frequency and rotor angles swing and settle." title="Live charts at 9.3 s: the fault at 3 s pulls bus 36 down to 0.56 pu; the exciters overshoot; frequency and rotor angles swing and settle."/>
             <wp:cNvGraphicFramePr>
               <a:graphicFrameLocks xmlns:a="http://schemas.openxmlformats.org/drawingml/2006/main" noChangeAspect="1"/>
             </wp:cNvGraphicFramePr>
@@ -16786,7 +17332,7 @@
                   <pic:spPr bwMode="auto">
                     <a:xfrm>
                       <a:off x="0" y="0"/>
-                      <a:ext cx="5715000" cy="2552700"/>
+                      <a:ext cx="5715000" cy="762000"/>
                     </a:xfrm>
                     <a:prstGeom prst="rect">
                       <a:avLst/>
@@ -16822,7 +17368,179 @@
           <w:sz w:val="18"/>
           <w:szCs w:val="18"/>
         </w:rPr>
-        <w:t xml:space="preserve">Live charts at 9.3 s: the fault at 3 s pulls bus 36 down to 0.56 pu; the exciters overshoot; frequency and rotor angles swing and settle.</w:t>
+        <w:t xml:space="preserve">Commands and events of the run.</w:t>
+      </w:r>
+    </w:p>
+    <w:p>
+      <w:pPr>
+        <w:pStyle w:val="Heading2"/>
+      </w:pPr>
+      <w:r>
+        <w:t xml:space="preserve">6.9 Dynamic simulation runs</w:t>
+      </w:r>
+    </w:p>
+    <w:p>
+      <w:pPr>
+        <w:spacing w:after="120" w:line="288"/>
+      </w:pPr>
+      <w:r>
+        <w:t xml:space="preserve">A scenario with </w:t>
+      </w:r>
+      <w:r>
+        <w:rPr>
+          <w:rFonts w:ascii="Consolas" w:cs="Consolas" w:eastAsia="Consolas" w:hAnsi="Consolas"/>
+          <w:color w:val="37474F"/>
+          <w:sz w:val="19"/>
+          <w:szCs w:val="19"/>
+        </w:rPr>
+        <w:t xml:space="preserve">mode: dynamic</w:t>
+      </w:r>
+      <w:r>
+        <w:t xml:space="preserve"> uses the same pages. Below, a file with two IEEE 39 experiments (a 100 ms fault at bus 16 and the trip of generator 32, both at 3 s) was uploaded; both ran at the same time. The Live page adds the system frequency, the lowest frequency so far and the rotor angle spread, and two charts.</w:t>
+      </w:r>
+    </w:p>
+    <w:p>
+      <w:pPr>
+        <w:shd w:fill="F1F4F6" w:color="auto" w:val="clear"/>
+        <w:spacing w:after="0" w:before="60" w:line="252"/>
+        <w:ind w:left="120" w:right="120"/>
+      </w:pPr>
+      <w:r>
+        <w:rPr>
+          <w:rFonts w:ascii="Consolas" w:cs="Consolas" w:eastAsia="Consolas" w:hAnsi="Consolas"/>
+          <w:color w:val="263238"/>
+          <w:sz w:val="18"/>
+          <w:szCs w:val="18"/>
+        </w:rPr>
+        <w:t xml:space="preserve">grid: ieee39</w:t>
+      </w:r>
+    </w:p>
+    <w:p>
+      <w:pPr>
+        <w:shd w:fill="F1F4F6" w:color="auto" w:val="clear"/>
+        <w:spacing w:after="0" w:before="0" w:line="252"/>
+        <w:ind w:left="120" w:right="120"/>
+      </w:pPr>
+      <w:r>
+        <w:rPr>
+          <w:rFonts w:ascii="Consolas" w:cs="Consolas" w:eastAsia="Consolas" w:hAnsi="Consolas"/>
+          <w:color w:val="263238"/>
+          <w:sz w:val="18"/>
+          <w:szCs w:val="18"/>
+        </w:rPr>
+        <w:t xml:space="preserve">mode: dynamic</w:t>
+      </w:r>
+    </w:p>
+    <w:p>
+      <w:pPr>
+        <w:shd w:fill="F1F4F6" w:color="auto" w:val="clear"/>
+        <w:spacing w:after="0" w:before="0" w:line="252"/>
+        <w:ind w:left="120" w:right="120"/>
+      </w:pPr>
+      <w:r>
+        <w:rPr>
+          <w:rFonts w:ascii="Consolas" w:cs="Consolas" w:eastAsia="Consolas" w:hAnsi="Consolas"/>
+          <w:color w:val="263238"/>
+          <w:sz w:val="18"/>
+          <w:szCs w:val="18"/>
+        </w:rPr>
+        <w:t xml:space="preserve">duration: 15</w:t>
+      </w:r>
+    </w:p>
+    <w:p>
+      <w:pPr>
+        <w:shd w:fill="F1F4F6" w:color="auto" w:val="clear"/>
+        <w:spacing w:after="0" w:before="0" w:line="252"/>
+        <w:ind w:left="120" w:right="120"/>
+      </w:pPr>
+      <w:r>
+        <w:rPr>
+          <w:rFonts w:ascii="Consolas" w:cs="Consolas" w:eastAsia="Consolas" w:hAnsi="Consolas"/>
+          <w:color w:val="263238"/>
+          <w:sz w:val="18"/>
+          <w:szCs w:val="18"/>
+        </w:rPr>
+        <w:t xml:space="preserve">mpi_np: 1</w:t>
+      </w:r>
+    </w:p>
+    <w:p>
+      <w:pPr>
+        <w:shd w:fill="F1F4F6" w:color="auto" w:val="clear"/>
+        <w:spacing w:after="0" w:before="0" w:line="252"/>
+        <w:ind w:left="120" w:right="120"/>
+      </w:pPr>
+      <w:r>
+        <w:rPr>
+          <w:rFonts w:ascii="Consolas" w:cs="Consolas" w:eastAsia="Consolas" w:hAnsi="Consolas"/>
+          <w:color w:val="263238"/>
+          <w:sz w:val="18"/>
+          <w:szCs w:val="18"/>
+        </w:rPr>
+        <w:t xml:space="preserve">scenarios:</w:t>
+      </w:r>
+    </w:p>
+    <w:p>
+      <w:pPr>
+        <w:shd w:fill="F1F4F6" w:color="auto" w:val="clear"/>
+        <w:spacing w:after="0" w:before="0" w:line="252"/>
+        <w:ind w:left="120" w:right="120"/>
+      </w:pPr>
+      <w:r>
+        <w:rPr>
+          <w:rFonts w:ascii="Consolas" w:cs="Consolas" w:eastAsia="Consolas" w:hAnsi="Consolas"/>
+          <w:color w:val="263238"/>
+          <w:sz w:val="18"/>
+          <w:szCs w:val="18"/>
+        </w:rPr>
+        <w:t xml:space="preserve">  - name: ieee39-dyn-fault</w:t>
+      </w:r>
+    </w:p>
+    <w:p>
+      <w:pPr>
+        <w:shd w:fill="F1F4F6" w:color="auto" w:val="clear"/>
+        <w:spacing w:after="0" w:before="0" w:line="252"/>
+        <w:ind w:left="120" w:right="120"/>
+      </w:pPr>
+      <w:r>
+        <w:rPr>
+          <w:rFonts w:ascii="Consolas" w:cs="Consolas" w:eastAsia="Consolas" w:hAnsi="Consolas"/>
+          <w:color w:val="263238"/>
+          <w:sz w:val="18"/>
+          <w:szCs w:val="18"/>
+        </w:rPr>
+        <w:t xml:space="preserve">    event: {type: bus_fault, bus: 16, duration: 0.1, t: 3}</w:t>
+      </w:r>
+    </w:p>
+    <w:p>
+      <w:pPr>
+        <w:shd w:fill="F1F4F6" w:color="auto" w:val="clear"/>
+        <w:spacing w:after="0" w:before="0" w:line="252"/>
+        <w:ind w:left="120" w:right="120"/>
+      </w:pPr>
+      <w:r>
+        <w:rPr>
+          <w:rFonts w:ascii="Consolas" w:cs="Consolas" w:eastAsia="Consolas" w:hAnsi="Consolas"/>
+          <w:color w:val="263238"/>
+          <w:sz w:val="18"/>
+          <w:szCs w:val="18"/>
+        </w:rPr>
+        <w:t xml:space="preserve">  - name: ieee39-dyn-gentrip</w:t>
+      </w:r>
+    </w:p>
+    <w:p>
+      <w:pPr>
+        <w:shd w:fill="F1F4F6" w:color="auto" w:val="clear"/>
+        <w:spacing w:after="160" w:before="0" w:line="252"/>
+        <w:ind w:left="120" w:right="120"/>
+      </w:pPr>
+      <w:r>
+        <w:rPr>
+          <w:rFonts w:ascii="Consolas" w:cs="Consolas" w:eastAsia="Consolas" w:hAnsi="Consolas"/>
+          <w:color w:val="263238"/>
+          <w:sz w:val="18"/>
+          <w:szCs w:val="18"/>
+        </w:rPr>
+        <w:t xml:space="preserve">    event: {type: gen_trip, bus: 32, t: 3}</w:t>
       </w:r>
     </w:p>
     <w:p>
@@ -16834,9 +17552,9 @@
       <w:r>
         <w:drawing>
           <wp:inline distT="0" distB="0" distL="0" distR="0">
-            <wp:extent cx="5715000" cy="2057400"/>
+            <wp:extent cx="5715000" cy="1743075"/>
             <wp:effectExtent t="0" r="0" b="0" l="0"/>
-            <wp:docPr id="1" name="dyn_res_1.png" descr="Results summary of the fault run: frequency range, final frequency, largest rotor angle spread, machine data and integration step." title="Results summary of the fault run: frequency range, final frequency, largest rotor angle spread, machine data and integration step."/>
+            <wp:docPr id="1" name="dyn_live_0.png" descr="Live, dynamic run: frequency of the centre of inertia, lowest frequency so far and rotor angle spread next to the usual figures." title="Live, dynamic run: frequency of the centre of inertia, lowest frequency so far and rotor angle spread next to the usual figures."/>
             <wp:cNvGraphicFramePr>
               <a:graphicFrameLocks xmlns:a="http://schemas.openxmlformats.org/drawingml/2006/main" noChangeAspect="1"/>
             </wp:cNvGraphicFramePr>
@@ -16859,7 +17577,7 @@
                   <pic:spPr bwMode="auto">
                     <a:xfrm>
                       <a:off x="0" y="0"/>
-                      <a:ext cx="5715000" cy="2057400"/>
+                      <a:ext cx="5715000" cy="1743075"/>
                     </a:xfrm>
                     <a:prstGeom prst="rect">
                       <a:avLst/>
@@ -16895,7 +17613,7 @@
           <w:sz w:val="18"/>
           <w:szCs w:val="18"/>
         </w:rPr>
-        <w:t xml:space="preserve">Results summary of the fault run: frequency range, final frequency, largest rotor angle spread, machine data and integration step.</w:t>
+        <w:t xml:space="preserve">Live, dynamic run: frequency of the centre of inertia, lowest frequency so far and rotor angle spread next to the usual figures.</w:t>
       </w:r>
     </w:p>
     <w:p>
@@ -16907,9 +17625,9 @@
       <w:r>
         <w:drawing>
           <wp:inline distT="0" distB="0" distL="0" distR="0">
-            <wp:extent cx="5715000" cy="3476625"/>
+            <wp:extent cx="5715000" cy="2552700"/>
             <wp:effectExtent t="0" r="0" b="0" l="0"/>
-            <wp:docPr id="1" name="dyn_res_2.png" descr="Results charts of the generator trip: frequency falls to 59.42 Hz and is arrested by the governors; GridPACK needs about 14 ms per frame on one rank." title="Results charts of the generator trip: frequency falls to 59.42 Hz and is arrested by the governors; GridPACK needs about 14 ms per frame on one rank."/>
+            <wp:docPr id="1" name="dyn_live_1.png" descr="Live charts at 9.3 s: the fault at 3 s pulls bus 36 down to 0.56 pu; the exciters overshoot; frequency and rotor angles swing and settle." title="Live charts at 9.3 s: the fault at 3 s pulls bus 36 down to 0.56 pu; the exciters overshoot; frequency and rotor angles swing and settle."/>
             <wp:cNvGraphicFramePr>
               <a:graphicFrameLocks xmlns:a="http://schemas.openxmlformats.org/drawingml/2006/main" noChangeAspect="1"/>
             </wp:cNvGraphicFramePr>
@@ -16932,7 +17650,7 @@
                   <pic:spPr bwMode="auto">
                     <a:xfrm>
                       <a:off x="0" y="0"/>
-                      <a:ext cx="5715000" cy="3476625"/>
+                      <a:ext cx="5715000" cy="2552700"/>
                     </a:xfrm>
                     <a:prstGeom prst="rect">
                       <a:avLst/>
@@ -16968,33 +17686,7 @@
           <w:sz w:val="18"/>
           <w:szCs w:val="18"/>
         </w:rPr>
-        <w:t xml:space="preserve">Results charts of the generator trip: frequency falls to 59.42 Hz and is arrested by the governors; GridPACK needs about 14 ms per frame on one rank.</w:t>
-      </w:r>
-    </w:p>
-    <w:p>
-      <w:pPr>
-        <w:pStyle w:val="Heading2"/>
-      </w:pPr>
-      <w:r>
-        <w:t xml:space="preserve">6.8 IEEE 14 console (original prototype)</w:t>
-      </w:r>
-    </w:p>
-    <w:p>
-      <w:pPr>
-        <w:spacing w:after="120" w:line="288"/>
-      </w:pPr>
-      <w:r>
-        <w:t xml:space="preserve">The original single-PMU IEEE 14 demonstration is kept as a page of its own. Set latency, loss, a bus to drop or the FDI switch and press </w:t>
-      </w:r>
-      <w:r>
-        <w:rPr>
-          <w:i/>
-          <w:iCs/>
-        </w:rPr>
-        <w:t xml:space="preserve">Run scenario</w:t>
-      </w:r>
-      <w:r>
-        <w:t xml:space="preserve">; the console updates in about 15 seconds.</w:t>
+        <w:t xml:space="preserve">Live charts at 9.3 s: the fault at 3 s pulls bus 36 down to 0.56 pu; the exciters overshoot; frequency and rotor angles swing and settle.</w:t>
       </w:r>
     </w:p>
     <w:p>
@@ -17006,9 +17698,9 @@
       <w:r>
         <w:drawing>
           <wp:inline distT="0" distB="0" distL="0" distR="0">
-            <wp:extent cx="5715000" cy="714375"/>
+            <wp:extent cx="5715000" cy="2057400"/>
             <wp:effectExtent t="0" r="0" b="0" l="0"/>
-            <wp:docPr id="1" name="con_0.png" descr="Run Scenario panel of the IEEE 14 console." title="Run Scenario panel of the IEEE 14 console."/>
+            <wp:docPr id="1" name="dyn_res_1.png" descr="Results summary of the fault run: frequency range, final frequency, largest rotor angle spread, machine data and integration step." title="Results summary of the fault run: frequency range, final frequency, largest rotor angle spread, machine data and integration step."/>
             <wp:cNvGraphicFramePr>
               <a:graphicFrameLocks xmlns:a="http://schemas.openxmlformats.org/drawingml/2006/main" noChangeAspect="1"/>
             </wp:cNvGraphicFramePr>
@@ -17031,7 +17723,7 @@
                   <pic:spPr bwMode="auto">
                     <a:xfrm>
                       <a:off x="0" y="0"/>
-                      <a:ext cx="5715000" cy="714375"/>
+                      <a:ext cx="5715000" cy="2057400"/>
                     </a:xfrm>
                     <a:prstGeom prst="rect">
                       <a:avLst/>
@@ -17067,7 +17759,7 @@
           <w:sz w:val="18"/>
           <w:szCs w:val="18"/>
         </w:rPr>
-        <w:t xml:space="preserve">Run Scenario panel of the IEEE 14 console.</w:t>
+        <w:t xml:space="preserve">Results summary of the fault run: frequency range, final frequency, largest rotor angle spread, machine data and integration step.</w:t>
       </w:r>
     </w:p>
     <w:p>
@@ -17079,9 +17771,9 @@
       <w:r>
         <w:drawing>
           <wp:inline distT="0" distB="0" distL="0" distR="0">
-            <wp:extent cx="5715000" cy="1905000"/>
+            <wp:extent cx="5715000" cy="3476625"/>
             <wp:effectExtent t="0" r="0" b="0" l="0"/>
-            <wp:docPr id="1" name="con_2.png" descr="End-to-end network delay per bus. The voltage chart beside it loads its chart library from the internet and stays empty on servers without internet access." title="End-to-end network delay per bus. The voltage chart beside it loads its chart library from the internet and stays empty on servers without internet access."/>
+            <wp:docPr id="1" name="dyn_res_2.png" descr="Results charts of the generator trip: frequency falls to 59.42 Hz and is arrested by the governors; GridPACK needs about 14 ms per frame on one rank." title="Results charts of the generator trip: frequency falls to 59.42 Hz and is arrested by the governors; GridPACK needs about 14 ms per frame on one rank."/>
             <wp:cNvGraphicFramePr>
               <a:graphicFrameLocks xmlns:a="http://schemas.openxmlformats.org/drawingml/2006/main" noChangeAspect="1"/>
             </wp:cNvGraphicFramePr>
@@ -17104,7 +17796,7 @@
                   <pic:spPr bwMode="auto">
                     <a:xfrm>
                       <a:off x="0" y="0"/>
-                      <a:ext cx="5715000" cy="1905000"/>
+                      <a:ext cx="5715000" cy="3476625"/>
                     </a:xfrm>
                     <a:prstGeom prst="rect">
                       <a:avLst/>
@@ -17140,7 +17832,33 @@
           <w:sz w:val="18"/>
           <w:szCs w:val="18"/>
         </w:rPr>
-        <w:t xml:space="preserve">End-to-end network delay per bus. The voltage chart beside it loads its chart library from the internet and stays empty on servers without internet access.</w:t>
+        <w:t xml:space="preserve">Results charts of the generator trip: frequency falls to 59.42 Hz and is arrested by the governors; GridPACK needs about 14 ms per frame on one rank.</w:t>
+      </w:r>
+    </w:p>
+    <w:p>
+      <w:pPr>
+        <w:pStyle w:val="Heading2"/>
+      </w:pPr>
+      <w:r>
+        <w:t xml:space="preserve">6.10 IEEE 14 console (original prototype)</w:t>
+      </w:r>
+    </w:p>
+    <w:p>
+      <w:pPr>
+        <w:spacing w:after="120" w:line="288"/>
+      </w:pPr>
+      <w:r>
+        <w:t xml:space="preserve">The original single-PMU IEEE 14 demonstration is kept as a page of its own. Set latency, loss, a bus to drop or the FDI switch and press </w:t>
+      </w:r>
+      <w:r>
+        <w:rPr>
+          <w:i/>
+          <w:iCs/>
+        </w:rPr>
+        <w:t xml:space="preserve">Run scenario</w:t>
+      </w:r>
+      <w:r>
+        <w:t xml:space="preserve">; the console updates in about 15 seconds.</w:t>
       </w:r>
     </w:p>
     <w:p>
@@ -17152,9 +17870,9 @@
       <w:r>
         <w:drawing>
           <wp:inline distT="0" distB="0" distL="0" distR="0">
-            <wp:extent cx="3429000" cy="2686050"/>
+            <wp:extent cx="5715000" cy="714375"/>
             <wp:effectExtent t="0" r="0" b="0" l="0"/>
-            <wp:docPr id="1" name="con_3.png" descr="Network performance and delivery gauge." title="Network performance and delivery gauge."/>
+            <wp:docPr id="1" name="con_0.png" descr="Run Scenario panel of the IEEE 14 console." title="Run Scenario panel of the IEEE 14 console."/>
             <wp:cNvGraphicFramePr>
               <a:graphicFrameLocks xmlns:a="http://schemas.openxmlformats.org/drawingml/2006/main" noChangeAspect="1"/>
             </wp:cNvGraphicFramePr>
@@ -17177,7 +17895,7 @@
                   <pic:spPr bwMode="auto">
                     <a:xfrm>
                       <a:off x="0" y="0"/>
-                      <a:ext cx="3429000" cy="2686050"/>
+                      <a:ext cx="5715000" cy="714375"/>
                     </a:xfrm>
                     <a:prstGeom prst="rect">
                       <a:avLst/>
@@ -17213,7 +17931,7 @@
           <w:sz w:val="18"/>
           <w:szCs w:val="18"/>
         </w:rPr>
-        <w:t xml:space="preserve">Network performance and delivery gauge.</w:t>
+        <w:t xml:space="preserve">Run Scenario panel of the IEEE 14 console.</w:t>
       </w:r>
     </w:p>
     <w:p>
@@ -17225,9 +17943,9 @@
       <w:r>
         <w:drawing>
           <wp:inline distT="0" distB="0" distL="0" distR="0">
-            <wp:extent cx="3429000" cy="2686050"/>
+            <wp:extent cx="5715000" cy="1905000"/>
             <wp:effectExtent t="0" r="0" b="0" l="0"/>
-            <wp:docPr id="1" name="con_4.png" descr="Per-bus measurement table: true and received voltage, delay and status." title="Per-bus measurement table: true and received voltage, delay and status."/>
+            <wp:docPr id="1" name="con_2.png" descr="End-to-end network delay per bus. The voltage chart beside it loads its chart library from the internet and stays empty on servers without internet access." title="End-to-end network delay per bus. The voltage chart beside it loads its chart library from the internet and stays empty on servers without internet access."/>
             <wp:cNvGraphicFramePr>
               <a:graphicFrameLocks xmlns:a="http://schemas.openxmlformats.org/drawingml/2006/main" noChangeAspect="1"/>
             </wp:cNvGraphicFramePr>
@@ -17250,7 +17968,7 @@
                   <pic:spPr bwMode="auto">
                     <a:xfrm>
                       <a:off x="0" y="0"/>
-                      <a:ext cx="3429000" cy="2686050"/>
+                      <a:ext cx="5715000" cy="1905000"/>
                     </a:xfrm>
                     <a:prstGeom prst="rect">
                       <a:avLst/>
@@ -17286,43 +18004,7 @@
           <w:sz w:val="18"/>
           <w:szCs w:val="18"/>
         </w:rPr>
-        <w:t xml:space="preserve">Per-bus measurement table: true and received voltage, delay and status.</w:t>
-      </w:r>
-    </w:p>
-    <w:p>
-      <w:pPr>
-        <w:pStyle w:val="Heading2"/>
-      </w:pPr>
-      <w:r>
-        <w:t xml:space="preserve">6.9 Node-RED editor</w:t>
-      </w:r>
-    </w:p>
-    <w:p>
-      <w:pPr>
-        <w:spacing w:after="120" w:line="288"/>
-      </w:pPr>
-      <w:r>
-        <w:t xml:space="preserve">Administrators can change the dashboard in the Node-RED editor without programming: the </w:t>
-      </w:r>
-      <w:r>
-        <w:rPr>
-          <w:i/>
-          <w:iCs/>
-        </w:rPr>
-        <w:t xml:space="preserve">CPS Cluster</w:t>
-      </w:r>
-      <w:r>
-        <w:t xml:space="preserve"> tab holds the Experiments, Live and Results pages, the </w:t>
-      </w:r>
-      <w:r>
-        <w:rPr>
-          <w:i/>
-          <w:iCs/>
-        </w:rPr>
-        <w:t xml:space="preserve">CPS Testbed Console</w:t>
-      </w:r>
-      <w:r>
-        <w:t xml:space="preserve"> tab the IEEE 14 console.</w:t>
+        <w:t xml:space="preserve">End-to-end network delay per bus. The voltage chart beside it loads its chart library from the internet and stays empty on servers without internet access.</w:t>
       </w:r>
     </w:p>
     <w:p>
@@ -17334,9 +18016,9 @@
       <w:r>
         <w:drawing>
           <wp:inline distT="0" distB="0" distL="0" distR="0">
-            <wp:extent cx="5715000" cy="3571875"/>
+            <wp:extent cx="3429000" cy="2686050"/>
             <wp:effectExtent t="0" r="0" b="0" l="0"/>
-            <wp:docPr id="1" name="editor.png" descr="The CPS Cluster flow in the Node-RED editor." title="The CPS Cluster flow in the Node-RED editor."/>
+            <wp:docPr id="1" name="con_3.png" descr="Network performance and delivery gauge." title="Network performance and delivery gauge."/>
             <wp:cNvGraphicFramePr>
               <a:graphicFrameLocks xmlns:a="http://schemas.openxmlformats.org/drawingml/2006/main" noChangeAspect="1"/>
             </wp:cNvGraphicFramePr>
@@ -17359,6 +18041,188 @@
                   <pic:spPr bwMode="auto">
                     <a:xfrm>
                       <a:off x="0" y="0"/>
+                      <a:ext cx="3429000" cy="2686050"/>
+                    </a:xfrm>
+                    <a:prstGeom prst="rect">
+                      <a:avLst/>
+                    </a:prstGeom>
+                  </pic:spPr>
+                </pic:pic>
+              </a:graphicData>
+            </a:graphic>
+          </wp:inline>
+        </w:drawing>
+      </w:r>
+    </w:p>
+    <w:p>
+      <w:pPr>
+        <w:spacing w:after="200"/>
+        <w:jc w:val="center"/>
+      </w:pPr>
+      <w:r>
+        <w:rPr>
+          <w:b/>
+          <w:bCs/>
+          <w:color w:val="455A64"/>
+          <w:sz w:val="18"/>
+          <w:szCs w:val="18"/>
+        </w:rPr>
+        <w:t xml:space="preserve">Figure 22. </w:t>
+      </w:r>
+      <w:r>
+        <w:rPr>
+          <w:i/>
+          <w:iCs/>
+          <w:color w:val="455A64"/>
+          <w:sz w:val="18"/>
+          <w:szCs w:val="18"/>
+        </w:rPr>
+        <w:t xml:space="preserve">Network performance and delivery gauge.</w:t>
+      </w:r>
+    </w:p>
+    <w:p>
+      <w:pPr>
+        <w:keepNext/>
+        <w:spacing w:after="60" w:before="120"/>
+        <w:jc w:val="center"/>
+      </w:pPr>
+      <w:r>
+        <w:drawing>
+          <wp:inline distT="0" distB="0" distL="0" distR="0">
+            <wp:extent cx="3429000" cy="2686050"/>
+            <wp:effectExtent t="0" r="0" b="0" l="0"/>
+            <wp:docPr id="1" name="con_4.png" descr="Per-bus measurement table: true and received voltage, delay and status." title="Per-bus measurement table: true and received voltage, delay and status."/>
+            <wp:cNvGraphicFramePr>
+              <a:graphicFrameLocks xmlns:a="http://schemas.openxmlformats.org/drawingml/2006/main" noChangeAspect="1"/>
+            </wp:cNvGraphicFramePr>
+            <a:graphic xmlns:a="http://schemas.openxmlformats.org/drawingml/2006/main">
+              <a:graphicData uri="http://schemas.openxmlformats.org/drawingml/2006/picture">
+                <pic:pic xmlns:pic="http://schemas.openxmlformats.org/drawingml/2006/picture">
+                  <pic:nvPicPr>
+                    <pic:cNvPr id="0" name="" descr=""/>
+                    <pic:cNvPicPr>
+                      <a:picLocks noChangeAspect="1" noChangeArrowheads="1"/>
+                    </pic:cNvPicPr>
+                  </pic:nvPicPr>
+                  <pic:blipFill>
+                    <a:blip r:embed="rId31" cstate="none"/>
+                    <a:srcRect/>
+                    <a:stretch>
+                      <a:fillRect/>
+                    </a:stretch>
+                  </pic:blipFill>
+                  <pic:spPr bwMode="auto">
+                    <a:xfrm>
+                      <a:off x="0" y="0"/>
+                      <a:ext cx="3429000" cy="2686050"/>
+                    </a:xfrm>
+                    <a:prstGeom prst="rect">
+                      <a:avLst/>
+                    </a:prstGeom>
+                  </pic:spPr>
+                </pic:pic>
+              </a:graphicData>
+            </a:graphic>
+          </wp:inline>
+        </w:drawing>
+      </w:r>
+    </w:p>
+    <w:p>
+      <w:pPr>
+        <w:spacing w:after="200"/>
+        <w:jc w:val="center"/>
+      </w:pPr>
+      <w:r>
+        <w:rPr>
+          <w:b/>
+          <w:bCs/>
+          <w:color w:val="455A64"/>
+          <w:sz w:val="18"/>
+          <w:szCs w:val="18"/>
+        </w:rPr>
+        <w:t xml:space="preserve">Figure 23. </w:t>
+      </w:r>
+      <w:r>
+        <w:rPr>
+          <w:i/>
+          <w:iCs/>
+          <w:color w:val="455A64"/>
+          <w:sz w:val="18"/>
+          <w:szCs w:val="18"/>
+        </w:rPr>
+        <w:t xml:space="preserve">Per-bus measurement table: true and received voltage, delay and status.</w:t>
+      </w:r>
+    </w:p>
+    <w:p>
+      <w:pPr>
+        <w:pStyle w:val="Heading2"/>
+      </w:pPr>
+      <w:r>
+        <w:t xml:space="preserve">6.11 Node-RED editor</w:t>
+      </w:r>
+    </w:p>
+    <w:p>
+      <w:pPr>
+        <w:spacing w:after="120" w:line="288"/>
+      </w:pPr>
+      <w:r>
+        <w:t xml:space="preserve">Administrators can change the dashboard in the Node-RED editor without programming: the </w:t>
+      </w:r>
+      <w:r>
+        <w:rPr>
+          <w:i/>
+          <w:iCs/>
+        </w:rPr>
+        <w:t xml:space="preserve">CPS Cluster</w:t>
+      </w:r>
+      <w:r>
+        <w:t xml:space="preserve"> tab holds the Experiments, Live and Results pages, the </w:t>
+      </w:r>
+      <w:r>
+        <w:rPr>
+          <w:i/>
+          <w:iCs/>
+        </w:rPr>
+        <w:t xml:space="preserve">CPS Testbed Console</w:t>
+      </w:r>
+      <w:r>
+        <w:t xml:space="preserve"> tab the IEEE 14 console.</w:t>
+      </w:r>
+    </w:p>
+    <w:p>
+      <w:pPr>
+        <w:keepNext/>
+        <w:spacing w:after="60" w:before="120"/>
+        <w:jc w:val="center"/>
+      </w:pPr>
+      <w:r>
+        <w:drawing>
+          <wp:inline distT="0" distB="0" distL="0" distR="0">
+            <wp:extent cx="5715000" cy="3571875"/>
+            <wp:effectExtent t="0" r="0" b="0" l="0"/>
+            <wp:docPr id="1" name="editor.png" descr="The CPS Cluster flow in the Node-RED editor." title="The CPS Cluster flow in the Node-RED editor."/>
+            <wp:cNvGraphicFramePr>
+              <a:graphicFrameLocks xmlns:a="http://schemas.openxmlformats.org/drawingml/2006/main" noChangeAspect="1"/>
+            </wp:cNvGraphicFramePr>
+            <a:graphic xmlns:a="http://schemas.openxmlformats.org/drawingml/2006/main">
+              <a:graphicData uri="http://schemas.openxmlformats.org/drawingml/2006/picture">
+                <pic:pic xmlns:pic="http://schemas.openxmlformats.org/drawingml/2006/picture">
+                  <pic:nvPicPr>
+                    <pic:cNvPr id="0" name="" descr=""/>
+                    <pic:cNvPicPr>
+                      <a:picLocks noChangeAspect="1" noChangeArrowheads="1"/>
+                    </pic:cNvPicPr>
+                  </pic:nvPicPr>
+                  <pic:blipFill>
+                    <a:blip r:embed="rId32" cstate="none"/>
+                    <a:srcRect/>
+                    <a:stretch>
+                      <a:fillRect/>
+                    </a:stretch>
+                  </pic:blipFill>
+                  <pic:spPr bwMode="auto">
+                    <a:xfrm>
+                      <a:off x="0" y="0"/>
                       <a:ext cx="5715000" cy="3571875"/>
                     </a:xfrm>
                     <a:prstGeom prst="rect">
@@ -17385,7 +18249,7 @@
           <w:sz w:val="18"/>
           <w:szCs w:val="18"/>
         </w:rPr>
-        <w:t xml:space="preserve">Figure 22. </w:t>
+        <w:t xml:space="preserve">Figure 24. </w:t>
       </w:r>
       <w:r>
         <w:rPr>
@@ -17403,7 +18267,7 @@
         <w:pStyle w:val="Heading2"/>
       </w:pPr>
       <w:r>
-        <w:t xml:space="preserve">6.10 API and command line</w:t>
+        <w:t xml:space="preserve">6.12 API and command line</w:t>
       </w:r>
     </w:p>
     <w:p>
@@ -20264,7 +21128,7 @@
                     </pic:cNvPicPr>
                   </pic:nvPicPr>
                   <pic:blipFill>
-                    <a:blip r:embed="rId31" cstate="none"/>
+                    <a:blip r:embed="rId33" cstate="none"/>
                     <a:srcRect/>
                     <a:stretch>
                       <a:fillRect/>
@@ -20299,7 +21163,7 @@
           <w:sz w:val="18"/>
           <w:szCs w:val="18"/>
         </w:rPr>
-        <w:t xml:space="preserve">Figure 23. </w:t>
+        <w:t xml:space="preserve">Figure 25. </w:t>
       </w:r>
       <w:r>
         <w:rPr>
@@ -20337,7 +21201,7 @@
                     </pic:cNvPicPr>
                   </pic:nvPicPr>
                   <pic:blipFill>
-                    <a:blip r:embed="rId32" cstate="none"/>
+                    <a:blip r:embed="rId34" cstate="none"/>
                     <a:srcRect/>
                     <a:stretch>
                       <a:fillRect/>
@@ -20372,7 +21236,7 @@
           <w:sz w:val="18"/>
           <w:szCs w:val="18"/>
         </w:rPr>
-        <w:t xml:space="preserve">Figure 24. </w:t>
+        <w:t xml:space="preserve">Figure 26. </w:t>
       </w:r>
       <w:r>
         <w:rPr>

</xml_diff>

<commit_message>
Inside page: what HELICS, GridPACK, NS-3 and the control center compute
A new dashboard page shows the internals of a running experiment:
- HELICS: federation diagram with each federate's node and granted time
  (broker global_time query) and messages/bytes per topic
- GridPACK: MPI ranks and the buses/branches each owns (@@RANK from
  pf_server/dsf_server), Newton-Raphson mismatch per iteration or the
  integration steps, time per step
- NS-3: per-PMU sent/delivered/late/dropped/attacked frames, latency,
  PDC sets, commands, simulator events (new ns3/status publication)
- Control center: measurements, observability, chi-square test before
  and after PMU removal, estimation time
- A plain-language log of key events and of every step

The observer gathers it in cpslib/inside.py into live.json. The
control center now reports the threshold and observability of the
first estimate together with its J. Docs and guide updated.
</commit_message>
<xml_diff>
--- a/documentation/CPS_Testbed_Cluster_Guide.docx
+++ b/documentation/CPS_Testbed_Cluster_Guide.docx
@@ -102,7 +102,7 @@
       <w:pPr>
         <w:jc w:val="center"/>
       </w:pPr>
-      <w:hyperlink w:history="1" r:id="rId5zvzkc_3s4kjeem0uoorm">
+      <w:hyperlink w:history="1" r:id="rIdgyrxx8juxxa529n3a05hy">
         <w:r>
           <w:rPr>
             <w:rStyle w:val="Hyperlink"/>
@@ -16396,7 +16396,30 @@
         <w:pStyle w:val="Heading2"/>
       </w:pPr>
       <w:r>
-        <w:t xml:space="preserve">6.8 Results page</w:t>
+        <w:t xml:space="preserve">6.8 Inside page: what the engines compute</w:t>
+      </w:r>
+    </w:p>
+    <w:p>
+      <w:pPr>
+        <w:spacing w:after="120" w:line="288"/>
+      </w:pPr>
+      <w:r>
+        <w:t xml:space="preserve">The Inside page opens the three engines while an experiment runs and shows what each one is computing, updated every second. The figures below were taken 12 s into a 30 s IEEE 118 run on the virtual cluster: an AVR fault at generator 49 at 6 s, a simple false data injection on bus 49 from 8 to 18 s, 1% packet loss and GridPACK on 2 MPI ranks.</w:t>
+      </w:r>
+    </w:p>
+    <w:p>
+      <w:pPr>
+        <w:spacing w:after="120" w:line="288"/>
+      </w:pPr>
+      <w:r>
+        <w:rPr>
+          <w:b/>
+          <w:bCs/>
+        </w:rPr>
+        <w:t xml:space="preserve">Co-simulation (HELICS).</w:t>
+      </w:r>
+      <w:r>
+        <w:t xml:space="preserve"> A diagram of the federation: each federate with the node it runs on and the simulated time the HELICS broker has granted it, and each topic with the messages and bytes exchanged so far. HELICS keeps all federates on one simulated clock; a federate is granted its next time only when the data it needs has arrived, so the granted times stay within one step of each other.</w:t>
       </w:r>
     </w:p>
     <w:p>
@@ -16408,9 +16431,9 @@
       <w:r>
         <w:drawing>
           <wp:inline distT="0" distB="0" distL="0" distR="0">
-            <wp:extent cx="5715000" cy="1800225"/>
+            <wp:extent cx="5715000" cy="2343150"/>
             <wp:effectExtent t="0" r="0" b="0" l="0"/>
-            <wp:docPr id="1" name="res_0.png" descr="Runs: one row per finished experiment; click a row to open it." title="Runs: one row per finished experiment; click a row to open it."/>
+            <wp:docPr id="1" name="inside_ihelics.png" descr="HELICS panel: grid federate on the head, NS-3 on node1, control center on node2, observer on the head, with their granted times; blue arrows carry measurements, red arrows commands, grey arrows copies for the dashboard." title="HELICS panel: grid federate on the head, NS-3 on node1, control center on node2, observer on the head, with their granted times; blue arrows carry measurements, red arrows commands, grey arrows copies for the dashboard."/>
             <wp:cNvGraphicFramePr>
               <a:graphicFrameLocks xmlns:a="http://schemas.openxmlformats.org/drawingml/2006/main" noChangeAspect="1"/>
             </wp:cNvGraphicFramePr>
@@ -16433,7 +16456,7 @@
                   <pic:spPr bwMode="auto">
                     <a:xfrm>
                       <a:off x="0" y="0"/>
-                      <a:ext cx="5715000" cy="1800225"/>
+                      <a:ext cx="5715000" cy="2343150"/>
                     </a:xfrm>
                     <a:prstGeom prst="rect">
                       <a:avLst/>
@@ -16469,7 +16492,46 @@
           <w:sz w:val="18"/>
           <w:szCs w:val="18"/>
         </w:rPr>
-        <w:t xml:space="preserve">Runs: one row per finished experiment; click a row to open it.</w:t>
+        <w:t xml:space="preserve">HELICS panel: grid federate on the head, NS-3 on node1, control center on node2, observer on the head, with their granted times; blue arrows carry measurements, red arrows commands, grey arrows copies for the dashboard.</w:t>
+      </w:r>
+    </w:p>
+    <w:p>
+      <w:pPr>
+        <w:spacing w:after="120" w:line="288"/>
+      </w:pPr>
+      <w:r>
+        <w:rPr>
+          <w:b/>
+          <w:bCs/>
+        </w:rPr>
+        <w:t xml:space="preserve">GridPACK.</w:t>
+      </w:r>
+      <w:r>
+        <w:t xml:space="preserve"> The solver (</w:t>
+      </w:r>
+      <w:r>
+        <w:rPr>
+          <w:rFonts w:ascii="Consolas" w:cs="Consolas" w:eastAsia="Consolas" w:hAnsi="Consolas"/>
+          <w:color w:val="37474F"/>
+          <w:sz w:val="19"/>
+          <w:szCs w:val="19"/>
+        </w:rPr>
+        <w:t xml:space="preserve">pf_server</w:t>
+      </w:r>
+      <w:r>
+        <w:t xml:space="preserve"> for power flow, </w:t>
+      </w:r>
+      <w:r>
+        <w:rPr>
+          <w:rFonts w:ascii="Consolas" w:cs="Consolas" w:eastAsia="Consolas" w:hAnsi="Consolas"/>
+          <w:color w:val="37474F"/>
+          <w:sz w:val="19"/>
+          <w:szCs w:val="19"/>
+        </w:rPr>
+        <w:t xml:space="preserve">dsf_server</w:t>
+      </w:r>
+      <w:r>
+        <w:t xml:space="preserve"> for dynamic simulation), the number of MPI ranks and how GridPACK partitioned the grid over them (node, buses and branches of each rank), the times of the last step and a chart of the time per step. In power flow mode the chart in the middle is the Newton-Raphson convergence of the last power flow: the largest power mismatch after each iteration on a logarithmic scale, against the tolerance of 10⁻⁶ pu. In dynamic mode the panel shows the integration steps of the frame instead (for example 7 steps of 4.76 ms).</w:t>
       </w:r>
     </w:p>
     <w:p>
@@ -16481,9 +16543,9 @@
       <w:r>
         <w:drawing>
           <wp:inline distT="0" distB="0" distL="0" distR="0">
-            <wp:extent cx="5715000" cy="1285875"/>
+            <wp:extent cx="4610100" cy="6858000"/>
             <wp:effectExtent t="0" r="0" b="0" l="0"/>
-            <wp:docPr id="1" name="res_1.png" descr="Run summary of the IEEE 118 simple FDI run, with colour-coded figures (green good, amber borderline, red problem)." title="Run summary of the IEEE 118 simple FDI run, with colour-coded figures (green good, amber borderline, red problem)."/>
+            <wp:docPr id="1" name="inside_igp.png" descr="GridPACK panel in power flow mode: 2 ranks on node1 with 58 and 60 buses; Newton-Raphson needs 4 iterations, the mismatch falls from 5.9 to 3×10⁻¹³ pu." title="GridPACK panel in power flow mode: 2 ranks on node1 with 58 and 60 buses; Newton-Raphson needs 4 iterations, the mismatch falls from 5.9 to 3×10⁻¹³ pu."/>
             <wp:cNvGraphicFramePr>
               <a:graphicFrameLocks xmlns:a="http://schemas.openxmlformats.org/drawingml/2006/main" noChangeAspect="1"/>
             </wp:cNvGraphicFramePr>
@@ -16506,6 +16568,973 @@
                   <pic:spPr bwMode="auto">
                     <a:xfrm>
                       <a:off x="0" y="0"/>
+                      <a:ext cx="4610100" cy="6858000"/>
+                    </a:xfrm>
+                    <a:prstGeom prst="rect">
+                      <a:avLst/>
+                    </a:prstGeom>
+                  </pic:spPr>
+                </pic:pic>
+              </a:graphicData>
+            </a:graphic>
+          </wp:inline>
+        </w:drawing>
+      </w:r>
+    </w:p>
+    <w:p>
+      <w:pPr>
+        <w:spacing w:after="200"/>
+        <w:jc w:val="center"/>
+      </w:pPr>
+      <w:r>
+        <w:rPr>
+          <w:b/>
+          <w:bCs/>
+          <w:color w:val="455A64"/>
+          <w:sz w:val="18"/>
+          <w:szCs w:val="18"/>
+        </w:rPr>
+        <w:t xml:space="preserve">Figure 13. </w:t>
+      </w:r>
+      <w:r>
+        <w:rPr>
+          <w:i/>
+          <w:iCs/>
+          <w:color w:val="455A64"/>
+          <w:sz w:val="18"/>
+          <w:szCs w:val="18"/>
+        </w:rPr>
+        <w:t xml:space="preserve">GridPACK panel in power flow mode: 2 ranks on node1 with 58 and 60 buses; Newton-Raphson needs 4 iterations, the mismatch falls from 5.9 to 3×10⁻¹³ pu.</w:t>
+      </w:r>
+    </w:p>
+    <w:p>
+      <w:pPr>
+        <w:keepNext/>
+        <w:spacing w:after="60" w:before="120"/>
+        <w:jc w:val="center"/>
+      </w:pPr>
+      <w:r>
+        <w:drawing>
+          <wp:inline distT="0" distB="0" distL="0" distR="0">
+            <wp:extent cx="4953000" cy="5191125"/>
+            <wp:effectExtent t="0" r="0" b="0" l="0"/>
+            <wp:docPr id="1" name="inside_dyn_igp.png" descr="GridPACK panel in dynamic mode (IEEE 39, fault at bus 16 at 3 s): 7 integration steps of 4.76 ms per PMU frame, 6-10 ms of MPI time per frame." title="GridPACK panel in dynamic mode (IEEE 39, fault at bus 16 at 3 s): 7 integration steps of 4.76 ms per PMU frame, 6-10 ms of MPI time per frame."/>
+            <wp:cNvGraphicFramePr>
+              <a:graphicFrameLocks xmlns:a="http://schemas.openxmlformats.org/drawingml/2006/main" noChangeAspect="1"/>
+            </wp:cNvGraphicFramePr>
+            <a:graphic xmlns:a="http://schemas.openxmlformats.org/drawingml/2006/main">
+              <a:graphicData uri="http://schemas.openxmlformats.org/drawingml/2006/picture">
+                <pic:pic xmlns:pic="http://schemas.openxmlformats.org/drawingml/2006/picture">
+                  <pic:nvPicPr>
+                    <pic:cNvPr id="0" name="" descr=""/>
+                    <pic:cNvPicPr>
+                      <a:picLocks noChangeAspect="1" noChangeArrowheads="1"/>
+                    </pic:cNvPicPr>
+                  </pic:nvPicPr>
+                  <pic:blipFill>
+                    <a:blip r:embed="rId22" cstate="none"/>
+                    <a:srcRect/>
+                    <a:stretch>
+                      <a:fillRect/>
+                    </a:stretch>
+                  </pic:blipFill>
+                  <pic:spPr bwMode="auto">
+                    <a:xfrm>
+                      <a:off x="0" y="0"/>
+                      <a:ext cx="4953000" cy="5191125"/>
+                    </a:xfrm>
+                    <a:prstGeom prst="rect">
+                      <a:avLst/>
+                    </a:prstGeom>
+                  </pic:spPr>
+                </pic:pic>
+              </a:graphicData>
+            </a:graphic>
+          </wp:inline>
+        </w:drawing>
+      </w:r>
+    </w:p>
+    <w:p>
+      <w:pPr>
+        <w:spacing w:after="200"/>
+        <w:jc w:val="center"/>
+      </w:pPr>
+      <w:r>
+        <w:rPr>
+          <w:b/>
+          <w:bCs/>
+          <w:color w:val="455A64"/>
+          <w:sz w:val="18"/>
+          <w:szCs w:val="18"/>
+        </w:rPr>
+        <w:t xml:space="preserve">Figure 14. </w:t>
+      </w:r>
+      <w:r>
+        <w:rPr>
+          <w:i/>
+          <w:iCs/>
+          <w:color w:val="455A64"/>
+          <w:sz w:val="18"/>
+          <w:szCs w:val="18"/>
+        </w:rPr>
+        <w:t xml:space="preserve">GridPACK panel in dynamic mode (IEEE 39, fault at bus 16 at 3 s): 7 integration steps of 4.76 ms per PMU frame, 6-10 ms of MPI time per frame.</w:t>
+      </w:r>
+    </w:p>
+    <w:p>
+      <w:pPr>
+        <w:spacing w:after="120" w:line="288"/>
+      </w:pPr>
+      <w:r>
+        <w:rPr>
+          <w:b/>
+          <w:bCs/>
+        </w:rPr>
+        <w:t xml:space="preserve">NS-3.</w:t>
+      </w:r>
+      <w:r>
+        <w:t xml:space="preserve"> Frames sent by all PMUs and the share that reached the PDC in time; late, dropped and attacked frames; PDC sets released and how many were complete; the time the PDC waited; commands sent and delivered; the attacker; and the number of events the network simulator has processed. Each PMU is a tile coloured by what happened to its frames in the last 0.5 s (hover for its counters), and a chart shows the latency of the last frame of every PMU.</w:t>
+      </w:r>
+    </w:p>
+    <w:p>
+      <w:pPr>
+        <w:keepNext/>
+        <w:spacing w:after="60" w:before="120"/>
+        <w:jc w:val="center"/>
+      </w:pPr>
+      <w:r>
+        <w:drawing>
+          <wp:inline distT="0" distB="0" distL="0" distR="0">
+            <wp:extent cx="4953000" cy="5276850"/>
+            <wp:effectExtent t="0" r="0" b="0" l="0"/>
+            <wp:docPr id="1" name="inside_ins3.png" descr="NS-3 panel: 98.9% of the frames arrive in time (1% loss: PMUs with a lost frame in the last 0.5 s are red); PMU 49 is attacked (purple); the PDC waits up to 20 ms for each set." title="NS-3 panel: 98.9% of the frames arrive in time (1% loss: PMUs with a lost frame in the last 0.5 s are red); PMU 49 is attacked (purple); the PDC waits up to 20 ms for each set."/>
+            <wp:cNvGraphicFramePr>
+              <a:graphicFrameLocks xmlns:a="http://schemas.openxmlformats.org/drawingml/2006/main" noChangeAspect="1"/>
+            </wp:cNvGraphicFramePr>
+            <a:graphic xmlns:a="http://schemas.openxmlformats.org/drawingml/2006/main">
+              <a:graphicData uri="http://schemas.openxmlformats.org/drawingml/2006/picture">
+                <pic:pic xmlns:pic="http://schemas.openxmlformats.org/drawingml/2006/picture">
+                  <pic:nvPicPr>
+                    <pic:cNvPr id="0" name="" descr=""/>
+                    <pic:cNvPicPr>
+                      <a:picLocks noChangeAspect="1" noChangeArrowheads="1"/>
+                    </pic:cNvPicPr>
+                  </pic:nvPicPr>
+                  <pic:blipFill>
+                    <a:blip r:embed="rId23" cstate="none"/>
+                    <a:srcRect/>
+                    <a:stretch>
+                      <a:fillRect/>
+                    </a:stretch>
+                  </pic:blipFill>
+                  <pic:spPr bwMode="auto">
+                    <a:xfrm>
+                      <a:off x="0" y="0"/>
+                      <a:ext cx="4953000" cy="5276850"/>
+                    </a:xfrm>
+                    <a:prstGeom prst="rect">
+                      <a:avLst/>
+                    </a:prstGeom>
+                  </pic:spPr>
+                </pic:pic>
+              </a:graphicData>
+            </a:graphic>
+          </wp:inline>
+        </w:drawing>
+      </w:r>
+    </w:p>
+    <w:p>
+      <w:pPr>
+        <w:spacing w:after="200"/>
+        <w:jc w:val="center"/>
+      </w:pPr>
+      <w:r>
+        <w:rPr>
+          <w:b/>
+          <w:bCs/>
+          <w:color w:val="455A64"/>
+          <w:sz w:val="18"/>
+          <w:szCs w:val="18"/>
+        </w:rPr>
+        <w:t xml:space="preserve">Figure 15. </w:t>
+      </w:r>
+      <w:r>
+        <w:rPr>
+          <w:i/>
+          <w:iCs/>
+          <w:color w:val="455A64"/>
+          <w:sz w:val="18"/>
+          <w:szCs w:val="18"/>
+        </w:rPr>
+        <w:t xml:space="preserve">NS-3 panel: 98.9% of the frames arrive in time (1% loss: PMUs with a lost frame in the last 0.5 s are red); PMU 49 is attacked (purple); the PDC waits up to 20 ms for each set.</w:t>
+      </w:r>
+    </w:p>
+    <w:p>
+      <w:pPr>
+        <w:spacing w:after="120" w:line="288"/>
+      </w:pPr>
+      <w:r>
+        <w:rPr>
+          <w:b/>
+          <w:bCs/>
+        </w:rPr>
+        <w:t xml:space="preserve">Control center.</w:t>
+      </w:r>
+      <w:r>
+        <w:t xml:space="preserve"> For the last measurement set: the measurements and PMUs used, whether the grid was observable, the chi-square value J against its threshold, the PMUs removed as bad data, J after the removal, the estimation time and the age of the set when it was processed. With the minimum PMU placement every PMU is needed, so a set that lost a frame leaves part of the grid unobserved; such a set cannot be tested for bad data and is skipped in the chart.</w:t>
+      </w:r>
+    </w:p>
+    <w:p>
+      <w:pPr>
+        <w:keepNext/>
+        <w:spacing w:after="60" w:before="120"/>
+        <w:jc w:val="center"/>
+      </w:pPr>
+      <w:r>
+        <w:drawing>
+          <wp:inline distT="0" distB="0" distL="0" distR="0">
+            <wp:extent cx="4953000" cy="6391275"/>
+            <wp:effectExtent t="0" r="0" b="0" l="0"/>
+            <wp:docPr id="1" name="inside_icc.png" descr="Control center panel: during the attack J is about 900 against a threshold of 138; PMU 49 is removed and J falls to 25; with the residual test and the second estimate a set takes 10-40 ms instead of about 1 ms." title="Control center panel: during the attack J is about 900 against a threshold of 138; PMU 49 is removed and J falls to 25; with the residual test and the second estimate a set takes 10-40 ms instead of about 1 ms."/>
+            <wp:cNvGraphicFramePr>
+              <a:graphicFrameLocks xmlns:a="http://schemas.openxmlformats.org/drawingml/2006/main" noChangeAspect="1"/>
+            </wp:cNvGraphicFramePr>
+            <a:graphic xmlns:a="http://schemas.openxmlformats.org/drawingml/2006/main">
+              <a:graphicData uri="http://schemas.openxmlformats.org/drawingml/2006/picture">
+                <pic:pic xmlns:pic="http://schemas.openxmlformats.org/drawingml/2006/picture">
+                  <pic:nvPicPr>
+                    <pic:cNvPr id="0" name="" descr=""/>
+                    <pic:cNvPicPr>
+                      <a:picLocks noChangeAspect="1" noChangeArrowheads="1"/>
+                    </pic:cNvPicPr>
+                  </pic:nvPicPr>
+                  <pic:blipFill>
+                    <a:blip r:embed="rId24" cstate="none"/>
+                    <a:srcRect/>
+                    <a:stretch>
+                      <a:fillRect/>
+                    </a:stretch>
+                  </pic:blipFill>
+                  <pic:spPr bwMode="auto">
+                    <a:xfrm>
+                      <a:off x="0" y="0"/>
+                      <a:ext cx="4953000" cy="6391275"/>
+                    </a:xfrm>
+                    <a:prstGeom prst="rect">
+                      <a:avLst/>
+                    </a:prstGeom>
+                  </pic:spPr>
+                </pic:pic>
+              </a:graphicData>
+            </a:graphic>
+          </wp:inline>
+        </w:drawing>
+      </w:r>
+    </w:p>
+    <w:p>
+      <w:pPr>
+        <w:spacing w:after="200"/>
+        <w:jc w:val="center"/>
+      </w:pPr>
+      <w:r>
+        <w:rPr>
+          <w:b/>
+          <w:bCs/>
+          <w:color w:val="455A64"/>
+          <w:sz w:val="18"/>
+          <w:szCs w:val="18"/>
+        </w:rPr>
+        <w:t xml:space="preserve">Figure 16. </w:t>
+      </w:r>
+      <w:r>
+        <w:rPr>
+          <w:i/>
+          <w:iCs/>
+          <w:color w:val="455A64"/>
+          <w:sz w:val="18"/>
+          <w:szCs w:val="18"/>
+        </w:rPr>
+        <w:t xml:space="preserve">Control center panel: during the attack J is about 900 against a threshold of 138; PMU 49 is removed and J falls to 25; with the residual test and the second estimate a set takes 10-40 ms instead of about 1 ms.</w:t>
+      </w:r>
+    </w:p>
+    <w:p>
+      <w:pPr>
+        <w:spacing w:after="120" w:line="288"/>
+      </w:pPr>
+      <w:r>
+        <w:rPr>
+          <w:b/>
+          <w:bCs/>
+        </w:rPr>
+        <w:t xml:space="preserve">Log.</w:t>
+      </w:r>
+      <w:r>
+        <w:t xml:space="preserve"> Everything that happens, in plain words, with the simulated time and the engine. </w:t>
+      </w:r>
+      <w:r>
+        <w:rPr>
+          <w:i/>
+          <w:iCs/>
+        </w:rPr>
+        <w:t xml:space="preserve">Key events</w:t>
+      </w:r>
+      <w:r>
+        <w:t xml:space="preserve"> holds grid events, commands from issue to application, the attacker starting and stopping, bad data alarms and the PMUs removed; </w:t>
+      </w:r>
+      <w:r>
+        <w:rPr>
+          <w:i/>
+          <w:iCs/>
+        </w:rPr>
+        <w:t xml:space="preserve">Every step</w:t>
+      </w:r>
+      <w:r>
+        <w:t xml:space="preserve"> summarises each power flow or integration and each half second of network traffic.</w:t>
+      </w:r>
+    </w:p>
+    <w:p>
+      <w:pPr>
+        <w:keepNext/>
+        <w:spacing w:after="60" w:before="120"/>
+        <w:jc w:val="center"/>
+      </w:pPr>
+      <w:r>
+        <w:drawing>
+          <wp:inline distT="0" distB="0" distL="0" distR="0">
+            <wp:extent cx="4953000" cy="6629400"/>
+            <wp:effectExtent t="0" r="0" b="0" l="0"/>
+            <wp:docPr id="1" name="inside_ilog.png" descr="Log of the run: the AVR fault at 6 s, the command for generator 49 issued at 6.067 s, delivered after 40 ms and applied at 6.5 s, the attacker at 8 s and the alarm one frame later." title="Log of the run: the AVR fault at 6 s, the command for generator 49 issued at 6.067 s, delivered after 40 ms and applied at 6.5 s, the attacker at 8 s and the alarm one frame later."/>
+            <wp:cNvGraphicFramePr>
+              <a:graphicFrameLocks xmlns:a="http://schemas.openxmlformats.org/drawingml/2006/main" noChangeAspect="1"/>
+            </wp:cNvGraphicFramePr>
+            <a:graphic xmlns:a="http://schemas.openxmlformats.org/drawingml/2006/main">
+              <a:graphicData uri="http://schemas.openxmlformats.org/drawingml/2006/picture">
+                <pic:pic xmlns:pic="http://schemas.openxmlformats.org/drawingml/2006/picture">
+                  <pic:nvPicPr>
+                    <pic:cNvPr id="0" name="" descr=""/>
+                    <pic:cNvPicPr>
+                      <a:picLocks noChangeAspect="1" noChangeArrowheads="1"/>
+                    </pic:cNvPicPr>
+                  </pic:nvPicPr>
+                  <pic:blipFill>
+                    <a:blip r:embed="rId25" cstate="none"/>
+                    <a:srcRect/>
+                    <a:stretch>
+                      <a:fillRect/>
+                    </a:stretch>
+                  </pic:blipFill>
+                  <pic:spPr bwMode="auto">
+                    <a:xfrm>
+                      <a:off x="0" y="0"/>
+                      <a:ext cx="4953000" cy="6629400"/>
+                    </a:xfrm>
+                    <a:prstGeom prst="rect">
+                      <a:avLst/>
+                    </a:prstGeom>
+                  </pic:spPr>
+                </pic:pic>
+              </a:graphicData>
+            </a:graphic>
+          </wp:inline>
+        </w:drawing>
+      </w:r>
+    </w:p>
+    <w:p>
+      <w:pPr>
+        <w:spacing w:after="200"/>
+        <w:jc w:val="center"/>
+      </w:pPr>
+      <w:r>
+        <w:rPr>
+          <w:b/>
+          <w:bCs/>
+          <w:color w:val="455A64"/>
+          <w:sz w:val="18"/>
+          <w:szCs w:val="18"/>
+        </w:rPr>
+        <w:t xml:space="preserve">Figure 17. </w:t>
+      </w:r>
+      <w:r>
+        <w:rPr>
+          <w:i/>
+          <w:iCs/>
+          <w:color w:val="455A64"/>
+          <w:sz w:val="18"/>
+          <w:szCs w:val="18"/>
+        </w:rPr>
+        <w:t xml:space="preserve">Log of the run: the AVR fault at 6 s, the command for generator 49 issued at 6.067 s, delivered after 40 ms and applied at 6.5 s, the attacker at 8 s and the alarm one frame later.</w:t>
+      </w:r>
+    </w:p>
+    <w:p>
+      <w:pPr>
+        <w:keepNext/>
+        <w:spacing w:after="80" w:before="160"/>
+      </w:pPr>
+      <w:r>
+        <w:rPr>
+          <w:b/>
+          <w:bCs/>
+          <w:color w:val="455A64"/>
+          <w:sz w:val="18"/>
+          <w:szCs w:val="18"/>
+        </w:rPr>
+        <w:t xml:space="preserve">Table 11. </w:t>
+      </w:r>
+      <w:r>
+        <w:rPr>
+          <w:color w:val="455A64"/>
+          <w:sz w:val="18"/>
+          <w:szCs w:val="18"/>
+        </w:rPr>
+        <w:t xml:space="preserve">Where the Inside data come from</w:t>
+      </w:r>
+    </w:p>
+    <w:tbl>
+      <w:tblPr>
+        <w:tblW w:type="dxa" w:w="9026"/>
+        <w:tblBorders>
+          <w:top w:val="single" w:color="auto" w:sz="4"/>
+          <w:left w:val="single" w:color="auto" w:sz="4"/>
+          <w:bottom w:val="single" w:color="auto" w:sz="4"/>
+          <w:right w:val="single" w:color="auto" w:sz="4"/>
+          <w:insideH w:val="single" w:color="auto" w:sz="4"/>
+          <w:insideV w:val="single" w:color="auto" w:sz="4"/>
+        </w:tblBorders>
+      </w:tblPr>
+      <w:tblGrid>
+        <w:gridCol w:w="1985"/>
+        <w:gridCol w:w="7041"/>
+      </w:tblGrid>
+      <w:tr>
+        <w:trPr>
+          <w:cantSplit/>
+          <w:tblHeader/>
+        </w:trPr>
+        <w:tc>
+          <w:tcPr>
+            <w:tcW w:type="dxa" w:w="1985"/>
+            <w:tcBorders>
+              <w:top w:val="single" w:color="B0BEC5" w:sz="4"/>
+              <w:left w:val="single" w:color="B0BEC5" w:sz="4"/>
+              <w:bottom w:val="single" w:color="B0BEC5" w:sz="4"/>
+              <w:right w:val="single" w:color="B0BEC5" w:sz="4"/>
+            </w:tcBorders>
+            <w:shd w:fill="0D47A1" w:color="auto" w:val="clear"/>
+            <w:tcMar>
+              <w:top w:type="dxa" w:w="60"/>
+              <w:left w:type="dxa" w:w="100"/>
+              <w:bottom w:type="dxa" w:w="60"/>
+              <w:right w:type="dxa" w:w="100"/>
+            </w:tcMar>
+          </w:tcPr>
+          <w:p>
+            <w:pPr>
+              <w:spacing w:after="0" w:line="252"/>
+            </w:pPr>
+            <w:r>
+              <w:rPr>
+                <w:b/>
+                <w:bCs/>
+                <w:color w:val="FFFFFF"/>
+                <w:sz w:val="19"/>
+                <w:szCs w:val="19"/>
+              </w:rPr>
+              <w:t xml:space="preserve">Engine</w:t>
+            </w:r>
+          </w:p>
+        </w:tc>
+        <w:tc>
+          <w:tcPr>
+            <w:tcW w:type="dxa" w:w="7041"/>
+            <w:tcBorders>
+              <w:top w:val="single" w:color="B0BEC5" w:sz="4"/>
+              <w:left w:val="single" w:color="B0BEC5" w:sz="4"/>
+              <w:bottom w:val="single" w:color="B0BEC5" w:sz="4"/>
+              <w:right w:val="single" w:color="B0BEC5" w:sz="4"/>
+            </w:tcBorders>
+            <w:shd w:fill="0D47A1" w:color="auto" w:val="clear"/>
+            <w:tcMar>
+              <w:top w:type="dxa" w:w="60"/>
+              <w:left w:type="dxa" w:w="100"/>
+              <w:bottom w:type="dxa" w:w="60"/>
+              <w:right w:type="dxa" w:w="100"/>
+            </w:tcMar>
+          </w:tcPr>
+          <w:p>
+            <w:pPr>
+              <w:spacing w:after="0" w:line="252"/>
+            </w:pPr>
+            <w:r>
+              <w:rPr>
+                <w:b/>
+                <w:bCs/>
+                <w:color w:val="FFFFFF"/>
+                <w:sz w:val="19"/>
+                <w:szCs w:val="19"/>
+              </w:rPr>
+              <w:t xml:space="preserve">Source</w:t>
+            </w:r>
+          </w:p>
+        </w:tc>
+      </w:tr>
+      <w:tr>
+        <w:trPr>
+          <w:cantSplit/>
+        </w:trPr>
+        <w:tc>
+          <w:tcPr>
+            <w:tcW w:type="dxa" w:w="1985"/>
+            <w:tcBorders>
+              <w:top w:val="single" w:color="B0BEC5" w:sz="4"/>
+              <w:left w:val="single" w:color="B0BEC5" w:sz="4"/>
+              <w:bottom w:val="single" w:color="B0BEC5" w:sz="4"/>
+              <w:right w:val="single" w:color="B0BEC5" w:sz="4"/>
+            </w:tcBorders>
+            <w:tcMar>
+              <w:top w:type="dxa" w:w="60"/>
+              <w:left w:type="dxa" w:w="100"/>
+              <w:bottom w:type="dxa" w:w="60"/>
+              <w:right w:type="dxa" w:w="100"/>
+            </w:tcMar>
+          </w:tcPr>
+          <w:p>
+            <w:pPr>
+              <w:spacing w:after="0" w:line="252"/>
+            </w:pPr>
+            <w:r>
+              <w:rPr>
+                <w:sz w:val="19"/>
+                <w:szCs w:val="19"/>
+              </w:rPr>
+              <w:t xml:space="preserve">HELICS</w:t>
+            </w:r>
+          </w:p>
+        </w:tc>
+        <w:tc>
+          <w:tcPr>
+            <w:tcW w:type="dxa" w:w="7041"/>
+            <w:tcBorders>
+              <w:top w:val="single" w:color="B0BEC5" w:sz="4"/>
+              <w:left w:val="single" w:color="B0BEC5" w:sz="4"/>
+              <w:bottom w:val="single" w:color="B0BEC5" w:sz="4"/>
+              <w:right w:val="single" w:color="B0BEC5" w:sz="4"/>
+            </w:tcBorders>
+            <w:tcMar>
+              <w:top w:type="dxa" w:w="60"/>
+              <w:left w:type="dxa" w:w="100"/>
+              <w:bottom w:type="dxa" w:w="60"/>
+              <w:right w:type="dxa" w:w="100"/>
+            </w:tcMar>
+          </w:tcPr>
+          <w:p>
+            <w:pPr>
+              <w:spacing w:after="0" w:line="252"/>
+            </w:pPr>
+            <w:r>
+              <w:rPr>
+                <w:sz w:val="19"/>
+                <w:szCs w:val="19"/>
+              </w:rPr>
+              <w:t xml:space="preserve">The observer federate asks the broker for the granted time of every federate (</w:t>
+            </w:r>
+            <w:r>
+              <w:rPr>
+                <w:rFonts w:ascii="Consolas" w:cs="Consolas" w:eastAsia="Consolas" w:hAnsi="Consolas"/>
+                <w:color w:val="37474F"/>
+                <w:sz w:val="19"/>
+                <w:szCs w:val="19"/>
+              </w:rPr>
+              <w:t xml:space="preserve">global_time</w:t>
+            </w:r>
+            <w:r>
+              <w:rPr>
+                <w:sz w:val="19"/>
+                <w:szCs w:val="19"/>
+              </w:rPr>
+              <w:t xml:space="preserve"> query) and counts the messages and bytes of each topic it receives</w:t>
+            </w:r>
+          </w:p>
+        </w:tc>
+      </w:tr>
+      <w:tr>
+        <w:trPr>
+          <w:cantSplit/>
+        </w:trPr>
+        <w:tc>
+          <w:tcPr>
+            <w:tcW w:type="dxa" w:w="1985"/>
+            <w:tcBorders>
+              <w:top w:val="single" w:color="B0BEC5" w:sz="4"/>
+              <w:left w:val="single" w:color="B0BEC5" w:sz="4"/>
+              <w:bottom w:val="single" w:color="B0BEC5" w:sz="4"/>
+              <w:right w:val="single" w:color="B0BEC5" w:sz="4"/>
+            </w:tcBorders>
+            <w:tcMar>
+              <w:top w:type="dxa" w:w="60"/>
+              <w:left w:type="dxa" w:w="100"/>
+              <w:bottom w:type="dxa" w:w="60"/>
+              <w:right w:type="dxa" w:w="100"/>
+            </w:tcMar>
+          </w:tcPr>
+          <w:p>
+            <w:pPr>
+              <w:spacing w:after="0" w:line="252"/>
+            </w:pPr>
+            <w:r>
+              <w:rPr>
+                <w:sz w:val="19"/>
+                <w:szCs w:val="19"/>
+              </w:rPr>
+              <w:t xml:space="preserve">GridPACK</w:t>
+            </w:r>
+          </w:p>
+        </w:tc>
+        <w:tc>
+          <w:tcPr>
+            <w:tcW w:type="dxa" w:w="7041"/>
+            <w:tcBorders>
+              <w:top w:val="single" w:color="B0BEC5" w:sz="4"/>
+              <w:left w:val="single" w:color="B0BEC5" w:sz="4"/>
+              <w:bottom w:val="single" w:color="B0BEC5" w:sz="4"/>
+              <w:right w:val="single" w:color="B0BEC5" w:sz="4"/>
+            </w:tcBorders>
+            <w:tcMar>
+              <w:top w:type="dxa" w:w="60"/>
+              <w:left w:type="dxa" w:w="100"/>
+              <w:bottom w:type="dxa" w:w="60"/>
+              <w:right w:type="dxa" w:w="100"/>
+            </w:tcMar>
+          </w:tcPr>
+          <w:p>
+            <w:pPr>
+              <w:spacing w:after="0" w:line="252"/>
+            </w:pPr>
+            <w:r>
+              <w:rPr>
+                <w:rFonts w:ascii="Consolas" w:cs="Consolas" w:eastAsia="Consolas" w:hAnsi="Consolas"/>
+                <w:color w:val="37474F"/>
+                <w:sz w:val="19"/>
+                <w:szCs w:val="19"/>
+              </w:rPr>
+              <w:t xml:space="preserve">pf_server</w:t>
+            </w:r>
+            <w:r>
+              <w:rPr>
+                <w:sz w:val="19"/>
+                <w:szCs w:val="19"/>
+              </w:rPr>
+              <w:t xml:space="preserve"> and </w:t>
+            </w:r>
+            <w:r>
+              <w:rPr>
+                <w:rFonts w:ascii="Consolas" w:cs="Consolas" w:eastAsia="Consolas" w:hAnsi="Consolas"/>
+                <w:color w:val="37474F"/>
+                <w:sz w:val="19"/>
+                <w:szCs w:val="19"/>
+              </w:rPr>
+              <w:t xml:space="preserve">dsf_server</w:t>
+            </w:r>
+            <w:r>
+              <w:rPr>
+                <w:sz w:val="19"/>
+                <w:szCs w:val="19"/>
+              </w:rPr>
+              <w:t xml:space="preserve"> print each rank's node and partition at start-up (</w:t>
+            </w:r>
+            <w:r>
+              <w:rPr>
+                <w:rFonts w:ascii="Consolas" w:cs="Consolas" w:eastAsia="Consolas" w:hAnsi="Consolas"/>
+                <w:color w:val="37474F"/>
+                <w:sz w:val="19"/>
+                <w:szCs w:val="19"/>
+              </w:rPr>
+              <w:t xml:space="preserve">@@RANK</w:t>
+            </w:r>
+            <w:r>
+              <w:rPr>
+                <w:sz w:val="19"/>
+                <w:szCs w:val="19"/>
+              </w:rPr>
+              <w:t xml:space="preserve">), PETSc's Newton iteration lines and the integration steps; the grid federate reads them and publishes them with its step on </w:t>
+            </w:r>
+            <w:r>
+              <w:rPr>
+                <w:rFonts w:ascii="Consolas" w:cs="Consolas" w:eastAsia="Consolas" w:hAnsi="Consolas"/>
+                <w:color w:val="37474F"/>
+                <w:sz w:val="19"/>
+                <w:szCs w:val="19"/>
+              </w:rPr>
+              <w:t xml:space="preserve">grid/status</w:t>
+            </w:r>
+          </w:p>
+        </w:tc>
+      </w:tr>
+      <w:tr>
+        <w:trPr>
+          <w:cantSplit/>
+        </w:trPr>
+        <w:tc>
+          <w:tcPr>
+            <w:tcW w:type="dxa" w:w="1985"/>
+            <w:tcBorders>
+              <w:top w:val="single" w:color="B0BEC5" w:sz="4"/>
+              <w:left w:val="single" w:color="B0BEC5" w:sz="4"/>
+              <w:bottom w:val="single" w:color="B0BEC5" w:sz="4"/>
+              <w:right w:val="single" w:color="B0BEC5" w:sz="4"/>
+            </w:tcBorders>
+            <w:tcMar>
+              <w:top w:type="dxa" w:w="60"/>
+              <w:left w:type="dxa" w:w="100"/>
+              <w:bottom w:type="dxa" w:w="60"/>
+              <w:right w:type="dxa" w:w="100"/>
+            </w:tcMar>
+          </w:tcPr>
+          <w:p>
+            <w:pPr>
+              <w:spacing w:after="0" w:line="252"/>
+            </w:pPr>
+            <w:r>
+              <w:rPr>
+                <w:sz w:val="19"/>
+                <w:szCs w:val="19"/>
+              </w:rPr>
+              <w:t xml:space="preserve">NS-3</w:t>
+            </w:r>
+          </w:p>
+        </w:tc>
+        <w:tc>
+          <w:tcPr>
+            <w:tcW w:type="dxa" w:w="7041"/>
+            <w:tcBorders>
+              <w:top w:val="single" w:color="B0BEC5" w:sz="4"/>
+              <w:left w:val="single" w:color="B0BEC5" w:sz="4"/>
+              <w:bottom w:val="single" w:color="B0BEC5" w:sz="4"/>
+              <w:right w:val="single" w:color="B0BEC5" w:sz="4"/>
+            </w:tcBorders>
+            <w:tcMar>
+              <w:top w:type="dxa" w:w="60"/>
+              <w:left w:type="dxa" w:w="100"/>
+              <w:bottom w:type="dxa" w:w="60"/>
+              <w:right w:type="dxa" w:w="100"/>
+            </w:tcMar>
+          </w:tcPr>
+          <w:p>
+            <w:pPr>
+              <w:spacing w:after="0" w:line="252"/>
+            </w:pPr>
+            <w:r>
+              <w:rPr>
+                <w:sz w:val="19"/>
+                <w:szCs w:val="19"/>
+              </w:rPr>
+              <w:t xml:space="preserve">The NS-3 federate publishes its counters on </w:t>
+            </w:r>
+            <w:r>
+              <w:rPr>
+                <w:rFonts w:ascii="Consolas" w:cs="Consolas" w:eastAsia="Consolas" w:hAnsi="Consolas"/>
+                <w:color w:val="37474F"/>
+                <w:sz w:val="19"/>
+                <w:szCs w:val="19"/>
+              </w:rPr>
+              <w:t xml:space="preserve">ns3/status</w:t>
+            </w:r>
+            <w:r>
+              <w:rPr>
+                <w:sz w:val="19"/>
+                <w:szCs w:val="19"/>
+              </w:rPr>
+              <w:t xml:space="preserve"> twice a second</w:t>
+            </w:r>
+          </w:p>
+        </w:tc>
+      </w:tr>
+      <w:tr>
+        <w:trPr>
+          <w:cantSplit/>
+        </w:trPr>
+        <w:tc>
+          <w:tcPr>
+            <w:tcW w:type="dxa" w:w="1985"/>
+            <w:tcBorders>
+              <w:top w:val="single" w:color="B0BEC5" w:sz="4"/>
+              <w:left w:val="single" w:color="B0BEC5" w:sz="4"/>
+              <w:bottom w:val="single" w:color="B0BEC5" w:sz="4"/>
+              <w:right w:val="single" w:color="B0BEC5" w:sz="4"/>
+            </w:tcBorders>
+            <w:tcMar>
+              <w:top w:type="dxa" w:w="60"/>
+              <w:left w:type="dxa" w:w="100"/>
+              <w:bottom w:type="dxa" w:w="60"/>
+              <w:right w:type="dxa" w:w="100"/>
+            </w:tcMar>
+          </w:tcPr>
+          <w:p>
+            <w:pPr>
+              <w:spacing w:after="0" w:line="252"/>
+            </w:pPr>
+            <w:r>
+              <w:rPr>
+                <w:sz w:val="19"/>
+                <w:szCs w:val="19"/>
+              </w:rPr>
+              <w:t xml:space="preserve">Control center</w:t>
+            </w:r>
+          </w:p>
+        </w:tc>
+        <w:tc>
+          <w:tcPr>
+            <w:tcW w:type="dxa" w:w="7041"/>
+            <w:tcBorders>
+              <w:top w:val="single" w:color="B0BEC5" w:sz="4"/>
+              <w:left w:val="single" w:color="B0BEC5" w:sz="4"/>
+              <w:bottom w:val="single" w:color="B0BEC5" w:sz="4"/>
+              <w:right w:val="single" w:color="B0BEC5" w:sz="4"/>
+            </w:tcBorders>
+            <w:tcMar>
+              <w:top w:type="dxa" w:w="60"/>
+              <w:left w:type="dxa" w:w="100"/>
+              <w:bottom w:type="dxa" w:w="60"/>
+              <w:right w:type="dxa" w:w="100"/>
+            </w:tcMar>
+          </w:tcPr>
+          <w:p>
+            <w:pPr>
+              <w:spacing w:after="0" w:line="252"/>
+            </w:pPr>
+            <w:r>
+              <w:rPr>
+                <w:sz w:val="19"/>
+                <w:szCs w:val="19"/>
+              </w:rPr>
+              <w:t xml:space="preserve">The control-center federate adds the size, observability, test results and time of each estimation to </w:t>
+            </w:r>
+            <w:r>
+              <w:rPr>
+                <w:rFonts w:ascii="Consolas" w:cs="Consolas" w:eastAsia="Consolas" w:hAnsi="Consolas"/>
+                <w:color w:val="37474F"/>
+                <w:sz w:val="19"/>
+                <w:szCs w:val="19"/>
+              </w:rPr>
+              <w:t xml:space="preserve">cc/status</w:t>
+            </w:r>
+          </w:p>
+        </w:tc>
+      </w:tr>
+    </w:tbl>
+    <w:p>
+      <w:pPr>
+        <w:pStyle w:val="Heading2"/>
+      </w:pPr>
+      <w:r>
+        <w:t xml:space="preserve">6.9 Results page</w:t>
+      </w:r>
+    </w:p>
+    <w:p>
+      <w:pPr>
+        <w:keepNext/>
+        <w:spacing w:after="60" w:before="120"/>
+        <w:jc w:val="center"/>
+      </w:pPr>
+      <w:r>
+        <w:drawing>
+          <wp:inline distT="0" distB="0" distL="0" distR="0">
+            <wp:extent cx="5715000" cy="1800225"/>
+            <wp:effectExtent t="0" r="0" b="0" l="0"/>
+            <wp:docPr id="1" name="res_0.png" descr="Runs: one row per finished experiment; click a row to open it." title="Runs: one row per finished experiment; click a row to open it."/>
+            <wp:cNvGraphicFramePr>
+              <a:graphicFrameLocks xmlns:a="http://schemas.openxmlformats.org/drawingml/2006/main" noChangeAspect="1"/>
+            </wp:cNvGraphicFramePr>
+            <a:graphic xmlns:a="http://schemas.openxmlformats.org/drawingml/2006/main">
+              <a:graphicData uri="http://schemas.openxmlformats.org/drawingml/2006/picture">
+                <pic:pic xmlns:pic="http://schemas.openxmlformats.org/drawingml/2006/picture">
+                  <pic:nvPicPr>
+                    <pic:cNvPr id="0" name="" descr=""/>
+                    <pic:cNvPicPr>
+                      <a:picLocks noChangeAspect="1" noChangeArrowheads="1"/>
+                    </pic:cNvPicPr>
+                  </pic:nvPicPr>
+                  <pic:blipFill>
+                    <a:blip r:embed="rId26" cstate="none"/>
+                    <a:srcRect/>
+                    <a:stretch>
+                      <a:fillRect/>
+                    </a:stretch>
+                  </pic:blipFill>
+                  <pic:spPr bwMode="auto">
+                    <a:xfrm>
+                      <a:off x="0" y="0"/>
+                      <a:ext cx="5715000" cy="1800225"/>
+                    </a:xfrm>
+                    <a:prstGeom prst="rect">
+                      <a:avLst/>
+                    </a:prstGeom>
+                  </pic:spPr>
+                </pic:pic>
+              </a:graphicData>
+            </a:graphic>
+          </wp:inline>
+        </w:drawing>
+      </w:r>
+    </w:p>
+    <w:p>
+      <w:pPr>
+        <w:spacing w:after="200"/>
+        <w:jc w:val="center"/>
+      </w:pPr>
+      <w:r>
+        <w:rPr>
+          <w:b/>
+          <w:bCs/>
+          <w:color w:val="455A64"/>
+          <w:sz w:val="18"/>
+          <w:szCs w:val="18"/>
+        </w:rPr>
+        <w:t xml:space="preserve">Figure 18. </w:t>
+      </w:r>
+      <w:r>
+        <w:rPr>
+          <w:i/>
+          <w:iCs/>
+          <w:color w:val="455A64"/>
+          <w:sz w:val="18"/>
+          <w:szCs w:val="18"/>
+        </w:rPr>
+        <w:t xml:space="preserve">Runs: one row per finished experiment; click a row to open it.</w:t>
+      </w:r>
+    </w:p>
+    <w:p>
+      <w:pPr>
+        <w:keepNext/>
+        <w:spacing w:after="60" w:before="120"/>
+        <w:jc w:val="center"/>
+      </w:pPr>
+      <w:r>
+        <w:drawing>
+          <wp:inline distT="0" distB="0" distL="0" distR="0">
+            <wp:extent cx="5715000" cy="1285875"/>
+            <wp:effectExtent t="0" r="0" b="0" l="0"/>
+            <wp:docPr id="1" name="res_1.png" descr="Run summary of the IEEE 118 simple FDI run, with colour-coded figures (green good, amber borderline, red problem)." title="Run summary of the IEEE 118 simple FDI run, with colour-coded figures (green good, amber borderline, red problem)."/>
+            <wp:cNvGraphicFramePr>
+              <a:graphicFrameLocks xmlns:a="http://schemas.openxmlformats.org/drawingml/2006/main" noChangeAspect="1"/>
+            </wp:cNvGraphicFramePr>
+            <a:graphic xmlns:a="http://schemas.openxmlformats.org/drawingml/2006/main">
+              <a:graphicData uri="http://schemas.openxmlformats.org/drawingml/2006/picture">
+                <pic:pic xmlns:pic="http://schemas.openxmlformats.org/drawingml/2006/picture">
+                  <pic:nvPicPr>
+                    <pic:cNvPr id="0" name="" descr=""/>
+                    <pic:cNvPicPr>
+                      <a:picLocks noChangeAspect="1" noChangeArrowheads="1"/>
+                    </pic:cNvPicPr>
+                  </pic:nvPicPr>
+                  <pic:blipFill>
+                    <a:blip r:embed="rId27" cstate="none"/>
+                    <a:srcRect/>
+                    <a:stretch>
+                      <a:fillRect/>
+                    </a:stretch>
+                  </pic:blipFill>
+                  <pic:spPr bwMode="auto">
+                    <a:xfrm>
+                      <a:off x="0" y="0"/>
                       <a:ext cx="5715000" cy="1285875"/>
                     </a:xfrm>
                     <a:prstGeom prst="rect">
@@ -16532,7 +17561,7 @@
           <w:sz w:val="18"/>
           <w:szCs w:val="18"/>
         </w:rPr>
-        <w:t xml:space="preserve">Figure 13. </w:t>
+        <w:t xml:space="preserve">Figure 19. </w:t>
       </w:r>
       <w:r>
         <w:rPr>
@@ -16558,7 +17587,7 @@
           <w:sz w:val="18"/>
           <w:szCs w:val="18"/>
         </w:rPr>
-        <w:t xml:space="preserve">Table 11. </w:t>
+        <w:t xml:space="preserve">Table 12. </w:t>
       </w:r>
       <w:r>
         <w:rPr>
@@ -17250,7 +18279,7 @@
                     </pic:cNvPicPr>
                   </pic:nvPicPr>
                   <pic:blipFill>
-                    <a:blip r:embed="rId22" cstate="none"/>
+                    <a:blip r:embed="rId28" cstate="none"/>
                     <a:srcRect/>
                     <a:stretch>
                       <a:fillRect/>
@@ -17285,7 +18314,7 @@
           <w:sz w:val="18"/>
           <w:szCs w:val="18"/>
         </w:rPr>
-        <w:t xml:space="preserve">Figure 14. </w:t>
+        <w:t xml:space="preserve">Figure 20. </w:t>
       </w:r>
       <w:r>
         <w:rPr>
@@ -17310,642 +18339,6 @@
             <wp:extent cx="5715000" cy="762000"/>
             <wp:effectExtent t="0" r="0" b="0" l="0"/>
             <wp:docPr id="1" name="res_3.png" descr="Commands and events of the run." title="Commands and events of the run."/>
-            <wp:cNvGraphicFramePr>
-              <a:graphicFrameLocks xmlns:a="http://schemas.openxmlformats.org/drawingml/2006/main" noChangeAspect="1"/>
-            </wp:cNvGraphicFramePr>
-            <a:graphic xmlns:a="http://schemas.openxmlformats.org/drawingml/2006/main">
-              <a:graphicData uri="http://schemas.openxmlformats.org/drawingml/2006/picture">
-                <pic:pic xmlns:pic="http://schemas.openxmlformats.org/drawingml/2006/picture">
-                  <pic:nvPicPr>
-                    <pic:cNvPr id="0" name="" descr=""/>
-                    <pic:cNvPicPr>
-                      <a:picLocks noChangeAspect="1" noChangeArrowheads="1"/>
-                    </pic:cNvPicPr>
-                  </pic:nvPicPr>
-                  <pic:blipFill>
-                    <a:blip r:embed="rId23" cstate="none"/>
-                    <a:srcRect/>
-                    <a:stretch>
-                      <a:fillRect/>
-                    </a:stretch>
-                  </pic:blipFill>
-                  <pic:spPr bwMode="auto">
-                    <a:xfrm>
-                      <a:off x="0" y="0"/>
-                      <a:ext cx="5715000" cy="762000"/>
-                    </a:xfrm>
-                    <a:prstGeom prst="rect">
-                      <a:avLst/>
-                    </a:prstGeom>
-                  </pic:spPr>
-                </pic:pic>
-              </a:graphicData>
-            </a:graphic>
-          </wp:inline>
-        </w:drawing>
-      </w:r>
-    </w:p>
-    <w:p>
-      <w:pPr>
-        <w:spacing w:after="200"/>
-        <w:jc w:val="center"/>
-      </w:pPr>
-      <w:r>
-        <w:rPr>
-          <w:b/>
-          <w:bCs/>
-          <w:color w:val="455A64"/>
-          <w:sz w:val="18"/>
-          <w:szCs w:val="18"/>
-        </w:rPr>
-        <w:t xml:space="preserve">Figure 15. </w:t>
-      </w:r>
-      <w:r>
-        <w:rPr>
-          <w:i/>
-          <w:iCs/>
-          <w:color w:val="455A64"/>
-          <w:sz w:val="18"/>
-          <w:szCs w:val="18"/>
-        </w:rPr>
-        <w:t xml:space="preserve">Commands and events of the run.</w:t>
-      </w:r>
-    </w:p>
-    <w:p>
-      <w:pPr>
-        <w:pStyle w:val="Heading2"/>
-      </w:pPr>
-      <w:r>
-        <w:t xml:space="preserve">6.9 Dynamic simulation runs</w:t>
-      </w:r>
-    </w:p>
-    <w:p>
-      <w:pPr>
-        <w:spacing w:after="120" w:line="288"/>
-      </w:pPr>
-      <w:r>
-        <w:t xml:space="preserve">A scenario with </w:t>
-      </w:r>
-      <w:r>
-        <w:rPr>
-          <w:rFonts w:ascii="Consolas" w:cs="Consolas" w:eastAsia="Consolas" w:hAnsi="Consolas"/>
-          <w:color w:val="37474F"/>
-          <w:sz w:val="19"/>
-          <w:szCs w:val="19"/>
-        </w:rPr>
-        <w:t xml:space="preserve">mode: dynamic</w:t>
-      </w:r>
-      <w:r>
-        <w:t xml:space="preserve"> uses the same pages. Below, a file with two IEEE 39 experiments (a 100 ms fault at bus 16 and the trip of generator 32, both at 3 s) was uploaded; both ran at the same time. The Live page adds the system frequency, the lowest frequency so far and the rotor angle spread, and two charts.</w:t>
-      </w:r>
-    </w:p>
-    <w:p>
-      <w:pPr>
-        <w:shd w:fill="F1F4F6" w:color="auto" w:val="clear"/>
-        <w:spacing w:after="0" w:before="60" w:line="252"/>
-        <w:ind w:left="120" w:right="120"/>
-      </w:pPr>
-      <w:r>
-        <w:rPr>
-          <w:rFonts w:ascii="Consolas" w:cs="Consolas" w:eastAsia="Consolas" w:hAnsi="Consolas"/>
-          <w:color w:val="263238"/>
-          <w:sz w:val="18"/>
-          <w:szCs w:val="18"/>
-        </w:rPr>
-        <w:t xml:space="preserve">grid: ieee39</w:t>
-      </w:r>
-    </w:p>
-    <w:p>
-      <w:pPr>
-        <w:shd w:fill="F1F4F6" w:color="auto" w:val="clear"/>
-        <w:spacing w:after="0" w:before="0" w:line="252"/>
-        <w:ind w:left="120" w:right="120"/>
-      </w:pPr>
-      <w:r>
-        <w:rPr>
-          <w:rFonts w:ascii="Consolas" w:cs="Consolas" w:eastAsia="Consolas" w:hAnsi="Consolas"/>
-          <w:color w:val="263238"/>
-          <w:sz w:val="18"/>
-          <w:szCs w:val="18"/>
-        </w:rPr>
-        <w:t xml:space="preserve">mode: dynamic</w:t>
-      </w:r>
-    </w:p>
-    <w:p>
-      <w:pPr>
-        <w:shd w:fill="F1F4F6" w:color="auto" w:val="clear"/>
-        <w:spacing w:after="0" w:before="0" w:line="252"/>
-        <w:ind w:left="120" w:right="120"/>
-      </w:pPr>
-      <w:r>
-        <w:rPr>
-          <w:rFonts w:ascii="Consolas" w:cs="Consolas" w:eastAsia="Consolas" w:hAnsi="Consolas"/>
-          <w:color w:val="263238"/>
-          <w:sz w:val="18"/>
-          <w:szCs w:val="18"/>
-        </w:rPr>
-        <w:t xml:space="preserve">duration: 15</w:t>
-      </w:r>
-    </w:p>
-    <w:p>
-      <w:pPr>
-        <w:shd w:fill="F1F4F6" w:color="auto" w:val="clear"/>
-        <w:spacing w:after="0" w:before="0" w:line="252"/>
-        <w:ind w:left="120" w:right="120"/>
-      </w:pPr>
-      <w:r>
-        <w:rPr>
-          <w:rFonts w:ascii="Consolas" w:cs="Consolas" w:eastAsia="Consolas" w:hAnsi="Consolas"/>
-          <w:color w:val="263238"/>
-          <w:sz w:val="18"/>
-          <w:szCs w:val="18"/>
-        </w:rPr>
-        <w:t xml:space="preserve">mpi_np: 1</w:t>
-      </w:r>
-    </w:p>
-    <w:p>
-      <w:pPr>
-        <w:shd w:fill="F1F4F6" w:color="auto" w:val="clear"/>
-        <w:spacing w:after="0" w:before="0" w:line="252"/>
-        <w:ind w:left="120" w:right="120"/>
-      </w:pPr>
-      <w:r>
-        <w:rPr>
-          <w:rFonts w:ascii="Consolas" w:cs="Consolas" w:eastAsia="Consolas" w:hAnsi="Consolas"/>
-          <w:color w:val="263238"/>
-          <w:sz w:val="18"/>
-          <w:szCs w:val="18"/>
-        </w:rPr>
-        <w:t xml:space="preserve">scenarios:</w:t>
-      </w:r>
-    </w:p>
-    <w:p>
-      <w:pPr>
-        <w:shd w:fill="F1F4F6" w:color="auto" w:val="clear"/>
-        <w:spacing w:after="0" w:before="0" w:line="252"/>
-        <w:ind w:left="120" w:right="120"/>
-      </w:pPr>
-      <w:r>
-        <w:rPr>
-          <w:rFonts w:ascii="Consolas" w:cs="Consolas" w:eastAsia="Consolas" w:hAnsi="Consolas"/>
-          <w:color w:val="263238"/>
-          <w:sz w:val="18"/>
-          <w:szCs w:val="18"/>
-        </w:rPr>
-        <w:t xml:space="preserve">  - name: ieee39-dyn-fault</w:t>
-      </w:r>
-    </w:p>
-    <w:p>
-      <w:pPr>
-        <w:shd w:fill="F1F4F6" w:color="auto" w:val="clear"/>
-        <w:spacing w:after="0" w:before="0" w:line="252"/>
-        <w:ind w:left="120" w:right="120"/>
-      </w:pPr>
-      <w:r>
-        <w:rPr>
-          <w:rFonts w:ascii="Consolas" w:cs="Consolas" w:eastAsia="Consolas" w:hAnsi="Consolas"/>
-          <w:color w:val="263238"/>
-          <w:sz w:val="18"/>
-          <w:szCs w:val="18"/>
-        </w:rPr>
-        <w:t xml:space="preserve">    event: {type: bus_fault, bus: 16, duration: 0.1, t: 3}</w:t>
-      </w:r>
-    </w:p>
-    <w:p>
-      <w:pPr>
-        <w:shd w:fill="F1F4F6" w:color="auto" w:val="clear"/>
-        <w:spacing w:after="0" w:before="0" w:line="252"/>
-        <w:ind w:left="120" w:right="120"/>
-      </w:pPr>
-      <w:r>
-        <w:rPr>
-          <w:rFonts w:ascii="Consolas" w:cs="Consolas" w:eastAsia="Consolas" w:hAnsi="Consolas"/>
-          <w:color w:val="263238"/>
-          <w:sz w:val="18"/>
-          <w:szCs w:val="18"/>
-        </w:rPr>
-        <w:t xml:space="preserve">  - name: ieee39-dyn-gentrip</w:t>
-      </w:r>
-    </w:p>
-    <w:p>
-      <w:pPr>
-        <w:shd w:fill="F1F4F6" w:color="auto" w:val="clear"/>
-        <w:spacing w:after="160" w:before="0" w:line="252"/>
-        <w:ind w:left="120" w:right="120"/>
-      </w:pPr>
-      <w:r>
-        <w:rPr>
-          <w:rFonts w:ascii="Consolas" w:cs="Consolas" w:eastAsia="Consolas" w:hAnsi="Consolas"/>
-          <w:color w:val="263238"/>
-          <w:sz w:val="18"/>
-          <w:szCs w:val="18"/>
-        </w:rPr>
-        <w:t xml:space="preserve">    event: {type: gen_trip, bus: 32, t: 3}</w:t>
-      </w:r>
-    </w:p>
-    <w:p>
-      <w:pPr>
-        <w:keepNext/>
-        <w:spacing w:after="60" w:before="120"/>
-        <w:jc w:val="center"/>
-      </w:pPr>
-      <w:r>
-        <w:drawing>
-          <wp:inline distT="0" distB="0" distL="0" distR="0">
-            <wp:extent cx="5715000" cy="1743075"/>
-            <wp:effectExtent t="0" r="0" b="0" l="0"/>
-            <wp:docPr id="1" name="dyn_live_0.png" descr="Live, dynamic run: frequency of the centre of inertia, lowest frequency so far and rotor angle spread next to the usual figures." title="Live, dynamic run: frequency of the centre of inertia, lowest frequency so far and rotor angle spread next to the usual figures."/>
-            <wp:cNvGraphicFramePr>
-              <a:graphicFrameLocks xmlns:a="http://schemas.openxmlformats.org/drawingml/2006/main" noChangeAspect="1"/>
-            </wp:cNvGraphicFramePr>
-            <a:graphic xmlns:a="http://schemas.openxmlformats.org/drawingml/2006/main">
-              <a:graphicData uri="http://schemas.openxmlformats.org/drawingml/2006/picture">
-                <pic:pic xmlns:pic="http://schemas.openxmlformats.org/drawingml/2006/picture">
-                  <pic:nvPicPr>
-                    <pic:cNvPr id="0" name="" descr=""/>
-                    <pic:cNvPicPr>
-                      <a:picLocks noChangeAspect="1" noChangeArrowheads="1"/>
-                    </pic:cNvPicPr>
-                  </pic:nvPicPr>
-                  <pic:blipFill>
-                    <a:blip r:embed="rId24" cstate="none"/>
-                    <a:srcRect/>
-                    <a:stretch>
-                      <a:fillRect/>
-                    </a:stretch>
-                  </pic:blipFill>
-                  <pic:spPr bwMode="auto">
-                    <a:xfrm>
-                      <a:off x="0" y="0"/>
-                      <a:ext cx="5715000" cy="1743075"/>
-                    </a:xfrm>
-                    <a:prstGeom prst="rect">
-                      <a:avLst/>
-                    </a:prstGeom>
-                  </pic:spPr>
-                </pic:pic>
-              </a:graphicData>
-            </a:graphic>
-          </wp:inline>
-        </w:drawing>
-      </w:r>
-    </w:p>
-    <w:p>
-      <w:pPr>
-        <w:spacing w:after="200"/>
-        <w:jc w:val="center"/>
-      </w:pPr>
-      <w:r>
-        <w:rPr>
-          <w:b/>
-          <w:bCs/>
-          <w:color w:val="455A64"/>
-          <w:sz w:val="18"/>
-          <w:szCs w:val="18"/>
-        </w:rPr>
-        <w:t xml:space="preserve">Figure 16. </w:t>
-      </w:r>
-      <w:r>
-        <w:rPr>
-          <w:i/>
-          <w:iCs/>
-          <w:color w:val="455A64"/>
-          <w:sz w:val="18"/>
-          <w:szCs w:val="18"/>
-        </w:rPr>
-        <w:t xml:space="preserve">Live, dynamic run: frequency of the centre of inertia, lowest frequency so far and rotor angle spread next to the usual figures.</w:t>
-      </w:r>
-    </w:p>
-    <w:p>
-      <w:pPr>
-        <w:keepNext/>
-        <w:spacing w:after="60" w:before="120"/>
-        <w:jc w:val="center"/>
-      </w:pPr>
-      <w:r>
-        <w:drawing>
-          <wp:inline distT="0" distB="0" distL="0" distR="0">
-            <wp:extent cx="5715000" cy="2552700"/>
-            <wp:effectExtent t="0" r="0" b="0" l="0"/>
-            <wp:docPr id="1" name="dyn_live_1.png" descr="Live charts at 9.3 s: the fault at 3 s pulls bus 36 down to 0.56 pu; the exciters overshoot; frequency and rotor angles swing and settle." title="Live charts at 9.3 s: the fault at 3 s pulls bus 36 down to 0.56 pu; the exciters overshoot; frequency and rotor angles swing and settle."/>
-            <wp:cNvGraphicFramePr>
-              <a:graphicFrameLocks xmlns:a="http://schemas.openxmlformats.org/drawingml/2006/main" noChangeAspect="1"/>
-            </wp:cNvGraphicFramePr>
-            <a:graphic xmlns:a="http://schemas.openxmlformats.org/drawingml/2006/main">
-              <a:graphicData uri="http://schemas.openxmlformats.org/drawingml/2006/picture">
-                <pic:pic xmlns:pic="http://schemas.openxmlformats.org/drawingml/2006/picture">
-                  <pic:nvPicPr>
-                    <pic:cNvPr id="0" name="" descr=""/>
-                    <pic:cNvPicPr>
-                      <a:picLocks noChangeAspect="1" noChangeArrowheads="1"/>
-                    </pic:cNvPicPr>
-                  </pic:nvPicPr>
-                  <pic:blipFill>
-                    <a:blip r:embed="rId25" cstate="none"/>
-                    <a:srcRect/>
-                    <a:stretch>
-                      <a:fillRect/>
-                    </a:stretch>
-                  </pic:blipFill>
-                  <pic:spPr bwMode="auto">
-                    <a:xfrm>
-                      <a:off x="0" y="0"/>
-                      <a:ext cx="5715000" cy="2552700"/>
-                    </a:xfrm>
-                    <a:prstGeom prst="rect">
-                      <a:avLst/>
-                    </a:prstGeom>
-                  </pic:spPr>
-                </pic:pic>
-              </a:graphicData>
-            </a:graphic>
-          </wp:inline>
-        </w:drawing>
-      </w:r>
-    </w:p>
-    <w:p>
-      <w:pPr>
-        <w:spacing w:after="200"/>
-        <w:jc w:val="center"/>
-      </w:pPr>
-      <w:r>
-        <w:rPr>
-          <w:b/>
-          <w:bCs/>
-          <w:color w:val="455A64"/>
-          <w:sz w:val="18"/>
-          <w:szCs w:val="18"/>
-        </w:rPr>
-        <w:t xml:space="preserve">Figure 17. </w:t>
-      </w:r>
-      <w:r>
-        <w:rPr>
-          <w:i/>
-          <w:iCs/>
-          <w:color w:val="455A64"/>
-          <w:sz w:val="18"/>
-          <w:szCs w:val="18"/>
-        </w:rPr>
-        <w:t xml:space="preserve">Live charts at 9.3 s: the fault at 3 s pulls bus 36 down to 0.56 pu; the exciters overshoot; frequency and rotor angles swing and settle.</w:t>
-      </w:r>
-    </w:p>
-    <w:p>
-      <w:pPr>
-        <w:keepNext/>
-        <w:spacing w:after="60" w:before="120"/>
-        <w:jc w:val="center"/>
-      </w:pPr>
-      <w:r>
-        <w:drawing>
-          <wp:inline distT="0" distB="0" distL="0" distR="0">
-            <wp:extent cx="5715000" cy="2057400"/>
-            <wp:effectExtent t="0" r="0" b="0" l="0"/>
-            <wp:docPr id="1" name="dyn_res_1.png" descr="Results summary of the fault run: frequency range, final frequency, largest rotor angle spread, machine data and integration step." title="Results summary of the fault run: frequency range, final frequency, largest rotor angle spread, machine data and integration step."/>
-            <wp:cNvGraphicFramePr>
-              <a:graphicFrameLocks xmlns:a="http://schemas.openxmlformats.org/drawingml/2006/main" noChangeAspect="1"/>
-            </wp:cNvGraphicFramePr>
-            <a:graphic xmlns:a="http://schemas.openxmlformats.org/drawingml/2006/main">
-              <a:graphicData uri="http://schemas.openxmlformats.org/drawingml/2006/picture">
-                <pic:pic xmlns:pic="http://schemas.openxmlformats.org/drawingml/2006/picture">
-                  <pic:nvPicPr>
-                    <pic:cNvPr id="0" name="" descr=""/>
-                    <pic:cNvPicPr>
-                      <a:picLocks noChangeAspect="1" noChangeArrowheads="1"/>
-                    </pic:cNvPicPr>
-                  </pic:nvPicPr>
-                  <pic:blipFill>
-                    <a:blip r:embed="rId26" cstate="none"/>
-                    <a:srcRect/>
-                    <a:stretch>
-                      <a:fillRect/>
-                    </a:stretch>
-                  </pic:blipFill>
-                  <pic:spPr bwMode="auto">
-                    <a:xfrm>
-                      <a:off x="0" y="0"/>
-                      <a:ext cx="5715000" cy="2057400"/>
-                    </a:xfrm>
-                    <a:prstGeom prst="rect">
-                      <a:avLst/>
-                    </a:prstGeom>
-                  </pic:spPr>
-                </pic:pic>
-              </a:graphicData>
-            </a:graphic>
-          </wp:inline>
-        </w:drawing>
-      </w:r>
-    </w:p>
-    <w:p>
-      <w:pPr>
-        <w:spacing w:after="200"/>
-        <w:jc w:val="center"/>
-      </w:pPr>
-      <w:r>
-        <w:rPr>
-          <w:b/>
-          <w:bCs/>
-          <w:color w:val="455A64"/>
-          <w:sz w:val="18"/>
-          <w:szCs w:val="18"/>
-        </w:rPr>
-        <w:t xml:space="preserve">Figure 18. </w:t>
-      </w:r>
-      <w:r>
-        <w:rPr>
-          <w:i/>
-          <w:iCs/>
-          <w:color w:val="455A64"/>
-          <w:sz w:val="18"/>
-          <w:szCs w:val="18"/>
-        </w:rPr>
-        <w:t xml:space="preserve">Results summary of the fault run: frequency range, final frequency, largest rotor angle spread, machine data and integration step.</w:t>
-      </w:r>
-    </w:p>
-    <w:p>
-      <w:pPr>
-        <w:keepNext/>
-        <w:spacing w:after="60" w:before="120"/>
-        <w:jc w:val="center"/>
-      </w:pPr>
-      <w:r>
-        <w:drawing>
-          <wp:inline distT="0" distB="0" distL="0" distR="0">
-            <wp:extent cx="5715000" cy="3476625"/>
-            <wp:effectExtent t="0" r="0" b="0" l="0"/>
-            <wp:docPr id="1" name="dyn_res_2.png" descr="Results charts of the generator trip: frequency falls to 59.42 Hz and is arrested by the governors; GridPACK needs about 14 ms per frame on one rank." title="Results charts of the generator trip: frequency falls to 59.42 Hz and is arrested by the governors; GridPACK needs about 14 ms per frame on one rank."/>
-            <wp:cNvGraphicFramePr>
-              <a:graphicFrameLocks xmlns:a="http://schemas.openxmlformats.org/drawingml/2006/main" noChangeAspect="1"/>
-            </wp:cNvGraphicFramePr>
-            <a:graphic xmlns:a="http://schemas.openxmlformats.org/drawingml/2006/main">
-              <a:graphicData uri="http://schemas.openxmlformats.org/drawingml/2006/picture">
-                <pic:pic xmlns:pic="http://schemas.openxmlformats.org/drawingml/2006/picture">
-                  <pic:nvPicPr>
-                    <pic:cNvPr id="0" name="" descr=""/>
-                    <pic:cNvPicPr>
-                      <a:picLocks noChangeAspect="1" noChangeArrowheads="1"/>
-                    </pic:cNvPicPr>
-                  </pic:nvPicPr>
-                  <pic:blipFill>
-                    <a:blip r:embed="rId27" cstate="none"/>
-                    <a:srcRect/>
-                    <a:stretch>
-                      <a:fillRect/>
-                    </a:stretch>
-                  </pic:blipFill>
-                  <pic:spPr bwMode="auto">
-                    <a:xfrm>
-                      <a:off x="0" y="0"/>
-                      <a:ext cx="5715000" cy="3476625"/>
-                    </a:xfrm>
-                    <a:prstGeom prst="rect">
-                      <a:avLst/>
-                    </a:prstGeom>
-                  </pic:spPr>
-                </pic:pic>
-              </a:graphicData>
-            </a:graphic>
-          </wp:inline>
-        </w:drawing>
-      </w:r>
-    </w:p>
-    <w:p>
-      <w:pPr>
-        <w:spacing w:after="200"/>
-        <w:jc w:val="center"/>
-      </w:pPr>
-      <w:r>
-        <w:rPr>
-          <w:b/>
-          <w:bCs/>
-          <w:color w:val="455A64"/>
-          <w:sz w:val="18"/>
-          <w:szCs w:val="18"/>
-        </w:rPr>
-        <w:t xml:space="preserve">Figure 19. </w:t>
-      </w:r>
-      <w:r>
-        <w:rPr>
-          <w:i/>
-          <w:iCs/>
-          <w:color w:val="455A64"/>
-          <w:sz w:val="18"/>
-          <w:szCs w:val="18"/>
-        </w:rPr>
-        <w:t xml:space="preserve">Results charts of the generator trip: frequency falls to 59.42 Hz and is arrested by the governors; GridPACK needs about 14 ms per frame on one rank.</w:t>
-      </w:r>
-    </w:p>
-    <w:p>
-      <w:pPr>
-        <w:pStyle w:val="Heading2"/>
-      </w:pPr>
-      <w:r>
-        <w:t xml:space="preserve">6.10 IEEE 14 console (original prototype)</w:t>
-      </w:r>
-    </w:p>
-    <w:p>
-      <w:pPr>
-        <w:spacing w:after="120" w:line="288"/>
-      </w:pPr>
-      <w:r>
-        <w:t xml:space="preserve">The original single-PMU IEEE 14 demonstration is kept as a page of its own. Set latency, loss, a bus to drop or the FDI switch and press </w:t>
-      </w:r>
-      <w:r>
-        <w:rPr>
-          <w:i/>
-          <w:iCs/>
-        </w:rPr>
-        <w:t xml:space="preserve">Run scenario</w:t>
-      </w:r>
-      <w:r>
-        <w:t xml:space="preserve">; the console updates in about 15 seconds.</w:t>
-      </w:r>
-    </w:p>
-    <w:p>
-      <w:pPr>
-        <w:keepNext/>
-        <w:spacing w:after="60" w:before="120"/>
-        <w:jc w:val="center"/>
-      </w:pPr>
-      <w:r>
-        <w:drawing>
-          <wp:inline distT="0" distB="0" distL="0" distR="0">
-            <wp:extent cx="5715000" cy="714375"/>
-            <wp:effectExtent t="0" r="0" b="0" l="0"/>
-            <wp:docPr id="1" name="con_0.png" descr="Run Scenario panel of the IEEE 14 console." title="Run Scenario panel of the IEEE 14 console."/>
-            <wp:cNvGraphicFramePr>
-              <a:graphicFrameLocks xmlns:a="http://schemas.openxmlformats.org/drawingml/2006/main" noChangeAspect="1"/>
-            </wp:cNvGraphicFramePr>
-            <a:graphic xmlns:a="http://schemas.openxmlformats.org/drawingml/2006/main">
-              <a:graphicData uri="http://schemas.openxmlformats.org/drawingml/2006/picture">
-                <pic:pic xmlns:pic="http://schemas.openxmlformats.org/drawingml/2006/picture">
-                  <pic:nvPicPr>
-                    <pic:cNvPr id="0" name="" descr=""/>
-                    <pic:cNvPicPr>
-                      <a:picLocks noChangeAspect="1" noChangeArrowheads="1"/>
-                    </pic:cNvPicPr>
-                  </pic:nvPicPr>
-                  <pic:blipFill>
-                    <a:blip r:embed="rId28" cstate="none"/>
-                    <a:srcRect/>
-                    <a:stretch>
-                      <a:fillRect/>
-                    </a:stretch>
-                  </pic:blipFill>
-                  <pic:spPr bwMode="auto">
-                    <a:xfrm>
-                      <a:off x="0" y="0"/>
-                      <a:ext cx="5715000" cy="714375"/>
-                    </a:xfrm>
-                    <a:prstGeom prst="rect">
-                      <a:avLst/>
-                    </a:prstGeom>
-                  </pic:spPr>
-                </pic:pic>
-              </a:graphicData>
-            </a:graphic>
-          </wp:inline>
-        </w:drawing>
-      </w:r>
-    </w:p>
-    <w:p>
-      <w:pPr>
-        <w:spacing w:after="200"/>
-        <w:jc w:val="center"/>
-      </w:pPr>
-      <w:r>
-        <w:rPr>
-          <w:b/>
-          <w:bCs/>
-          <w:color w:val="455A64"/>
-          <w:sz w:val="18"/>
-          <w:szCs w:val="18"/>
-        </w:rPr>
-        <w:t xml:space="preserve">Figure 20. </w:t>
-      </w:r>
-      <w:r>
-        <w:rPr>
-          <w:i/>
-          <w:iCs/>
-          <w:color w:val="455A64"/>
-          <w:sz w:val="18"/>
-          <w:szCs w:val="18"/>
-        </w:rPr>
-        <w:t xml:space="preserve">Run Scenario panel of the IEEE 14 console.</w:t>
-      </w:r>
-    </w:p>
-    <w:p>
-      <w:pPr>
-        <w:keepNext/>
-        <w:spacing w:after="60" w:before="120"/>
-        <w:jc w:val="center"/>
-      </w:pPr>
-      <w:r>
-        <w:drawing>
-          <wp:inline distT="0" distB="0" distL="0" distR="0">
-            <wp:extent cx="5715000" cy="1905000"/>
-            <wp:effectExtent t="0" r="0" b="0" l="0"/>
-            <wp:docPr id="1" name="con_2.png" descr="End-to-end network delay per bus. The voltage chart beside it loads its chart library from the internet and stays empty on servers without internet access." title="End-to-end network delay per bus. The voltage chart beside it loads its chart library from the internet and stays empty on servers without internet access."/>
             <wp:cNvGraphicFramePr>
               <a:graphicFrameLocks xmlns:a="http://schemas.openxmlformats.org/drawingml/2006/main" noChangeAspect="1"/>
             </wp:cNvGraphicFramePr>
@@ -17968,7 +18361,7 @@
                   <pic:spPr bwMode="auto">
                     <a:xfrm>
                       <a:off x="0" y="0"/>
-                      <a:ext cx="5715000" cy="1905000"/>
+                      <a:ext cx="5715000" cy="762000"/>
                     </a:xfrm>
                     <a:prstGeom prst="rect">
                       <a:avLst/>
@@ -18004,7 +18397,179 @@
           <w:sz w:val="18"/>
           <w:szCs w:val="18"/>
         </w:rPr>
-        <w:t xml:space="preserve">End-to-end network delay per bus. The voltage chart beside it loads its chart library from the internet and stays empty on servers without internet access.</w:t>
+        <w:t xml:space="preserve">Commands and events of the run.</w:t>
+      </w:r>
+    </w:p>
+    <w:p>
+      <w:pPr>
+        <w:pStyle w:val="Heading2"/>
+      </w:pPr>
+      <w:r>
+        <w:t xml:space="preserve">6.10 Dynamic simulation runs</w:t>
+      </w:r>
+    </w:p>
+    <w:p>
+      <w:pPr>
+        <w:spacing w:after="120" w:line="288"/>
+      </w:pPr>
+      <w:r>
+        <w:t xml:space="preserve">A scenario with </w:t>
+      </w:r>
+      <w:r>
+        <w:rPr>
+          <w:rFonts w:ascii="Consolas" w:cs="Consolas" w:eastAsia="Consolas" w:hAnsi="Consolas"/>
+          <w:color w:val="37474F"/>
+          <w:sz w:val="19"/>
+          <w:szCs w:val="19"/>
+        </w:rPr>
+        <w:t xml:space="preserve">mode: dynamic</w:t>
+      </w:r>
+      <w:r>
+        <w:t xml:space="preserve"> uses the same pages. Below, a file with two IEEE 39 experiments (a 100 ms fault at bus 16 and the trip of generator 32, both at 3 s) was uploaded; both ran at the same time. The Live page adds the system frequency, the lowest frequency so far and the rotor angle spread, and two charts.</w:t>
+      </w:r>
+    </w:p>
+    <w:p>
+      <w:pPr>
+        <w:shd w:fill="F1F4F6" w:color="auto" w:val="clear"/>
+        <w:spacing w:after="0" w:before="60" w:line="252"/>
+        <w:ind w:left="120" w:right="120"/>
+      </w:pPr>
+      <w:r>
+        <w:rPr>
+          <w:rFonts w:ascii="Consolas" w:cs="Consolas" w:eastAsia="Consolas" w:hAnsi="Consolas"/>
+          <w:color w:val="263238"/>
+          <w:sz w:val="18"/>
+          <w:szCs w:val="18"/>
+        </w:rPr>
+        <w:t xml:space="preserve">grid: ieee39</w:t>
+      </w:r>
+    </w:p>
+    <w:p>
+      <w:pPr>
+        <w:shd w:fill="F1F4F6" w:color="auto" w:val="clear"/>
+        <w:spacing w:after="0" w:before="0" w:line="252"/>
+        <w:ind w:left="120" w:right="120"/>
+      </w:pPr>
+      <w:r>
+        <w:rPr>
+          <w:rFonts w:ascii="Consolas" w:cs="Consolas" w:eastAsia="Consolas" w:hAnsi="Consolas"/>
+          <w:color w:val="263238"/>
+          <w:sz w:val="18"/>
+          <w:szCs w:val="18"/>
+        </w:rPr>
+        <w:t xml:space="preserve">mode: dynamic</w:t>
+      </w:r>
+    </w:p>
+    <w:p>
+      <w:pPr>
+        <w:shd w:fill="F1F4F6" w:color="auto" w:val="clear"/>
+        <w:spacing w:after="0" w:before="0" w:line="252"/>
+        <w:ind w:left="120" w:right="120"/>
+      </w:pPr>
+      <w:r>
+        <w:rPr>
+          <w:rFonts w:ascii="Consolas" w:cs="Consolas" w:eastAsia="Consolas" w:hAnsi="Consolas"/>
+          <w:color w:val="263238"/>
+          <w:sz w:val="18"/>
+          <w:szCs w:val="18"/>
+        </w:rPr>
+        <w:t xml:space="preserve">duration: 15</w:t>
+      </w:r>
+    </w:p>
+    <w:p>
+      <w:pPr>
+        <w:shd w:fill="F1F4F6" w:color="auto" w:val="clear"/>
+        <w:spacing w:after="0" w:before="0" w:line="252"/>
+        <w:ind w:left="120" w:right="120"/>
+      </w:pPr>
+      <w:r>
+        <w:rPr>
+          <w:rFonts w:ascii="Consolas" w:cs="Consolas" w:eastAsia="Consolas" w:hAnsi="Consolas"/>
+          <w:color w:val="263238"/>
+          <w:sz w:val="18"/>
+          <w:szCs w:val="18"/>
+        </w:rPr>
+        <w:t xml:space="preserve">mpi_np: 1</w:t>
+      </w:r>
+    </w:p>
+    <w:p>
+      <w:pPr>
+        <w:shd w:fill="F1F4F6" w:color="auto" w:val="clear"/>
+        <w:spacing w:after="0" w:before="0" w:line="252"/>
+        <w:ind w:left="120" w:right="120"/>
+      </w:pPr>
+      <w:r>
+        <w:rPr>
+          <w:rFonts w:ascii="Consolas" w:cs="Consolas" w:eastAsia="Consolas" w:hAnsi="Consolas"/>
+          <w:color w:val="263238"/>
+          <w:sz w:val="18"/>
+          <w:szCs w:val="18"/>
+        </w:rPr>
+        <w:t xml:space="preserve">scenarios:</w:t>
+      </w:r>
+    </w:p>
+    <w:p>
+      <w:pPr>
+        <w:shd w:fill="F1F4F6" w:color="auto" w:val="clear"/>
+        <w:spacing w:after="0" w:before="0" w:line="252"/>
+        <w:ind w:left="120" w:right="120"/>
+      </w:pPr>
+      <w:r>
+        <w:rPr>
+          <w:rFonts w:ascii="Consolas" w:cs="Consolas" w:eastAsia="Consolas" w:hAnsi="Consolas"/>
+          <w:color w:val="263238"/>
+          <w:sz w:val="18"/>
+          <w:szCs w:val="18"/>
+        </w:rPr>
+        <w:t xml:space="preserve">  - name: ieee39-dyn-fault</w:t>
+      </w:r>
+    </w:p>
+    <w:p>
+      <w:pPr>
+        <w:shd w:fill="F1F4F6" w:color="auto" w:val="clear"/>
+        <w:spacing w:after="0" w:before="0" w:line="252"/>
+        <w:ind w:left="120" w:right="120"/>
+      </w:pPr>
+      <w:r>
+        <w:rPr>
+          <w:rFonts w:ascii="Consolas" w:cs="Consolas" w:eastAsia="Consolas" w:hAnsi="Consolas"/>
+          <w:color w:val="263238"/>
+          <w:sz w:val="18"/>
+          <w:szCs w:val="18"/>
+        </w:rPr>
+        <w:t xml:space="preserve">    event: {type: bus_fault, bus: 16, duration: 0.1, t: 3}</w:t>
+      </w:r>
+    </w:p>
+    <w:p>
+      <w:pPr>
+        <w:shd w:fill="F1F4F6" w:color="auto" w:val="clear"/>
+        <w:spacing w:after="0" w:before="0" w:line="252"/>
+        <w:ind w:left="120" w:right="120"/>
+      </w:pPr>
+      <w:r>
+        <w:rPr>
+          <w:rFonts w:ascii="Consolas" w:cs="Consolas" w:eastAsia="Consolas" w:hAnsi="Consolas"/>
+          <w:color w:val="263238"/>
+          <w:sz w:val="18"/>
+          <w:szCs w:val="18"/>
+        </w:rPr>
+        <w:t xml:space="preserve">  - name: ieee39-dyn-gentrip</w:t>
+      </w:r>
+    </w:p>
+    <w:p>
+      <w:pPr>
+        <w:shd w:fill="F1F4F6" w:color="auto" w:val="clear"/>
+        <w:spacing w:after="160" w:before="0" w:line="252"/>
+        <w:ind w:left="120" w:right="120"/>
+      </w:pPr>
+      <w:r>
+        <w:rPr>
+          <w:rFonts w:ascii="Consolas" w:cs="Consolas" w:eastAsia="Consolas" w:hAnsi="Consolas"/>
+          <w:color w:val="263238"/>
+          <w:sz w:val="18"/>
+          <w:szCs w:val="18"/>
+        </w:rPr>
+        <w:t xml:space="preserve">    event: {type: gen_trip, bus: 32, t: 3}</w:t>
       </w:r>
     </w:p>
     <w:p>
@@ -18016,9 +18581,9 @@
       <w:r>
         <w:drawing>
           <wp:inline distT="0" distB="0" distL="0" distR="0">
-            <wp:extent cx="3429000" cy="2686050"/>
+            <wp:extent cx="5715000" cy="1743075"/>
             <wp:effectExtent t="0" r="0" b="0" l="0"/>
-            <wp:docPr id="1" name="con_3.png" descr="Network performance and delivery gauge." title="Network performance and delivery gauge."/>
+            <wp:docPr id="1" name="dyn_live_0.png" descr="Live, dynamic run: frequency of the centre of inertia, lowest frequency so far and rotor angle spread next to the usual figures." title="Live, dynamic run: frequency of the centre of inertia, lowest frequency so far and rotor angle spread next to the usual figures."/>
             <wp:cNvGraphicFramePr>
               <a:graphicFrameLocks xmlns:a="http://schemas.openxmlformats.org/drawingml/2006/main" noChangeAspect="1"/>
             </wp:cNvGraphicFramePr>
@@ -18041,7 +18606,7 @@
                   <pic:spPr bwMode="auto">
                     <a:xfrm>
                       <a:off x="0" y="0"/>
-                      <a:ext cx="3429000" cy="2686050"/>
+                      <a:ext cx="5715000" cy="1743075"/>
                     </a:xfrm>
                     <a:prstGeom prst="rect">
                       <a:avLst/>
@@ -18077,7 +18642,7 @@
           <w:sz w:val="18"/>
           <w:szCs w:val="18"/>
         </w:rPr>
-        <w:t xml:space="preserve">Network performance and delivery gauge.</w:t>
+        <w:t xml:space="preserve">Live, dynamic run: frequency of the centre of inertia, lowest frequency so far and rotor angle spread next to the usual figures.</w:t>
       </w:r>
     </w:p>
     <w:p>
@@ -18089,9 +18654,9 @@
       <w:r>
         <w:drawing>
           <wp:inline distT="0" distB="0" distL="0" distR="0">
-            <wp:extent cx="3429000" cy="2686050"/>
+            <wp:extent cx="5715000" cy="2552700"/>
             <wp:effectExtent t="0" r="0" b="0" l="0"/>
-            <wp:docPr id="1" name="con_4.png" descr="Per-bus measurement table: true and received voltage, delay and status." title="Per-bus measurement table: true and received voltage, delay and status."/>
+            <wp:docPr id="1" name="dyn_live_1.png" descr="Live charts at 9.3 s: the fault at 3 s pulls bus 36 down to 0.56 pu; the exciters overshoot; frequency and rotor angles swing and settle." title="Live charts at 9.3 s: the fault at 3 s pulls bus 36 down to 0.56 pu; the exciters overshoot; frequency and rotor angles swing and settle."/>
             <wp:cNvGraphicFramePr>
               <a:graphicFrameLocks xmlns:a="http://schemas.openxmlformats.org/drawingml/2006/main" noChangeAspect="1"/>
             </wp:cNvGraphicFramePr>
@@ -18114,7 +18679,7 @@
                   <pic:spPr bwMode="auto">
                     <a:xfrm>
                       <a:off x="0" y="0"/>
-                      <a:ext cx="3429000" cy="2686050"/>
+                      <a:ext cx="5715000" cy="2552700"/>
                     </a:xfrm>
                     <a:prstGeom prst="rect">
                       <a:avLst/>
@@ -18150,43 +18715,7 @@
           <w:sz w:val="18"/>
           <w:szCs w:val="18"/>
         </w:rPr>
-        <w:t xml:space="preserve">Per-bus measurement table: true and received voltage, delay and status.</w:t>
-      </w:r>
-    </w:p>
-    <w:p>
-      <w:pPr>
-        <w:pStyle w:val="Heading2"/>
-      </w:pPr>
-      <w:r>
-        <w:t xml:space="preserve">6.11 Node-RED editor</w:t>
-      </w:r>
-    </w:p>
-    <w:p>
-      <w:pPr>
-        <w:spacing w:after="120" w:line="288"/>
-      </w:pPr>
-      <w:r>
-        <w:t xml:space="preserve">Administrators can change the dashboard in the Node-RED editor without programming: the </w:t>
-      </w:r>
-      <w:r>
-        <w:rPr>
-          <w:i/>
-          <w:iCs/>
-        </w:rPr>
-        <w:t xml:space="preserve">CPS Cluster</w:t>
-      </w:r>
-      <w:r>
-        <w:t xml:space="preserve"> tab holds the Experiments, Live and Results pages, the </w:t>
-      </w:r>
-      <w:r>
-        <w:rPr>
-          <w:i/>
-          <w:iCs/>
-        </w:rPr>
-        <w:t xml:space="preserve">CPS Testbed Console</w:t>
-      </w:r>
-      <w:r>
-        <w:t xml:space="preserve"> tab the IEEE 14 console.</w:t>
+        <w:t xml:space="preserve">Live charts at 9.3 s: the fault at 3 s pulls bus 36 down to 0.56 pu; the exciters overshoot; frequency and rotor angles swing and settle.</w:t>
       </w:r>
     </w:p>
     <w:p>
@@ -18198,9 +18727,9 @@
       <w:r>
         <w:drawing>
           <wp:inline distT="0" distB="0" distL="0" distR="0">
-            <wp:extent cx="5715000" cy="3571875"/>
+            <wp:extent cx="5715000" cy="2057400"/>
             <wp:effectExtent t="0" r="0" b="0" l="0"/>
-            <wp:docPr id="1" name="editor.png" descr="The CPS Cluster flow in the Node-RED editor." title="The CPS Cluster flow in the Node-RED editor."/>
+            <wp:docPr id="1" name="dyn_res_1.png" descr="Results summary of the fault run: frequency range, final frequency, largest rotor angle spread, machine data and integration step." title="Results summary of the fault run: frequency range, final frequency, largest rotor angle spread, machine data and integration step."/>
             <wp:cNvGraphicFramePr>
               <a:graphicFrameLocks xmlns:a="http://schemas.openxmlformats.org/drawingml/2006/main" noChangeAspect="1"/>
             </wp:cNvGraphicFramePr>
@@ -18223,6 +18752,506 @@
                   <pic:spPr bwMode="auto">
                     <a:xfrm>
                       <a:off x="0" y="0"/>
+                      <a:ext cx="5715000" cy="2057400"/>
+                    </a:xfrm>
+                    <a:prstGeom prst="rect">
+                      <a:avLst/>
+                    </a:prstGeom>
+                  </pic:spPr>
+                </pic:pic>
+              </a:graphicData>
+            </a:graphic>
+          </wp:inline>
+        </w:drawing>
+      </w:r>
+    </w:p>
+    <w:p>
+      <w:pPr>
+        <w:spacing w:after="200"/>
+        <w:jc w:val="center"/>
+      </w:pPr>
+      <w:r>
+        <w:rPr>
+          <w:b/>
+          <w:bCs/>
+          <w:color w:val="455A64"/>
+          <w:sz w:val="18"/>
+          <w:szCs w:val="18"/>
+        </w:rPr>
+        <w:t xml:space="preserve">Figure 24. </w:t>
+      </w:r>
+      <w:r>
+        <w:rPr>
+          <w:i/>
+          <w:iCs/>
+          <w:color w:val="455A64"/>
+          <w:sz w:val="18"/>
+          <w:szCs w:val="18"/>
+        </w:rPr>
+        <w:t xml:space="preserve">Results summary of the fault run: frequency range, final frequency, largest rotor angle spread, machine data and integration step.</w:t>
+      </w:r>
+    </w:p>
+    <w:p>
+      <w:pPr>
+        <w:keepNext/>
+        <w:spacing w:after="60" w:before="120"/>
+        <w:jc w:val="center"/>
+      </w:pPr>
+      <w:r>
+        <w:drawing>
+          <wp:inline distT="0" distB="0" distL="0" distR="0">
+            <wp:extent cx="5715000" cy="3476625"/>
+            <wp:effectExtent t="0" r="0" b="0" l="0"/>
+            <wp:docPr id="1" name="dyn_res_2.png" descr="Results charts of the generator trip: frequency falls to 59.42 Hz and is arrested by the governors; GridPACK needs about 14 ms per frame on one rank." title="Results charts of the generator trip: frequency falls to 59.42 Hz and is arrested by the governors; GridPACK needs about 14 ms per frame on one rank."/>
+            <wp:cNvGraphicFramePr>
+              <a:graphicFrameLocks xmlns:a="http://schemas.openxmlformats.org/drawingml/2006/main" noChangeAspect="1"/>
+            </wp:cNvGraphicFramePr>
+            <a:graphic xmlns:a="http://schemas.openxmlformats.org/drawingml/2006/main">
+              <a:graphicData uri="http://schemas.openxmlformats.org/drawingml/2006/picture">
+                <pic:pic xmlns:pic="http://schemas.openxmlformats.org/drawingml/2006/picture">
+                  <pic:nvPicPr>
+                    <pic:cNvPr id="0" name="" descr=""/>
+                    <pic:cNvPicPr>
+                      <a:picLocks noChangeAspect="1" noChangeArrowheads="1"/>
+                    </pic:cNvPicPr>
+                  </pic:nvPicPr>
+                  <pic:blipFill>
+                    <a:blip r:embed="rId33" cstate="none"/>
+                    <a:srcRect/>
+                    <a:stretch>
+                      <a:fillRect/>
+                    </a:stretch>
+                  </pic:blipFill>
+                  <pic:spPr bwMode="auto">
+                    <a:xfrm>
+                      <a:off x="0" y="0"/>
+                      <a:ext cx="5715000" cy="3476625"/>
+                    </a:xfrm>
+                    <a:prstGeom prst="rect">
+                      <a:avLst/>
+                    </a:prstGeom>
+                  </pic:spPr>
+                </pic:pic>
+              </a:graphicData>
+            </a:graphic>
+          </wp:inline>
+        </w:drawing>
+      </w:r>
+    </w:p>
+    <w:p>
+      <w:pPr>
+        <w:spacing w:after="200"/>
+        <w:jc w:val="center"/>
+      </w:pPr>
+      <w:r>
+        <w:rPr>
+          <w:b/>
+          <w:bCs/>
+          <w:color w:val="455A64"/>
+          <w:sz w:val="18"/>
+          <w:szCs w:val="18"/>
+        </w:rPr>
+        <w:t xml:space="preserve">Figure 25. </w:t>
+      </w:r>
+      <w:r>
+        <w:rPr>
+          <w:i/>
+          <w:iCs/>
+          <w:color w:val="455A64"/>
+          <w:sz w:val="18"/>
+          <w:szCs w:val="18"/>
+        </w:rPr>
+        <w:t xml:space="preserve">Results charts of the generator trip: frequency falls to 59.42 Hz and is arrested by the governors; GridPACK needs about 14 ms per frame on one rank.</w:t>
+      </w:r>
+    </w:p>
+    <w:p>
+      <w:pPr>
+        <w:pStyle w:val="Heading2"/>
+      </w:pPr>
+      <w:r>
+        <w:t xml:space="preserve">6.11 IEEE 14 console (original prototype)</w:t>
+      </w:r>
+    </w:p>
+    <w:p>
+      <w:pPr>
+        <w:spacing w:after="120" w:line="288"/>
+      </w:pPr>
+      <w:r>
+        <w:t xml:space="preserve">The original single-PMU IEEE 14 demonstration is kept as a page of its own. Set latency, loss, a bus to drop or the FDI switch and press </w:t>
+      </w:r>
+      <w:r>
+        <w:rPr>
+          <w:i/>
+          <w:iCs/>
+        </w:rPr>
+        <w:t xml:space="preserve">Run scenario</w:t>
+      </w:r>
+      <w:r>
+        <w:t xml:space="preserve">; the console updates in about 15 seconds.</w:t>
+      </w:r>
+    </w:p>
+    <w:p>
+      <w:pPr>
+        <w:keepNext/>
+        <w:spacing w:after="60" w:before="120"/>
+        <w:jc w:val="center"/>
+      </w:pPr>
+      <w:r>
+        <w:drawing>
+          <wp:inline distT="0" distB="0" distL="0" distR="0">
+            <wp:extent cx="5715000" cy="714375"/>
+            <wp:effectExtent t="0" r="0" b="0" l="0"/>
+            <wp:docPr id="1" name="con_0.png" descr="Run Scenario panel of the IEEE 14 console." title="Run Scenario panel of the IEEE 14 console."/>
+            <wp:cNvGraphicFramePr>
+              <a:graphicFrameLocks xmlns:a="http://schemas.openxmlformats.org/drawingml/2006/main" noChangeAspect="1"/>
+            </wp:cNvGraphicFramePr>
+            <a:graphic xmlns:a="http://schemas.openxmlformats.org/drawingml/2006/main">
+              <a:graphicData uri="http://schemas.openxmlformats.org/drawingml/2006/picture">
+                <pic:pic xmlns:pic="http://schemas.openxmlformats.org/drawingml/2006/picture">
+                  <pic:nvPicPr>
+                    <pic:cNvPr id="0" name="" descr=""/>
+                    <pic:cNvPicPr>
+                      <a:picLocks noChangeAspect="1" noChangeArrowheads="1"/>
+                    </pic:cNvPicPr>
+                  </pic:nvPicPr>
+                  <pic:blipFill>
+                    <a:blip r:embed="rId34" cstate="none"/>
+                    <a:srcRect/>
+                    <a:stretch>
+                      <a:fillRect/>
+                    </a:stretch>
+                  </pic:blipFill>
+                  <pic:spPr bwMode="auto">
+                    <a:xfrm>
+                      <a:off x="0" y="0"/>
+                      <a:ext cx="5715000" cy="714375"/>
+                    </a:xfrm>
+                    <a:prstGeom prst="rect">
+                      <a:avLst/>
+                    </a:prstGeom>
+                  </pic:spPr>
+                </pic:pic>
+              </a:graphicData>
+            </a:graphic>
+          </wp:inline>
+        </w:drawing>
+      </w:r>
+    </w:p>
+    <w:p>
+      <w:pPr>
+        <w:spacing w:after="200"/>
+        <w:jc w:val="center"/>
+      </w:pPr>
+      <w:r>
+        <w:rPr>
+          <w:b/>
+          <w:bCs/>
+          <w:color w:val="455A64"/>
+          <w:sz w:val="18"/>
+          <w:szCs w:val="18"/>
+        </w:rPr>
+        <w:t xml:space="preserve">Figure 26. </w:t>
+      </w:r>
+      <w:r>
+        <w:rPr>
+          <w:i/>
+          <w:iCs/>
+          <w:color w:val="455A64"/>
+          <w:sz w:val="18"/>
+          <w:szCs w:val="18"/>
+        </w:rPr>
+        <w:t xml:space="preserve">Run Scenario panel of the IEEE 14 console.</w:t>
+      </w:r>
+    </w:p>
+    <w:p>
+      <w:pPr>
+        <w:keepNext/>
+        <w:spacing w:after="60" w:before="120"/>
+        <w:jc w:val="center"/>
+      </w:pPr>
+      <w:r>
+        <w:drawing>
+          <wp:inline distT="0" distB="0" distL="0" distR="0">
+            <wp:extent cx="5715000" cy="1905000"/>
+            <wp:effectExtent t="0" r="0" b="0" l="0"/>
+            <wp:docPr id="1" name="con_2.png" descr="End-to-end network delay per bus. The voltage chart beside it loads its chart library from the internet and stays empty on servers without internet access." title="End-to-end network delay per bus. The voltage chart beside it loads its chart library from the internet and stays empty on servers without internet access."/>
+            <wp:cNvGraphicFramePr>
+              <a:graphicFrameLocks xmlns:a="http://schemas.openxmlformats.org/drawingml/2006/main" noChangeAspect="1"/>
+            </wp:cNvGraphicFramePr>
+            <a:graphic xmlns:a="http://schemas.openxmlformats.org/drawingml/2006/main">
+              <a:graphicData uri="http://schemas.openxmlformats.org/drawingml/2006/picture">
+                <pic:pic xmlns:pic="http://schemas.openxmlformats.org/drawingml/2006/picture">
+                  <pic:nvPicPr>
+                    <pic:cNvPr id="0" name="" descr=""/>
+                    <pic:cNvPicPr>
+                      <a:picLocks noChangeAspect="1" noChangeArrowheads="1"/>
+                    </pic:cNvPicPr>
+                  </pic:nvPicPr>
+                  <pic:blipFill>
+                    <a:blip r:embed="rId35" cstate="none"/>
+                    <a:srcRect/>
+                    <a:stretch>
+                      <a:fillRect/>
+                    </a:stretch>
+                  </pic:blipFill>
+                  <pic:spPr bwMode="auto">
+                    <a:xfrm>
+                      <a:off x="0" y="0"/>
+                      <a:ext cx="5715000" cy="1905000"/>
+                    </a:xfrm>
+                    <a:prstGeom prst="rect">
+                      <a:avLst/>
+                    </a:prstGeom>
+                  </pic:spPr>
+                </pic:pic>
+              </a:graphicData>
+            </a:graphic>
+          </wp:inline>
+        </w:drawing>
+      </w:r>
+    </w:p>
+    <w:p>
+      <w:pPr>
+        <w:spacing w:after="200"/>
+        <w:jc w:val="center"/>
+      </w:pPr>
+      <w:r>
+        <w:rPr>
+          <w:b/>
+          <w:bCs/>
+          <w:color w:val="455A64"/>
+          <w:sz w:val="18"/>
+          <w:szCs w:val="18"/>
+        </w:rPr>
+        <w:t xml:space="preserve">Figure 27. </w:t>
+      </w:r>
+      <w:r>
+        <w:rPr>
+          <w:i/>
+          <w:iCs/>
+          <w:color w:val="455A64"/>
+          <w:sz w:val="18"/>
+          <w:szCs w:val="18"/>
+        </w:rPr>
+        <w:t xml:space="preserve">End-to-end network delay per bus. The voltage chart beside it loads its chart library from the internet and stays empty on servers without internet access.</w:t>
+      </w:r>
+    </w:p>
+    <w:p>
+      <w:pPr>
+        <w:keepNext/>
+        <w:spacing w:after="60" w:before="120"/>
+        <w:jc w:val="center"/>
+      </w:pPr>
+      <w:r>
+        <w:drawing>
+          <wp:inline distT="0" distB="0" distL="0" distR="0">
+            <wp:extent cx="3429000" cy="2686050"/>
+            <wp:effectExtent t="0" r="0" b="0" l="0"/>
+            <wp:docPr id="1" name="con_3.png" descr="Network performance and delivery gauge." title="Network performance and delivery gauge."/>
+            <wp:cNvGraphicFramePr>
+              <a:graphicFrameLocks xmlns:a="http://schemas.openxmlformats.org/drawingml/2006/main" noChangeAspect="1"/>
+            </wp:cNvGraphicFramePr>
+            <a:graphic xmlns:a="http://schemas.openxmlformats.org/drawingml/2006/main">
+              <a:graphicData uri="http://schemas.openxmlformats.org/drawingml/2006/picture">
+                <pic:pic xmlns:pic="http://schemas.openxmlformats.org/drawingml/2006/picture">
+                  <pic:nvPicPr>
+                    <pic:cNvPr id="0" name="" descr=""/>
+                    <pic:cNvPicPr>
+                      <a:picLocks noChangeAspect="1" noChangeArrowheads="1"/>
+                    </pic:cNvPicPr>
+                  </pic:nvPicPr>
+                  <pic:blipFill>
+                    <a:blip r:embed="rId36" cstate="none"/>
+                    <a:srcRect/>
+                    <a:stretch>
+                      <a:fillRect/>
+                    </a:stretch>
+                  </pic:blipFill>
+                  <pic:spPr bwMode="auto">
+                    <a:xfrm>
+                      <a:off x="0" y="0"/>
+                      <a:ext cx="3429000" cy="2686050"/>
+                    </a:xfrm>
+                    <a:prstGeom prst="rect">
+                      <a:avLst/>
+                    </a:prstGeom>
+                  </pic:spPr>
+                </pic:pic>
+              </a:graphicData>
+            </a:graphic>
+          </wp:inline>
+        </w:drawing>
+      </w:r>
+    </w:p>
+    <w:p>
+      <w:pPr>
+        <w:spacing w:after="200"/>
+        <w:jc w:val="center"/>
+      </w:pPr>
+      <w:r>
+        <w:rPr>
+          <w:b/>
+          <w:bCs/>
+          <w:color w:val="455A64"/>
+          <w:sz w:val="18"/>
+          <w:szCs w:val="18"/>
+        </w:rPr>
+        <w:t xml:space="preserve">Figure 28. </w:t>
+      </w:r>
+      <w:r>
+        <w:rPr>
+          <w:i/>
+          <w:iCs/>
+          <w:color w:val="455A64"/>
+          <w:sz w:val="18"/>
+          <w:szCs w:val="18"/>
+        </w:rPr>
+        <w:t xml:space="preserve">Network performance and delivery gauge.</w:t>
+      </w:r>
+    </w:p>
+    <w:p>
+      <w:pPr>
+        <w:keepNext/>
+        <w:spacing w:after="60" w:before="120"/>
+        <w:jc w:val="center"/>
+      </w:pPr>
+      <w:r>
+        <w:drawing>
+          <wp:inline distT="0" distB="0" distL="0" distR="0">
+            <wp:extent cx="3429000" cy="2686050"/>
+            <wp:effectExtent t="0" r="0" b="0" l="0"/>
+            <wp:docPr id="1" name="con_4.png" descr="Per-bus measurement table: true and received voltage, delay and status." title="Per-bus measurement table: true and received voltage, delay and status."/>
+            <wp:cNvGraphicFramePr>
+              <a:graphicFrameLocks xmlns:a="http://schemas.openxmlformats.org/drawingml/2006/main" noChangeAspect="1"/>
+            </wp:cNvGraphicFramePr>
+            <a:graphic xmlns:a="http://schemas.openxmlformats.org/drawingml/2006/main">
+              <a:graphicData uri="http://schemas.openxmlformats.org/drawingml/2006/picture">
+                <pic:pic xmlns:pic="http://schemas.openxmlformats.org/drawingml/2006/picture">
+                  <pic:nvPicPr>
+                    <pic:cNvPr id="0" name="" descr=""/>
+                    <pic:cNvPicPr>
+                      <a:picLocks noChangeAspect="1" noChangeArrowheads="1"/>
+                    </pic:cNvPicPr>
+                  </pic:nvPicPr>
+                  <pic:blipFill>
+                    <a:blip r:embed="rId37" cstate="none"/>
+                    <a:srcRect/>
+                    <a:stretch>
+                      <a:fillRect/>
+                    </a:stretch>
+                  </pic:blipFill>
+                  <pic:spPr bwMode="auto">
+                    <a:xfrm>
+                      <a:off x="0" y="0"/>
+                      <a:ext cx="3429000" cy="2686050"/>
+                    </a:xfrm>
+                    <a:prstGeom prst="rect">
+                      <a:avLst/>
+                    </a:prstGeom>
+                  </pic:spPr>
+                </pic:pic>
+              </a:graphicData>
+            </a:graphic>
+          </wp:inline>
+        </w:drawing>
+      </w:r>
+    </w:p>
+    <w:p>
+      <w:pPr>
+        <w:spacing w:after="200"/>
+        <w:jc w:val="center"/>
+      </w:pPr>
+      <w:r>
+        <w:rPr>
+          <w:b/>
+          <w:bCs/>
+          <w:color w:val="455A64"/>
+          <w:sz w:val="18"/>
+          <w:szCs w:val="18"/>
+        </w:rPr>
+        <w:t xml:space="preserve">Figure 29. </w:t>
+      </w:r>
+      <w:r>
+        <w:rPr>
+          <w:i/>
+          <w:iCs/>
+          <w:color w:val="455A64"/>
+          <w:sz w:val="18"/>
+          <w:szCs w:val="18"/>
+        </w:rPr>
+        <w:t xml:space="preserve">Per-bus measurement table: true and received voltage, delay and status.</w:t>
+      </w:r>
+    </w:p>
+    <w:p>
+      <w:pPr>
+        <w:pStyle w:val="Heading2"/>
+      </w:pPr>
+      <w:r>
+        <w:t xml:space="preserve">6.12 Node-RED editor</w:t>
+      </w:r>
+    </w:p>
+    <w:p>
+      <w:pPr>
+        <w:spacing w:after="120" w:line="288"/>
+      </w:pPr>
+      <w:r>
+        <w:t xml:space="preserve">Administrators can change the dashboard in the Node-RED editor without programming: the </w:t>
+      </w:r>
+      <w:r>
+        <w:rPr>
+          <w:i/>
+          <w:iCs/>
+        </w:rPr>
+        <w:t xml:space="preserve">CPS Cluster</w:t>
+      </w:r>
+      <w:r>
+        <w:t xml:space="preserve"> tab holds the Experiments, Live and Results pages, the </w:t>
+      </w:r>
+      <w:r>
+        <w:rPr>
+          <w:i/>
+          <w:iCs/>
+        </w:rPr>
+        <w:t xml:space="preserve">CPS Testbed Console</w:t>
+      </w:r>
+      <w:r>
+        <w:t xml:space="preserve"> tab the IEEE 14 console.</w:t>
+      </w:r>
+    </w:p>
+    <w:p>
+      <w:pPr>
+        <w:keepNext/>
+        <w:spacing w:after="60" w:before="120"/>
+        <w:jc w:val="center"/>
+      </w:pPr>
+      <w:r>
+        <w:drawing>
+          <wp:inline distT="0" distB="0" distL="0" distR="0">
+            <wp:extent cx="5715000" cy="3571875"/>
+            <wp:effectExtent t="0" r="0" b="0" l="0"/>
+            <wp:docPr id="1" name="editor.png" descr="The CPS Cluster flow in the Node-RED editor." title="The CPS Cluster flow in the Node-RED editor."/>
+            <wp:cNvGraphicFramePr>
+              <a:graphicFrameLocks xmlns:a="http://schemas.openxmlformats.org/drawingml/2006/main" noChangeAspect="1"/>
+            </wp:cNvGraphicFramePr>
+            <a:graphic xmlns:a="http://schemas.openxmlformats.org/drawingml/2006/main">
+              <a:graphicData uri="http://schemas.openxmlformats.org/drawingml/2006/picture">
+                <pic:pic xmlns:pic="http://schemas.openxmlformats.org/drawingml/2006/picture">
+                  <pic:nvPicPr>
+                    <pic:cNvPr id="0" name="" descr=""/>
+                    <pic:cNvPicPr>
+                      <a:picLocks noChangeAspect="1" noChangeArrowheads="1"/>
+                    </pic:cNvPicPr>
+                  </pic:nvPicPr>
+                  <pic:blipFill>
+                    <a:blip r:embed="rId38" cstate="none"/>
+                    <a:srcRect/>
+                    <a:stretch>
+                      <a:fillRect/>
+                    </a:stretch>
+                  </pic:blipFill>
+                  <pic:spPr bwMode="auto">
+                    <a:xfrm>
+                      <a:off x="0" y="0"/>
                       <a:ext cx="5715000" cy="3571875"/>
                     </a:xfrm>
                     <a:prstGeom prst="rect">
@@ -18249,7 +19278,7 @@
           <w:sz w:val="18"/>
           <w:szCs w:val="18"/>
         </w:rPr>
-        <w:t xml:space="preserve">Figure 24. </w:t>
+        <w:t xml:space="preserve">Figure 30. </w:t>
       </w:r>
       <w:r>
         <w:rPr>
@@ -18267,7 +19296,7 @@
         <w:pStyle w:val="Heading2"/>
       </w:pPr>
       <w:r>
-        <w:t xml:space="preserve">6.12 API and command line</w:t>
+        <w:t xml:space="preserve">6.13 API and command line</w:t>
       </w:r>
     </w:p>
     <w:p>
@@ -18283,7 +19312,7 @@
           <w:sz w:val="18"/>
           <w:szCs w:val="18"/>
         </w:rPr>
-        <w:t xml:space="preserve">Table 12. </w:t>
+        <w:t xml:space="preserve">Table 13. </w:t>
       </w:r>
       <w:r>
         <w:rPr>
@@ -21128,7 +22157,7 @@
                     </pic:cNvPicPr>
                   </pic:nvPicPr>
                   <pic:blipFill>
-                    <a:blip r:embed="rId33" cstate="none"/>
+                    <a:blip r:embed="rId39" cstate="none"/>
                     <a:srcRect/>
                     <a:stretch>
                       <a:fillRect/>
@@ -21163,7 +22192,7 @@
           <w:sz w:val="18"/>
           <w:szCs w:val="18"/>
         </w:rPr>
-        <w:t xml:space="preserve">Figure 25. </w:t>
+        <w:t xml:space="preserve">Figure 31. </w:t>
       </w:r>
       <w:r>
         <w:rPr>
@@ -21201,7 +22230,7 @@
                     </pic:cNvPicPr>
                   </pic:nvPicPr>
                   <pic:blipFill>
-                    <a:blip r:embed="rId34" cstate="none"/>
+                    <a:blip r:embed="rId40" cstate="none"/>
                     <a:srcRect/>
                     <a:stretch>
                       <a:fillRect/>
@@ -21236,7 +22265,7 @@
           <w:sz w:val="18"/>
           <w:szCs w:val="18"/>
         </w:rPr>
-        <w:t xml:space="preserve">Figure 26. </w:t>
+        <w:t xml:space="preserve">Figure 32. </w:t>
       </w:r>
       <w:r>
         <w:rPr>

</xml_diff>